<commit_message>
add latex section to the project
</commit_message>
<xml_diff>
--- a/project/planinvestigacion.docx
+++ b/project/planinvestigacion.docx
@@ -247,21 +247,12 @@
                 <w:color w:val="auto"/>
               </w:rPr>
             </w:pPr>
-            <w:proofErr w:type="spellStart"/>
             <w:r>
               <w:rPr>
                 <w:rFonts w:asciiTheme="minorHAnsi" w:eastAsia="Times New Roman" w:hAnsiTheme="minorHAnsi" w:cstheme="minorHAnsi"/>
                 <w:color w:val="auto"/>
               </w:rPr>
-              <w:t>Soft</w:t>
-            </w:r>
-            <w:proofErr w:type="spellEnd"/>
-            <w:r>
-              <w:rPr>
-                <w:rFonts w:asciiTheme="minorHAnsi" w:eastAsia="Times New Roman" w:hAnsiTheme="minorHAnsi" w:cstheme="minorHAnsi"/>
-                <w:color w:val="auto"/>
-              </w:rPr>
-              <w:t xml:space="preserve"> Computing</w:t>
+              <w:t>Soft Computing</w:t>
             </w:r>
           </w:p>
         </w:tc>
@@ -599,15 +590,32 @@
           <w:sz w:val="22"/>
           <w:szCs w:val="22"/>
         </w:rPr>
-        <w:t>información no estructura</w:t>
-      </w:r>
-      <w:r>
-        <w:rPr>
-          <w:rFonts w:asciiTheme="minorHAnsi" w:hAnsiTheme="minorHAnsi" w:cstheme="minorHAnsi"/>
-          <w:sz w:val="22"/>
-          <w:szCs w:val="22"/>
-        </w:rPr>
-        <w:t xml:space="preserve"> d</w:t>
+        <w:t xml:space="preserve">información no </w:t>
+      </w:r>
+      <w:r>
+        <w:rPr>
+          <w:rFonts w:asciiTheme="minorHAnsi" w:hAnsiTheme="minorHAnsi" w:cstheme="minorHAnsi"/>
+          <w:sz w:val="22"/>
+          <w:szCs w:val="22"/>
+        </w:rPr>
+        <w:t>estructurada</w:t>
+      </w:r>
+      <w:r>
+        <w:rPr>
+          <w:rFonts w:asciiTheme="minorHAnsi" w:hAnsiTheme="minorHAnsi" w:cstheme="minorHAnsi" w:hint="cs"/>
+          <w:sz w:val="22"/>
+          <w:szCs w:val="22"/>
+          <w:rtl/>
+        </w:rPr>
+        <w:t xml:space="preserve"> </w:t>
+      </w:r>
+      <w:r>
+        <w:rPr>
+          <w:rFonts w:asciiTheme="minorHAnsi" w:hAnsiTheme="minorHAnsi" w:cstheme="minorHAnsi"/>
+          <w:sz w:val="22"/>
+          <w:szCs w:val="22"/>
+        </w:rPr>
+        <w:t>d</w:t>
       </w:r>
       <w:r>
         <w:rPr>
@@ -639,7 +647,7 @@
           <w:sz w:val="22"/>
           <w:szCs w:val="22"/>
         </w:rPr>
-        <w:t>datos</w:t>
+        <w:t>información</w:t>
       </w:r>
       <w:r>
         <w:rPr>
@@ -809,7 +817,7 @@
           <w:szCs w:val="22"/>
           <w:lang w:val="es-ES"/>
         </w:rPr>
-        <w:t>muchas costas operativas</w:t>
+        <w:t>much</w:t>
       </w:r>
       <w:r>
         <w:rPr>
@@ -818,6 +826,60 @@
           <w:szCs w:val="22"/>
           <w:lang w:val="es-ES"/>
         </w:rPr>
+        <w:t>o</w:t>
+      </w:r>
+      <w:r>
+        <w:rPr>
+          <w:rFonts w:asciiTheme="minorHAnsi" w:hAnsiTheme="minorHAnsi" w:cstheme="minorHAnsi"/>
+          <w:sz w:val="22"/>
+          <w:szCs w:val="22"/>
+          <w:lang w:val="es-ES"/>
+        </w:rPr>
+        <w:t>s cost</w:t>
+      </w:r>
+      <w:r>
+        <w:rPr>
+          <w:rFonts w:asciiTheme="minorHAnsi" w:hAnsiTheme="minorHAnsi" w:cstheme="minorHAnsi"/>
+          <w:sz w:val="22"/>
+          <w:szCs w:val="22"/>
+          <w:lang w:val="es-ES"/>
+        </w:rPr>
+        <w:t>o</w:t>
+      </w:r>
+      <w:r>
+        <w:rPr>
+          <w:rFonts w:asciiTheme="minorHAnsi" w:hAnsiTheme="minorHAnsi" w:cstheme="minorHAnsi"/>
+          <w:sz w:val="22"/>
+          <w:szCs w:val="22"/>
+          <w:lang w:val="es-ES"/>
+        </w:rPr>
+        <w:t>s operativ</w:t>
+      </w:r>
+      <w:r>
+        <w:rPr>
+          <w:rFonts w:asciiTheme="minorHAnsi" w:hAnsiTheme="minorHAnsi" w:cstheme="minorHAnsi"/>
+          <w:sz w:val="22"/>
+          <w:szCs w:val="22"/>
+          <w:lang w:val="es-ES"/>
+        </w:rPr>
+        <w:t>o</w:t>
+      </w:r>
+      <w:r>
+        <w:rPr>
+          <w:rFonts w:asciiTheme="minorHAnsi" w:hAnsiTheme="minorHAnsi" w:cstheme="minorHAnsi"/>
+          <w:sz w:val="22"/>
+          <w:szCs w:val="22"/>
+          <w:lang w:val="es-ES"/>
+        </w:rPr>
+        <w:t>s</w:t>
+      </w:r>
+      <w:r>
+        <w:rPr>
+          <w:rFonts w:asciiTheme="minorHAnsi" w:hAnsiTheme="minorHAnsi" w:cstheme="minorHAnsi"/>
+          <w:sz w:val="22"/>
+          <w:szCs w:val="22"/>
+          <w:lang w:val="es-ES"/>
+        </w:rPr>
         <w:t xml:space="preserve"> </w:t>
       </w:r>
       <w:r>
@@ -872,7 +934,7 @@
           <w:szCs w:val="22"/>
           <w:lang w:val="es-ES"/>
         </w:rPr>
-        <w:t>a sus necesidades</w:t>
+        <w:t>adaptado a</w:t>
       </w:r>
       <w:r>
         <w:rPr>
@@ -881,85 +943,48 @@
           <w:szCs w:val="22"/>
           <w:lang w:val="es-ES"/>
         </w:rPr>
+        <w:t xml:space="preserve"> sus necesidades</w:t>
+      </w:r>
+      <w:r>
+        <w:rPr>
+          <w:rFonts w:asciiTheme="minorHAnsi" w:hAnsiTheme="minorHAnsi" w:cstheme="minorHAnsi"/>
+          <w:sz w:val="22"/>
+          <w:szCs w:val="22"/>
+          <w:lang w:val="es-ES"/>
+        </w:rPr>
         <w:t xml:space="preserve"> que s</w:t>
       </w:r>
-      <w:proofErr w:type="spellStart"/>
-      <w:r>
-        <w:rPr>
-          <w:rFonts w:asciiTheme="minorHAnsi" w:hAnsiTheme="minorHAnsi" w:cstheme="minorHAnsi"/>
-          <w:sz w:val="22"/>
-          <w:szCs w:val="22"/>
-        </w:rPr>
-        <w:t>e</w:t>
-      </w:r>
-      <w:proofErr w:type="spellEnd"/>
-      <w:r>
-        <w:rPr>
-          <w:rFonts w:asciiTheme="minorHAnsi" w:hAnsiTheme="minorHAnsi" w:cstheme="minorHAnsi"/>
-          <w:sz w:val="22"/>
-          <w:szCs w:val="22"/>
-        </w:rPr>
-        <w:t xml:space="preserve"> basa en el principio de</w:t>
-      </w:r>
-      <w:r>
-        <w:rPr>
-          <w:rFonts w:asciiTheme="minorHAnsi" w:hAnsiTheme="minorHAnsi" w:cstheme="minorHAnsi"/>
-          <w:sz w:val="22"/>
-          <w:szCs w:val="22"/>
-        </w:rPr>
-        <w:t>l pago por uso</w:t>
-      </w:r>
-      <w:r>
-        <w:rPr>
-          <w:rFonts w:asciiTheme="minorHAnsi" w:hAnsiTheme="minorHAnsi" w:cstheme="minorHAnsi"/>
-          <w:sz w:val="22"/>
-          <w:szCs w:val="22"/>
-        </w:rPr>
-        <w:t>(</w:t>
-      </w:r>
-      <w:proofErr w:type="spellStart"/>
-      <w:r>
-        <w:rPr>
-          <w:rFonts w:asciiTheme="minorHAnsi" w:hAnsiTheme="minorHAnsi" w:cstheme="minorHAnsi"/>
-          <w:sz w:val="22"/>
-          <w:szCs w:val="22"/>
-        </w:rPr>
-        <w:t>pa</w:t>
-      </w:r>
-      <w:r>
-        <w:rPr>
-          <w:rFonts w:asciiTheme="minorHAnsi" w:hAnsiTheme="minorHAnsi" w:cstheme="minorHAnsi"/>
-          <w:sz w:val="22"/>
-          <w:szCs w:val="22"/>
-        </w:rPr>
-        <w:t>y</w:t>
-      </w:r>
-      <w:proofErr w:type="spellEnd"/>
-      <w:r>
-        <w:rPr>
-          <w:rFonts w:asciiTheme="minorHAnsi" w:hAnsiTheme="minorHAnsi" w:cstheme="minorHAnsi"/>
-          <w:sz w:val="22"/>
-          <w:szCs w:val="22"/>
-        </w:rPr>
-        <w:t>-as-yo-</w:t>
-      </w:r>
-      <w:proofErr w:type="spellStart"/>
-      <w:r>
-        <w:rPr>
-          <w:rFonts w:asciiTheme="minorHAnsi" w:hAnsiTheme="minorHAnsi" w:cstheme="minorHAnsi"/>
-          <w:sz w:val="22"/>
-          <w:szCs w:val="22"/>
-        </w:rPr>
-        <w:t>go</w:t>
-      </w:r>
-      <w:proofErr w:type="spellEnd"/>
-      <w:r>
-        <w:rPr>
-          <w:rFonts w:asciiTheme="minorHAnsi" w:hAnsiTheme="minorHAnsi" w:cstheme="minorHAnsi"/>
-          <w:sz w:val="22"/>
-          <w:szCs w:val="22"/>
-        </w:rPr>
-        <w:t>)</w:t>
+      <w:r>
+        <w:rPr>
+          <w:rFonts w:asciiTheme="minorHAnsi" w:hAnsiTheme="minorHAnsi" w:cstheme="minorHAnsi"/>
+          <w:sz w:val="22"/>
+          <w:szCs w:val="22"/>
+        </w:rPr>
+        <w:t>e basa en el principio de</w:t>
+      </w:r>
+      <w:r>
+        <w:rPr>
+          <w:rFonts w:asciiTheme="minorHAnsi" w:hAnsiTheme="minorHAnsi" w:cstheme="minorHAnsi"/>
+          <w:sz w:val="22"/>
+          <w:szCs w:val="22"/>
+        </w:rPr>
+        <w:t xml:space="preserve"> pago por uso</w:t>
+      </w:r>
+      <w:r>
+        <w:rPr>
+          <w:rFonts w:asciiTheme="minorHAnsi" w:hAnsiTheme="minorHAnsi" w:cstheme="minorHAnsi"/>
+          <w:sz w:val="22"/>
+          <w:szCs w:val="22"/>
+        </w:rPr>
+        <w:t>(pa</w:t>
+      </w:r>
+      <w:r>
+        <w:rPr>
+          <w:rFonts w:asciiTheme="minorHAnsi" w:hAnsiTheme="minorHAnsi" w:cstheme="minorHAnsi"/>
+          <w:sz w:val="22"/>
+          <w:szCs w:val="22"/>
+        </w:rPr>
+        <w:t>y-as-yo-go)</w:t>
       </w:r>
       <w:r>
         <w:rPr>
@@ -974,88 +999,42 @@
           <w:sz w:val="22"/>
           <w:szCs w:val="22"/>
         </w:rPr>
-        <w:t xml:space="preserve">[Big data </w:t>
-      </w:r>
-      <w:proofErr w:type="spellStart"/>
-      <w:r>
-        <w:rPr>
-          <w:rFonts w:asciiTheme="minorHAnsi" w:hAnsiTheme="minorHAnsi" w:cstheme="minorHAnsi"/>
-          <w:sz w:val="22"/>
-          <w:szCs w:val="22"/>
-        </w:rPr>
-        <w:t>analytics</w:t>
-      </w:r>
-      <w:proofErr w:type="spellEnd"/>
-      <w:r>
-        <w:rPr>
-          <w:rFonts w:asciiTheme="minorHAnsi" w:hAnsiTheme="minorHAnsi" w:cstheme="minorHAnsi"/>
-          <w:sz w:val="22"/>
-          <w:szCs w:val="22"/>
-        </w:rPr>
-        <w:t xml:space="preserve"> in Cloud </w:t>
-      </w:r>
-      <w:proofErr w:type="spellStart"/>
-      <w:r>
-        <w:rPr>
-          <w:rFonts w:asciiTheme="minorHAnsi" w:hAnsiTheme="minorHAnsi" w:cstheme="minorHAnsi"/>
-          <w:sz w:val="22"/>
-          <w:szCs w:val="22"/>
-        </w:rPr>
-        <w:t>computing</w:t>
-      </w:r>
-      <w:proofErr w:type="spellEnd"/>
-      <w:r>
-        <w:rPr>
-          <w:rFonts w:asciiTheme="minorHAnsi" w:hAnsiTheme="minorHAnsi" w:cstheme="minorHAnsi"/>
-          <w:sz w:val="22"/>
-          <w:szCs w:val="22"/>
-        </w:rPr>
-        <w:t xml:space="preserve">: </w:t>
-      </w:r>
-      <w:proofErr w:type="spellStart"/>
-      <w:r>
-        <w:rPr>
-          <w:rFonts w:asciiTheme="minorHAnsi" w:hAnsiTheme="minorHAnsi" w:cstheme="minorHAnsi"/>
-          <w:sz w:val="22"/>
-          <w:szCs w:val="22"/>
-        </w:rPr>
-        <w:t>an</w:t>
-      </w:r>
-      <w:proofErr w:type="spellEnd"/>
-      <w:r>
-        <w:rPr>
-          <w:rFonts w:asciiTheme="minorHAnsi" w:hAnsiTheme="minorHAnsi" w:cstheme="minorHAnsi"/>
-          <w:sz w:val="22"/>
-          <w:szCs w:val="22"/>
+        <w:t>[Big data analytics in Cloud computing: an overview]</w:t>
+      </w:r>
+      <w:r>
+        <w:rPr>
+          <w:rFonts w:asciiTheme="minorHAnsi" w:hAnsiTheme="minorHAnsi" w:cstheme="minorHAnsi"/>
+          <w:sz w:val="22"/>
+          <w:szCs w:val="22"/>
+        </w:rPr>
+        <w:t xml:space="preserve">. </w:t>
+      </w:r>
+      <w:r>
+        <w:rPr>
+          <w:rFonts w:asciiTheme="minorHAnsi" w:hAnsiTheme="minorHAnsi" w:cstheme="minorHAnsi"/>
+          <w:sz w:val="22"/>
+          <w:szCs w:val="22"/>
+          <w:lang w:val="es-ES"/>
+        </w:rPr>
+        <w:t xml:space="preserve">La inteligencia artificial </w:t>
+      </w:r>
+      <w:r>
+        <w:rPr>
+          <w:rFonts w:asciiTheme="minorHAnsi" w:hAnsiTheme="minorHAnsi" w:cstheme="minorHAnsi"/>
+          <w:sz w:val="22"/>
+          <w:szCs w:val="22"/>
+        </w:rPr>
+        <w:t>transforma</w:t>
+      </w:r>
+      <w:r>
+        <w:rPr>
+          <w:rFonts w:asciiTheme="minorHAnsi" w:hAnsiTheme="minorHAnsi" w:cstheme="minorHAnsi"/>
+          <w:sz w:val="22"/>
+          <w:szCs w:val="22"/>
+          <w:lang w:val="es-ES"/>
         </w:rPr>
         <w:t xml:space="preserve"> </w:t>
       </w:r>
-      <w:proofErr w:type="spellStart"/>
-      <w:r>
-        <w:rPr>
-          <w:rFonts w:asciiTheme="minorHAnsi" w:hAnsiTheme="minorHAnsi" w:cstheme="minorHAnsi"/>
-          <w:sz w:val="22"/>
-          <w:szCs w:val="22"/>
-        </w:rPr>
-        <w:t>overview</w:t>
-      </w:r>
-      <w:proofErr w:type="spellEnd"/>
-      <w:r>
-        <w:rPr>
-          <w:rFonts w:asciiTheme="minorHAnsi" w:hAnsiTheme="minorHAnsi" w:cstheme="minorHAnsi"/>
-          <w:sz w:val="22"/>
-          <w:szCs w:val="22"/>
-        </w:rPr>
-        <w:t>]</w:t>
-      </w:r>
-      <w:r>
-        <w:rPr>
-          <w:rFonts w:asciiTheme="minorHAnsi" w:hAnsiTheme="minorHAnsi" w:cstheme="minorHAnsi"/>
-          <w:sz w:val="22"/>
-          <w:szCs w:val="22"/>
-        </w:rPr>
-        <w:t xml:space="preserve">. </w:t>
-      </w:r>
       <w:r>
         <w:rPr>
           <w:rFonts w:asciiTheme="minorHAnsi" w:hAnsiTheme="minorHAnsi" w:cstheme="minorHAnsi"/>
@@ -1063,7 +1042,7 @@
           <w:szCs w:val="22"/>
           <w:lang w:val="es-ES"/>
         </w:rPr>
-        <w:t xml:space="preserve">La inteligencia artificial </w:t>
+        <w:t xml:space="preserve">la nube </w:t>
       </w:r>
       <w:r>
         <w:rPr>
@@ -1072,7 +1051,7 @@
           <w:szCs w:val="22"/>
           <w:lang w:val="es-ES"/>
         </w:rPr>
-        <w:t xml:space="preserve">transporte </w:t>
+        <w:t>desde una herramienta</w:t>
       </w:r>
       <w:r>
         <w:rPr>
@@ -1081,7 +1060,7 @@
           <w:szCs w:val="22"/>
           <w:lang w:val="es-ES"/>
         </w:rPr>
-        <w:t xml:space="preserve">la nube </w:t>
+        <w:t xml:space="preserve"> tradicional</w:t>
       </w:r>
       <w:r>
         <w:rPr>
@@ -1090,7 +1069,7 @@
           <w:szCs w:val="22"/>
           <w:lang w:val="es-ES"/>
         </w:rPr>
-        <w:t>desde una herramienta</w:t>
+        <w:t xml:space="preserve"> de</w:t>
       </w:r>
       <w:r>
         <w:rPr>
@@ -1099,24 +1078,6 @@
           <w:szCs w:val="22"/>
           <w:lang w:val="es-ES"/>
         </w:rPr>
-        <w:t xml:space="preserve"> tradicional</w:t>
-      </w:r>
-      <w:r>
-        <w:rPr>
-          <w:rFonts w:asciiTheme="minorHAnsi" w:hAnsiTheme="minorHAnsi" w:cstheme="minorHAnsi"/>
-          <w:sz w:val="22"/>
-          <w:szCs w:val="22"/>
-          <w:lang w:val="es-ES"/>
-        </w:rPr>
-        <w:t xml:space="preserve"> de</w:t>
-      </w:r>
-      <w:r>
-        <w:rPr>
-          <w:rFonts w:asciiTheme="minorHAnsi" w:hAnsiTheme="minorHAnsi" w:cstheme="minorHAnsi"/>
-          <w:sz w:val="22"/>
-          <w:szCs w:val="22"/>
-          <w:lang w:val="es-ES"/>
-        </w:rPr>
         <w:t xml:space="preserve"> </w:t>
       </w:r>
       <w:r>
@@ -1205,15 +1166,55 @@
           <w:sz w:val="22"/>
           <w:szCs w:val="22"/>
         </w:rPr>
-        <w:t xml:space="preserve"> que transformando los ent</w:t>
-      </w:r>
-      <w:r>
-        <w:rPr>
-          <w:rFonts w:asciiTheme="minorHAnsi" w:hAnsiTheme="minorHAnsi" w:cstheme="minorHAnsi"/>
-          <w:sz w:val="22"/>
-          <w:szCs w:val="22"/>
-        </w:rPr>
-        <w:t xml:space="preserve">ornos de la nube en sistema activos capaces </w:t>
+        <w:t xml:space="preserve">, </w:t>
+      </w:r>
+      <w:r>
+        <w:rPr>
+          <w:rFonts w:asciiTheme="minorHAnsi" w:hAnsiTheme="minorHAnsi" w:cstheme="minorHAnsi"/>
+          <w:sz w:val="22"/>
+          <w:szCs w:val="22"/>
+        </w:rPr>
+        <w:t>transformando los ent</w:t>
+      </w:r>
+      <w:r>
+        <w:rPr>
+          <w:rFonts w:asciiTheme="minorHAnsi" w:hAnsiTheme="minorHAnsi" w:cstheme="minorHAnsi"/>
+          <w:sz w:val="22"/>
+          <w:szCs w:val="22"/>
+        </w:rPr>
+        <w:t>ornos de la nube en sistema</w:t>
+      </w:r>
+      <w:r>
+        <w:rPr>
+          <w:rFonts w:asciiTheme="minorHAnsi" w:hAnsiTheme="minorHAnsi" w:cstheme="minorHAnsi"/>
+          <w:sz w:val="22"/>
+          <w:szCs w:val="22"/>
+        </w:rPr>
+        <w:t>s</w:t>
+      </w:r>
+      <w:r>
+        <w:rPr>
+          <w:rFonts w:asciiTheme="minorHAnsi" w:hAnsiTheme="minorHAnsi" w:cstheme="minorHAnsi"/>
+          <w:sz w:val="22"/>
+          <w:szCs w:val="22"/>
+        </w:rPr>
+        <w:t xml:space="preserve"> activo</w:t>
+      </w:r>
+      <w:r>
+        <w:rPr>
+          <w:rFonts w:asciiTheme="minorHAnsi" w:hAnsiTheme="minorHAnsi" w:cstheme="minorHAnsi"/>
+          <w:sz w:val="22"/>
+          <w:szCs w:val="22"/>
+        </w:rPr>
+        <w:t>s</w:t>
+      </w:r>
+      <w:r>
+        <w:rPr>
+          <w:rFonts w:asciiTheme="minorHAnsi" w:hAnsiTheme="minorHAnsi" w:cstheme="minorHAnsi"/>
+          <w:sz w:val="22"/>
+          <w:szCs w:val="22"/>
+        </w:rPr>
+        <w:t xml:space="preserve"> capaces </w:t>
       </w:r>
       <w:r>
         <w:rPr>
@@ -1252,18 +1253,8 @@
           <w:sz w:val="22"/>
           <w:szCs w:val="22"/>
         </w:rPr>
-        <w:t>[</w:t>
-      </w:r>
-      <w:proofErr w:type="spellStart"/>
-      <w:r>
-        <w:rPr>
-          <w:rFonts w:asciiTheme="minorHAnsi" w:hAnsiTheme="minorHAnsi" w:cstheme="minorHAnsi"/>
-          <w:sz w:val="22"/>
-          <w:szCs w:val="22"/>
-        </w:rPr>
-        <w:t>Applications</w:t>
-      </w:r>
-      <w:proofErr w:type="spellEnd"/>
+        <w:t>[Applications of AI in Cloud Computing].</w:t>
+      </w:r>
       <w:r>
         <w:rPr>
           <w:rFonts w:asciiTheme="minorHAnsi" w:hAnsiTheme="minorHAnsi" w:cstheme="minorHAnsi"/>
@@ -1272,72 +1263,86 @@
         </w:rPr>
         <w:t xml:space="preserve"> </w:t>
       </w:r>
-      <w:proofErr w:type="spellStart"/>
-      <w:r>
-        <w:rPr>
-          <w:rFonts w:asciiTheme="minorHAnsi" w:hAnsiTheme="minorHAnsi" w:cstheme="minorHAnsi"/>
-          <w:sz w:val="22"/>
-          <w:szCs w:val="22"/>
-        </w:rPr>
-        <w:t>of</w:t>
-      </w:r>
-      <w:proofErr w:type="spellEnd"/>
-      <w:r>
-        <w:rPr>
-          <w:rFonts w:asciiTheme="minorHAnsi" w:hAnsiTheme="minorHAnsi" w:cstheme="minorHAnsi"/>
-          <w:sz w:val="22"/>
-          <w:szCs w:val="22"/>
-        </w:rPr>
-        <w:t xml:space="preserve"> AI in Cloud Computing].</w:t>
-      </w:r>
-      <w:r>
-        <w:rPr>
-          <w:rFonts w:asciiTheme="minorHAnsi" w:hAnsiTheme="minorHAnsi" w:cstheme="minorHAnsi"/>
-          <w:sz w:val="22"/>
-          <w:szCs w:val="22"/>
+      <w:r>
+        <w:rPr>
+          <w:rFonts w:asciiTheme="minorHAnsi" w:hAnsiTheme="minorHAnsi" w:cstheme="minorHAnsi"/>
+          <w:sz w:val="22"/>
+          <w:szCs w:val="22"/>
+        </w:rPr>
+        <w:t xml:space="preserve">Las tecnologías de inteligencia artificial integradas con la nube </w:t>
+      </w:r>
+      <w:r>
+        <w:rPr>
+          <w:rFonts w:asciiTheme="minorHAnsi" w:hAnsiTheme="minorHAnsi" w:cstheme="minorHAnsi"/>
+          <w:sz w:val="22"/>
+          <w:szCs w:val="22"/>
+        </w:rPr>
+        <w:t>contribuyen</w:t>
+      </w:r>
+      <w:r>
+        <w:rPr>
+          <w:rFonts w:asciiTheme="minorHAnsi" w:hAnsiTheme="minorHAnsi" w:cstheme="minorHAnsi" w:hint="cs"/>
+          <w:sz w:val="22"/>
+          <w:szCs w:val="22"/>
+          <w:rtl/>
         </w:rPr>
         <w:t xml:space="preserve"> </w:t>
       </w:r>
       <w:r>
         <w:rPr>
-          <w:rFonts w:asciiTheme="minorHAnsi" w:hAnsiTheme="minorHAnsi" w:cstheme="minorHAnsi"/>
-          <w:sz w:val="22"/>
-          <w:szCs w:val="22"/>
-        </w:rPr>
-        <w:t xml:space="preserve">Las tecnologías de inteligencia artificial integradas con la nube </w:t>
-      </w:r>
-      <w:r>
-        <w:rPr>
-          <w:rFonts w:asciiTheme="minorHAnsi" w:hAnsiTheme="minorHAnsi" w:cstheme="minorHAnsi"/>
-          <w:sz w:val="22"/>
-          <w:szCs w:val="22"/>
-        </w:rPr>
-        <w:t>contribuyen</w:t>
-      </w:r>
-      <w:r>
-        <w:rPr>
           <w:rFonts w:asciiTheme="minorHAnsi" w:hAnsiTheme="minorHAnsi" w:cstheme="minorHAnsi" w:hint="cs"/>
           <w:sz w:val="22"/>
           <w:szCs w:val="22"/>
-          <w:rtl/>
+        </w:rPr>
+        <w:t>a</w:t>
+      </w:r>
+      <w:r>
+        <w:rPr>
+          <w:rFonts w:asciiTheme="minorHAnsi" w:hAnsiTheme="minorHAnsi" w:cstheme="minorHAnsi"/>
+          <w:sz w:val="22"/>
+          <w:szCs w:val="22"/>
+        </w:rPr>
+        <w:t xml:space="preserve"> proporcionar perspectivas predictivas precisas</w:t>
+      </w:r>
+      <w:r>
+        <w:rPr>
+          <w:rFonts w:asciiTheme="minorHAnsi" w:hAnsiTheme="minorHAnsi" w:cstheme="minorHAnsi"/>
+          <w:sz w:val="22"/>
+          <w:szCs w:val="22"/>
         </w:rPr>
         <w:t xml:space="preserve"> </w:t>
       </w:r>
       <w:r>
         <w:rPr>
-          <w:rFonts w:asciiTheme="minorHAnsi" w:hAnsiTheme="minorHAnsi" w:cstheme="minorHAnsi" w:hint="cs"/>
-          <w:sz w:val="22"/>
-          <w:szCs w:val="22"/>
-        </w:rPr>
-        <w:t>a</w:t>
-      </w:r>
-      <w:r>
-        <w:rPr>
-          <w:rFonts w:asciiTheme="minorHAnsi" w:hAnsiTheme="minorHAnsi" w:cstheme="minorHAnsi"/>
-          <w:sz w:val="22"/>
-          <w:szCs w:val="22"/>
-        </w:rPr>
-        <w:t xml:space="preserve"> proporcionar perspectivas predictivas precisas</w:t>
+          <w:rFonts w:asciiTheme="minorHAnsi" w:hAnsiTheme="minorHAnsi" w:cstheme="minorHAnsi"/>
+          <w:sz w:val="22"/>
+          <w:szCs w:val="22"/>
+        </w:rPr>
+        <w:t>que ayuda</w:t>
+      </w:r>
+      <w:r>
+        <w:rPr>
+          <w:rFonts w:asciiTheme="minorHAnsi" w:hAnsiTheme="minorHAnsi" w:cstheme="minorHAnsi"/>
+          <w:sz w:val="22"/>
+          <w:szCs w:val="22"/>
+        </w:rPr>
+        <w:t>n</w:t>
+      </w:r>
+      <w:r>
+        <w:rPr>
+          <w:rFonts w:asciiTheme="minorHAnsi" w:hAnsiTheme="minorHAnsi" w:cstheme="minorHAnsi"/>
+          <w:sz w:val="22"/>
+          <w:szCs w:val="22"/>
+        </w:rPr>
+        <w:t xml:space="preserve"> las empresas </w:t>
+      </w:r>
+      <w:r>
+        <w:rPr>
+          <w:rFonts w:asciiTheme="minorHAnsi" w:hAnsiTheme="minorHAnsi" w:cstheme="minorHAnsi"/>
+          <w:sz w:val="22"/>
+          <w:szCs w:val="22"/>
+        </w:rPr>
+        <w:t>anticipar los desafíos y mejorar</w:t>
       </w:r>
       <w:r>
         <w:rPr>
@@ -1353,31 +1358,15 @@
           <w:sz w:val="22"/>
           <w:szCs w:val="22"/>
         </w:rPr>
-        <w:t xml:space="preserve">que ayuda las empresas </w:t>
-      </w:r>
-      <w:r>
-        <w:rPr>
-          <w:rFonts w:asciiTheme="minorHAnsi" w:hAnsiTheme="minorHAnsi" w:cstheme="minorHAnsi"/>
-          <w:sz w:val="22"/>
-          <w:szCs w:val="22"/>
-        </w:rPr>
-        <w:t>anticipar los desafíos y mejorar</w:t>
-      </w:r>
-      <w:r>
-        <w:rPr>
-          <w:rFonts w:asciiTheme="minorHAnsi" w:hAnsiTheme="minorHAnsi" w:cstheme="minorHAnsi"/>
-          <w:sz w:val="22"/>
-          <w:szCs w:val="22"/>
-        </w:rPr>
-        <w:t xml:space="preserve"> </w:t>
-      </w:r>
-      <w:r>
-        <w:rPr>
-          <w:rFonts w:asciiTheme="minorHAnsi" w:hAnsiTheme="minorHAnsi" w:cstheme="minorHAnsi"/>
-          <w:sz w:val="22"/>
-          <w:szCs w:val="22"/>
-        </w:rPr>
-        <w:t xml:space="preserve">tomar las decisiones </w:t>
+        <w:t>sus</w:t>
+      </w:r>
+      <w:r>
+        <w:rPr>
+          <w:rFonts w:asciiTheme="minorHAnsi" w:hAnsiTheme="minorHAnsi" w:cstheme="minorHAnsi"/>
+          <w:sz w:val="22"/>
+          <w:szCs w:val="22"/>
+        </w:rPr>
+        <w:t xml:space="preserve"> decisiones </w:t>
       </w:r>
       <w:r>
         <w:rPr>
@@ -1393,7 +1382,7 @@
           <w:sz w:val="22"/>
           <w:szCs w:val="22"/>
         </w:rPr>
-        <w:t xml:space="preserve"> la</w:t>
+        <w:t>l</w:t>
       </w:r>
       <w:r>
         <w:rPr>
@@ -1464,25 +1453,7 @@
           <w:sz w:val="22"/>
           <w:szCs w:val="22"/>
         </w:rPr>
-        <w:t xml:space="preserve">[The Future </w:t>
-      </w:r>
-      <w:proofErr w:type="spellStart"/>
-      <w:r>
-        <w:rPr>
-          <w:rFonts w:asciiTheme="minorHAnsi" w:hAnsiTheme="minorHAnsi" w:cstheme="minorHAnsi"/>
-          <w:sz w:val="22"/>
-          <w:szCs w:val="22"/>
-        </w:rPr>
-        <w:t>of</w:t>
-      </w:r>
-      <w:proofErr w:type="spellEnd"/>
-      <w:r>
-        <w:rPr>
-          <w:rFonts w:asciiTheme="minorHAnsi" w:hAnsiTheme="minorHAnsi" w:cstheme="minorHAnsi"/>
-          <w:sz w:val="22"/>
-          <w:szCs w:val="22"/>
-        </w:rPr>
-        <w:t xml:space="preserve"> AI in Big Data]</w:t>
+        <w:t>[The Future of AI in Big Data]</w:t>
       </w:r>
       <w:r>
         <w:rPr>
@@ -1491,6 +1462,14 @@
           <w:szCs w:val="22"/>
         </w:rPr>
         <w:t xml:space="preserve">. </w:t>
+      </w:r>
+      <w:r>
+        <w:rPr>
+          <w:rFonts w:asciiTheme="minorHAnsi" w:hAnsiTheme="minorHAnsi" w:cstheme="minorHAnsi"/>
+          <w:sz w:val="22"/>
+          <w:szCs w:val="22"/>
+        </w:rPr>
+        <w:t xml:space="preserve">El </w:t>
       </w:r>
       <w:r>
         <w:rPr>
@@ -1818,43 +1797,7 @@
           <w:sz w:val="22"/>
           <w:szCs w:val="22"/>
         </w:rPr>
-        <w:t xml:space="preserve">[Artificial </w:t>
-      </w:r>
-      <w:proofErr w:type="spellStart"/>
-      <w:r>
-        <w:rPr>
-          <w:rFonts w:asciiTheme="minorHAnsi" w:hAnsiTheme="minorHAnsi" w:cstheme="minorHAnsi"/>
-          <w:sz w:val="22"/>
-          <w:szCs w:val="22"/>
-        </w:rPr>
-        <w:t>Intelligence</w:t>
-      </w:r>
-      <w:proofErr w:type="spellEnd"/>
-      <w:r>
-        <w:rPr>
-          <w:rFonts w:asciiTheme="minorHAnsi" w:hAnsiTheme="minorHAnsi" w:cstheme="minorHAnsi"/>
-          <w:sz w:val="22"/>
-          <w:szCs w:val="22"/>
-        </w:rPr>
-        <w:t xml:space="preserve"> Data Security </w:t>
-      </w:r>
-      <w:proofErr w:type="spellStart"/>
-      <w:r>
-        <w:rPr>
-          <w:rFonts w:asciiTheme="minorHAnsi" w:hAnsiTheme="minorHAnsi" w:cstheme="minorHAnsi"/>
-          <w:sz w:val="22"/>
-          <w:szCs w:val="22"/>
-        </w:rPr>
-        <w:t>Evaluation</w:t>
-      </w:r>
-      <w:proofErr w:type="spellEnd"/>
-      <w:r>
-        <w:rPr>
-          <w:rFonts w:asciiTheme="minorHAnsi" w:hAnsiTheme="minorHAnsi" w:cstheme="minorHAnsi"/>
-          <w:sz w:val="22"/>
-          <w:szCs w:val="22"/>
-        </w:rPr>
-        <w:t>]</w:t>
+        <w:t>[Artificial Intelligence Data Security Evaluation]</w:t>
       </w:r>
       <w:r>
         <w:rPr>
@@ -2044,36 +1987,8 @@
           <w:sz w:val="22"/>
           <w:szCs w:val="22"/>
         </w:rPr>
-        <w:t xml:space="preserve">[Artificial </w:t>
-      </w:r>
-      <w:proofErr w:type="spellStart"/>
-      <w:r>
-        <w:rPr>
-          <w:rFonts w:asciiTheme="minorHAnsi" w:hAnsiTheme="minorHAnsi" w:cstheme="minorHAnsi"/>
-          <w:sz w:val="22"/>
-          <w:szCs w:val="22"/>
-        </w:rPr>
-        <w:t>Intelligence</w:t>
-      </w:r>
-      <w:proofErr w:type="spellEnd"/>
-      <w:r>
-        <w:rPr>
-          <w:rFonts w:asciiTheme="minorHAnsi" w:hAnsiTheme="minorHAnsi" w:cstheme="minorHAnsi"/>
-          <w:sz w:val="22"/>
-          <w:szCs w:val="22"/>
-        </w:rPr>
-        <w:t xml:space="preserve"> Data Security </w:t>
-      </w:r>
-      <w:proofErr w:type="spellStart"/>
-      <w:r>
-        <w:rPr>
-          <w:rFonts w:asciiTheme="minorHAnsi" w:hAnsiTheme="minorHAnsi" w:cstheme="minorHAnsi"/>
-          <w:sz w:val="22"/>
-          <w:szCs w:val="22"/>
-        </w:rPr>
-        <w:t>Evaluation</w:t>
-      </w:r>
-      <w:proofErr w:type="spellEnd"/>
+        <w:t>[Artificial Intelligence Data Security Evaluation</w:t>
+      </w:r>
       <w:r>
         <w:rPr>
           <w:rFonts w:asciiTheme="minorHAnsi" w:hAnsiTheme="minorHAnsi" w:cstheme="minorHAnsi"/>
@@ -2207,25 +2122,7 @@
           <w:sz w:val="22"/>
           <w:szCs w:val="22"/>
         </w:rPr>
-        <w:t xml:space="preserve">[The Future </w:t>
-      </w:r>
-      <w:proofErr w:type="spellStart"/>
-      <w:r>
-        <w:rPr>
-          <w:rFonts w:asciiTheme="minorHAnsi" w:hAnsiTheme="minorHAnsi" w:cstheme="minorHAnsi"/>
-          <w:sz w:val="22"/>
-          <w:szCs w:val="22"/>
-        </w:rPr>
-        <w:t>of</w:t>
-      </w:r>
-      <w:proofErr w:type="spellEnd"/>
-      <w:r>
-        <w:rPr>
-          <w:rFonts w:asciiTheme="minorHAnsi" w:hAnsiTheme="minorHAnsi" w:cstheme="minorHAnsi"/>
-          <w:sz w:val="22"/>
-          <w:szCs w:val="22"/>
-        </w:rPr>
-        <w:t xml:space="preserve"> AI in Big Data].</w:t>
+        <w:t>[The Future of AI in Big Data].</w:t>
       </w:r>
       <w:r>
         <w:rPr>
@@ -2592,34 +2489,7 @@
           <w:sz w:val="22"/>
           <w:szCs w:val="22"/>
         </w:rPr>
-        <w:t xml:space="preserve">( </w:t>
-      </w:r>
-      <w:proofErr w:type="spellStart"/>
-      <w:r>
-        <w:rPr>
-          <w:rFonts w:asciiTheme="minorHAnsi" w:hAnsiTheme="minorHAnsi" w:cstheme="minorHAnsi"/>
-          <w:sz w:val="22"/>
-          <w:szCs w:val="22"/>
-        </w:rPr>
-        <w:t>workload</w:t>
-      </w:r>
-      <w:proofErr w:type="spellEnd"/>
-      <w:r>
-        <w:rPr>
-          <w:rFonts w:asciiTheme="minorHAnsi" w:hAnsiTheme="minorHAnsi" w:cstheme="minorHAnsi"/>
-          <w:sz w:val="22"/>
-          <w:szCs w:val="22"/>
-        </w:rPr>
-        <w:t xml:space="preserve"> </w:t>
-      </w:r>
-      <w:proofErr w:type="spellStart"/>
-      <w:r>
-        <w:rPr>
-          <w:rFonts w:asciiTheme="minorHAnsi" w:hAnsiTheme="minorHAnsi" w:cstheme="minorHAnsi"/>
-          <w:sz w:val="22"/>
-          <w:szCs w:val="22"/>
-        </w:rPr>
-        <w:t>patt</w:t>
+        <w:t>( workload patt</w:t>
       </w:r>
       <w:r>
         <w:rPr>
@@ -2629,7 +2499,6 @@
         </w:rPr>
         <w:t>rens</w:t>
       </w:r>
-      <w:proofErr w:type="spellEnd"/>
       <w:r>
         <w:rPr>
           <w:rFonts w:asciiTheme="minorHAnsi" w:hAnsiTheme="minorHAnsi" w:cstheme="minorHAnsi"/>
@@ -2981,18 +2850,40 @@
           <w:sz w:val="22"/>
           <w:szCs w:val="22"/>
         </w:rPr>
-        <w:t xml:space="preserve">e, aunque el </w:t>
-      </w:r>
-      <w:proofErr w:type="spellStart"/>
-      <w:r>
-        <w:rPr>
-          <w:rFonts w:asciiTheme="minorHAnsi" w:hAnsiTheme="minorHAnsi" w:cstheme="minorHAnsi"/>
-          <w:sz w:val="22"/>
-          <w:szCs w:val="22"/>
-        </w:rPr>
-        <w:t>cloud</w:t>
-      </w:r>
-      <w:proofErr w:type="spellEnd"/>
+        <w:t>e, aunque el cloud comp</w:t>
+      </w:r>
+      <w:r>
+        <w:rPr>
+          <w:rFonts w:asciiTheme="minorHAnsi" w:hAnsiTheme="minorHAnsi" w:cstheme="minorHAnsi"/>
+          <w:sz w:val="22"/>
+          <w:szCs w:val="22"/>
+        </w:rPr>
+        <w:t xml:space="preserve">uting </w:t>
+      </w:r>
+      <w:r>
+        <w:rPr>
+          <w:rFonts w:asciiTheme="minorHAnsi" w:hAnsiTheme="minorHAnsi" w:cstheme="minorHAnsi"/>
+          <w:sz w:val="22"/>
+          <w:szCs w:val="22"/>
+        </w:rPr>
+        <w:t xml:space="preserve">ha </w:t>
+      </w:r>
+      <w:r>
+        <w:rPr>
+          <w:rFonts w:asciiTheme="minorHAnsi" w:hAnsiTheme="minorHAnsi" w:cstheme="minorHAnsi"/>
+          <w:sz w:val="22"/>
+          <w:szCs w:val="22"/>
+        </w:rPr>
+        <w:t xml:space="preserve">presentado </w:t>
+      </w:r>
+      <w:r>
+        <w:rPr>
+          <w:rFonts w:asciiTheme="minorHAnsi" w:hAnsiTheme="minorHAnsi" w:cstheme="minorHAnsi"/>
+          <w:sz w:val="22"/>
+          <w:szCs w:val="22"/>
+        </w:rPr>
+        <w:t>soluciones de</w:t>
+      </w:r>
       <w:r>
         <w:rPr>
           <w:rFonts w:asciiTheme="minorHAnsi" w:hAnsiTheme="minorHAnsi" w:cstheme="minorHAnsi"/>
@@ -3001,24 +2892,14 @@
         </w:rPr>
         <w:t xml:space="preserve"> </w:t>
       </w:r>
-      <w:proofErr w:type="spellStart"/>
-      <w:r>
-        <w:rPr>
-          <w:rFonts w:asciiTheme="minorHAnsi" w:hAnsiTheme="minorHAnsi" w:cstheme="minorHAnsi"/>
-          <w:sz w:val="22"/>
-          <w:szCs w:val="22"/>
-        </w:rPr>
-        <w:t>comp</w:t>
-      </w:r>
-      <w:r>
-        <w:rPr>
-          <w:rFonts w:asciiTheme="minorHAnsi" w:hAnsiTheme="minorHAnsi" w:cstheme="minorHAnsi"/>
-          <w:sz w:val="22"/>
-          <w:szCs w:val="22"/>
-        </w:rPr>
-        <w:t>uting</w:t>
-      </w:r>
-      <w:proofErr w:type="spellEnd"/>
+      <w:r>
+        <w:rPr>
+          <w:rFonts w:asciiTheme="minorHAnsi" w:hAnsiTheme="minorHAnsi" w:cstheme="minorHAnsi"/>
+          <w:sz w:val="22"/>
+          <w:szCs w:val="22"/>
+        </w:rPr>
+        <w:t>escalabilidad y seguridad</w:t>
+      </w:r>
       <w:r>
         <w:rPr>
           <w:rFonts w:asciiTheme="minorHAnsi" w:hAnsiTheme="minorHAnsi" w:cstheme="minorHAnsi"/>
@@ -3033,91 +2914,7 @@
           <w:sz w:val="22"/>
           <w:szCs w:val="22"/>
         </w:rPr>
-        <w:t xml:space="preserve">ha </w:t>
-      </w:r>
-      <w:r>
-        <w:rPr>
-          <w:rFonts w:asciiTheme="minorHAnsi" w:hAnsiTheme="minorHAnsi" w:cstheme="minorHAnsi"/>
-          <w:sz w:val="22"/>
-          <w:szCs w:val="22"/>
-        </w:rPr>
-        <w:t xml:space="preserve">presentado </w:t>
-      </w:r>
-      <w:r>
-        <w:rPr>
-          <w:rFonts w:asciiTheme="minorHAnsi" w:hAnsiTheme="minorHAnsi" w:cstheme="minorHAnsi"/>
-          <w:sz w:val="22"/>
-          <w:szCs w:val="22"/>
-        </w:rPr>
-        <w:t>soluciones de</w:t>
-      </w:r>
-      <w:r>
-        <w:rPr>
-          <w:rFonts w:asciiTheme="minorHAnsi" w:hAnsiTheme="minorHAnsi" w:cstheme="minorHAnsi"/>
-          <w:sz w:val="22"/>
-          <w:szCs w:val="22"/>
-        </w:rPr>
-        <w:t xml:space="preserve"> </w:t>
-      </w:r>
-      <w:r>
-        <w:rPr>
-          <w:rFonts w:asciiTheme="minorHAnsi" w:hAnsiTheme="minorHAnsi" w:cstheme="minorHAnsi"/>
-          <w:sz w:val="22"/>
-          <w:szCs w:val="22"/>
-        </w:rPr>
-        <w:t>escalabilidad y seguridad</w:t>
-      </w:r>
-      <w:r>
-        <w:rPr>
-          <w:rFonts w:asciiTheme="minorHAnsi" w:hAnsiTheme="minorHAnsi" w:cstheme="minorHAnsi"/>
-          <w:sz w:val="22"/>
-          <w:szCs w:val="22"/>
-        </w:rPr>
-        <w:t xml:space="preserve"> </w:t>
-      </w:r>
-      <w:r>
-        <w:rPr>
-          <w:rFonts w:asciiTheme="minorHAnsi" w:hAnsiTheme="minorHAnsi" w:cstheme="minorHAnsi"/>
-          <w:sz w:val="22"/>
-          <w:szCs w:val="22"/>
-        </w:rPr>
-        <w:t xml:space="preserve">[Artificial </w:t>
-      </w:r>
-      <w:proofErr w:type="spellStart"/>
-      <w:r>
-        <w:rPr>
-          <w:rFonts w:asciiTheme="minorHAnsi" w:hAnsiTheme="minorHAnsi" w:cstheme="minorHAnsi"/>
-          <w:sz w:val="22"/>
-          <w:szCs w:val="22"/>
-        </w:rPr>
-        <w:t>Intelligence</w:t>
-      </w:r>
-      <w:proofErr w:type="spellEnd"/>
-      <w:r>
-        <w:rPr>
-          <w:rFonts w:asciiTheme="minorHAnsi" w:hAnsiTheme="minorHAnsi" w:cstheme="minorHAnsi"/>
-          <w:sz w:val="22"/>
-          <w:szCs w:val="22"/>
-        </w:rPr>
-        <w:t xml:space="preserve"> Data Security </w:t>
-      </w:r>
-      <w:proofErr w:type="spellStart"/>
-      <w:r>
-        <w:rPr>
-          <w:rFonts w:asciiTheme="minorHAnsi" w:hAnsiTheme="minorHAnsi" w:cstheme="minorHAnsi"/>
-          <w:sz w:val="22"/>
-          <w:szCs w:val="22"/>
-        </w:rPr>
-        <w:t>Evaluation</w:t>
-      </w:r>
-      <w:proofErr w:type="spellEnd"/>
-      <w:r>
-        <w:rPr>
-          <w:rFonts w:asciiTheme="minorHAnsi" w:hAnsiTheme="minorHAnsi" w:cstheme="minorHAnsi"/>
-          <w:sz w:val="22"/>
-          <w:szCs w:val="22"/>
-        </w:rPr>
-        <w:t>]</w:t>
+        <w:t>[Artificial Intelligence Data Security Evaluation]</w:t>
       </w:r>
       <w:r>
         <w:rPr>
@@ -3491,18 +3288,8 @@
           <w:sz w:val="22"/>
           <w:szCs w:val="22"/>
         </w:rPr>
-        <w:t xml:space="preserve">Deep </w:t>
-      </w:r>
-      <w:proofErr w:type="spellStart"/>
-      <w:r>
-        <w:rPr>
-          <w:rFonts w:asciiTheme="minorHAnsi" w:hAnsiTheme="minorHAnsi" w:cstheme="minorHAnsi"/>
-          <w:sz w:val="22"/>
-          <w:szCs w:val="22"/>
-        </w:rPr>
-        <w:t>learning</w:t>
-      </w:r>
-      <w:proofErr w:type="spellEnd"/>
+        <w:t>Deep learning</w:t>
+      </w:r>
       <w:r>
         <w:rPr>
           <w:rFonts w:asciiTheme="minorHAnsi" w:hAnsiTheme="minorHAnsi" w:cstheme="minorHAnsi"/>
@@ -3747,7 +3534,55 @@
           <w:sz w:val="22"/>
           <w:szCs w:val="22"/>
         </w:rPr>
-        <w:t>basados en Inteligencia Artificial</w:t>
+        <w:t xml:space="preserve">basados en Inteligencia Artificial </w:t>
+      </w:r>
+      <w:r>
+        <w:rPr>
+          <w:rFonts w:asciiTheme="minorHAnsi" w:hAnsiTheme="minorHAnsi" w:cstheme="minorHAnsi"/>
+          <w:sz w:val="22"/>
+          <w:szCs w:val="22"/>
+        </w:rPr>
+        <w:t xml:space="preserve">para </w:t>
+      </w:r>
+      <w:r>
+        <w:rPr>
+          <w:rFonts w:asciiTheme="minorHAnsi" w:hAnsiTheme="minorHAnsi" w:cstheme="minorHAnsi"/>
+          <w:sz w:val="22"/>
+          <w:szCs w:val="22"/>
+        </w:rPr>
+        <w:t>reduci</w:t>
+      </w:r>
+      <w:r>
+        <w:rPr>
+          <w:rFonts w:asciiTheme="minorHAnsi" w:hAnsiTheme="minorHAnsi" w:cstheme="minorHAnsi"/>
+          <w:sz w:val="22"/>
+          <w:szCs w:val="22"/>
+        </w:rPr>
+        <w:t>r l</w:t>
+      </w:r>
+      <w:r>
+        <w:rPr>
+          <w:rFonts w:asciiTheme="minorHAnsi" w:hAnsiTheme="minorHAnsi" w:cstheme="minorHAnsi"/>
+          <w:sz w:val="22"/>
+          <w:szCs w:val="22"/>
+        </w:rPr>
+        <w:t>a huella de carbono de los centros de datos</w:t>
+      </w:r>
+      <w:r>
+        <w:rPr>
+          <w:rFonts w:asciiTheme="minorHAnsi" w:hAnsiTheme="minorHAnsi" w:cstheme="minorHAnsi"/>
+          <w:sz w:val="22"/>
+          <w:szCs w:val="22"/>
+        </w:rPr>
+        <w:t xml:space="preserve"> e</w:t>
+      </w:r>
+      <w:r>
+        <w:rPr>
+          <w:rFonts w:asciiTheme="minorHAnsi" w:hAnsiTheme="minorHAnsi" w:cstheme="minorHAnsi"/>
+          <w:sz w:val="22"/>
+          <w:szCs w:val="22"/>
+        </w:rPr>
+        <w:t>n consonancia con</w:t>
       </w:r>
       <w:r>
         <w:rPr>
@@ -3763,47 +3598,31 @@
           <w:sz w:val="22"/>
           <w:szCs w:val="22"/>
         </w:rPr>
-        <w:t xml:space="preserve">para </w:t>
-      </w:r>
-      <w:r>
-        <w:rPr>
-          <w:rFonts w:asciiTheme="minorHAnsi" w:hAnsiTheme="minorHAnsi" w:cstheme="minorHAnsi"/>
-          <w:sz w:val="22"/>
-          <w:szCs w:val="22"/>
-        </w:rPr>
-        <w:t>reduci</w:t>
-      </w:r>
-      <w:r>
-        <w:rPr>
-          <w:rFonts w:asciiTheme="minorHAnsi" w:hAnsiTheme="minorHAnsi" w:cstheme="minorHAnsi"/>
-          <w:sz w:val="22"/>
-          <w:szCs w:val="22"/>
-        </w:rPr>
-        <w:t>r l</w:t>
-      </w:r>
-      <w:r>
-        <w:rPr>
-          <w:rFonts w:asciiTheme="minorHAnsi" w:hAnsiTheme="minorHAnsi" w:cstheme="minorHAnsi"/>
-          <w:sz w:val="22"/>
-          <w:szCs w:val="22"/>
-        </w:rPr>
-        <w:t>a huella de carbono de los centros de datos</w:t>
-      </w:r>
-      <w:r>
-        <w:rPr>
-          <w:rFonts w:asciiTheme="minorHAnsi" w:hAnsiTheme="minorHAnsi" w:cstheme="minorHAnsi"/>
-          <w:sz w:val="22"/>
-          <w:szCs w:val="22"/>
-        </w:rPr>
-        <w:t xml:space="preserve"> e</w:t>
-      </w:r>
-      <w:r>
-        <w:rPr>
-          <w:rFonts w:asciiTheme="minorHAnsi" w:hAnsiTheme="minorHAnsi" w:cstheme="minorHAnsi"/>
-          <w:sz w:val="22"/>
-          <w:szCs w:val="22"/>
-        </w:rPr>
-        <w:t>n consonancia con</w:t>
+        <w:t>los Objetivos de Desarrollo Sostenible</w:t>
+      </w:r>
+      <w:r>
+        <w:rPr>
+          <w:rFonts w:asciiTheme="minorHAnsi" w:hAnsiTheme="minorHAnsi" w:cstheme="minorHAnsi"/>
+          <w:sz w:val="22"/>
+          <w:szCs w:val="22"/>
+        </w:rPr>
+        <w:t xml:space="preserve">. </w:t>
+      </w:r>
+      <w:r>
+        <w:rPr>
+          <w:rFonts w:asciiTheme="minorHAnsi" w:hAnsiTheme="minorHAnsi" w:cstheme="minorHAnsi"/>
+          <w:sz w:val="22"/>
+          <w:szCs w:val="22"/>
+        </w:rPr>
+        <w:t xml:space="preserve">La reducción el consumo </w:t>
+      </w:r>
+      <w:r>
+        <w:rPr>
+          <w:rFonts w:asciiTheme="minorHAnsi" w:hAnsiTheme="minorHAnsi" w:cstheme="minorHAnsi"/>
+          <w:sz w:val="22"/>
+          <w:szCs w:val="22"/>
+        </w:rPr>
+        <w:t>energético</w:t>
       </w:r>
       <w:r>
         <w:rPr>
@@ -3819,31 +3638,39 @@
           <w:sz w:val="22"/>
           <w:szCs w:val="22"/>
         </w:rPr>
-        <w:t>los Objetivos de Desarrollo Sostenible</w:t>
-      </w:r>
-      <w:r>
-        <w:rPr>
-          <w:rFonts w:asciiTheme="minorHAnsi" w:hAnsiTheme="minorHAnsi" w:cstheme="minorHAnsi"/>
-          <w:sz w:val="22"/>
-          <w:szCs w:val="22"/>
-        </w:rPr>
-        <w:t xml:space="preserve">. </w:t>
-      </w:r>
-      <w:r>
-        <w:rPr>
-          <w:rFonts w:asciiTheme="minorHAnsi" w:hAnsiTheme="minorHAnsi" w:cstheme="minorHAnsi"/>
-          <w:sz w:val="22"/>
-          <w:szCs w:val="22"/>
-        </w:rPr>
-        <w:t xml:space="preserve">La reducción el consumo </w:t>
-      </w:r>
-      <w:r>
-        <w:rPr>
-          <w:rFonts w:asciiTheme="minorHAnsi" w:hAnsiTheme="minorHAnsi" w:cstheme="minorHAnsi"/>
-          <w:sz w:val="22"/>
-          <w:szCs w:val="22"/>
-        </w:rPr>
-        <w:t>energético</w:t>
+        <w:t xml:space="preserve">afecta directamente </w:t>
+      </w:r>
+      <w:r>
+        <w:rPr>
+          <w:rFonts w:asciiTheme="minorHAnsi" w:hAnsiTheme="minorHAnsi" w:cstheme="minorHAnsi"/>
+          <w:sz w:val="22"/>
+          <w:szCs w:val="22"/>
+        </w:rPr>
+        <w:t>en una disminución de los elevados costos operativos</w:t>
+      </w:r>
+      <w:r>
+        <w:rPr>
+          <w:rFonts w:asciiTheme="minorHAnsi" w:hAnsiTheme="minorHAnsi" w:cstheme="minorHAnsi"/>
+          <w:sz w:val="22"/>
+          <w:szCs w:val="22"/>
+        </w:rPr>
+        <w:t xml:space="preserve"> por los </w:t>
+      </w:r>
+      <w:r>
+        <w:rPr>
+          <w:rFonts w:asciiTheme="minorHAnsi" w:hAnsiTheme="minorHAnsi" w:cstheme="minorHAnsi"/>
+          <w:sz w:val="22"/>
+          <w:szCs w:val="22"/>
+        </w:rPr>
+        <w:t>proveedores de servicios en la nube</w:t>
+      </w:r>
+      <w:r>
+        <w:rPr>
+          <w:rFonts w:asciiTheme="minorHAnsi" w:hAnsiTheme="minorHAnsi" w:cstheme="minorHAnsi"/>
+          <w:sz w:val="22"/>
+          <w:szCs w:val="22"/>
+        </w:rPr>
+        <w:t>.</w:t>
       </w:r>
       <w:r>
         <w:rPr>
@@ -3859,81 +3686,7 @@
           <w:sz w:val="22"/>
           <w:szCs w:val="22"/>
         </w:rPr>
-        <w:t xml:space="preserve">afecta directamente </w:t>
-      </w:r>
-      <w:r>
-        <w:rPr>
-          <w:rFonts w:asciiTheme="minorHAnsi" w:hAnsiTheme="minorHAnsi" w:cstheme="minorHAnsi"/>
-          <w:sz w:val="22"/>
-          <w:szCs w:val="22"/>
-        </w:rPr>
-        <w:t>en una disminución de los elevados costos operativos</w:t>
-      </w:r>
-      <w:r>
-        <w:rPr>
-          <w:rFonts w:asciiTheme="minorHAnsi" w:hAnsiTheme="minorHAnsi" w:cstheme="minorHAnsi"/>
-          <w:sz w:val="22"/>
-          <w:szCs w:val="22"/>
-        </w:rPr>
-        <w:t xml:space="preserve"> por los </w:t>
-      </w:r>
-      <w:r>
-        <w:rPr>
-          <w:rFonts w:asciiTheme="minorHAnsi" w:hAnsiTheme="minorHAnsi" w:cstheme="minorHAnsi"/>
-          <w:sz w:val="22"/>
-          <w:szCs w:val="22"/>
-        </w:rPr>
-        <w:t>proveedores de servicios en la nube</w:t>
-      </w:r>
-      <w:r>
-        <w:rPr>
-          <w:rFonts w:asciiTheme="minorHAnsi" w:hAnsiTheme="minorHAnsi" w:cstheme="minorHAnsi"/>
-          <w:sz w:val="22"/>
-          <w:szCs w:val="22"/>
-        </w:rPr>
-        <w:t>.</w:t>
-      </w:r>
-      <w:r>
-        <w:rPr>
-          <w:rFonts w:asciiTheme="minorHAnsi" w:hAnsiTheme="minorHAnsi" w:cstheme="minorHAnsi"/>
-          <w:sz w:val="22"/>
-          <w:szCs w:val="22"/>
-        </w:rPr>
-        <w:t xml:space="preserve"> </w:t>
-      </w:r>
-      <w:r>
-        <w:rPr>
-          <w:rFonts w:asciiTheme="minorHAnsi" w:hAnsiTheme="minorHAnsi" w:cstheme="minorHAnsi"/>
-          <w:sz w:val="22"/>
-          <w:szCs w:val="22"/>
-        </w:rPr>
-        <w:t xml:space="preserve">[The Future </w:t>
-      </w:r>
-      <w:proofErr w:type="spellStart"/>
-      <w:r>
-        <w:rPr>
-          <w:rFonts w:asciiTheme="minorHAnsi" w:hAnsiTheme="minorHAnsi" w:cstheme="minorHAnsi"/>
-          <w:sz w:val="22"/>
-          <w:szCs w:val="22"/>
-        </w:rPr>
-        <w:t>of</w:t>
-      </w:r>
-      <w:proofErr w:type="spellEnd"/>
-      <w:r>
-        <w:rPr>
-          <w:rFonts w:asciiTheme="minorHAnsi" w:hAnsiTheme="minorHAnsi" w:cstheme="minorHAnsi"/>
-          <w:sz w:val="22"/>
-          <w:szCs w:val="22"/>
-        </w:rPr>
-        <w:t xml:space="preserve"> AI in Big Data]</w:t>
-      </w:r>
-      <w:r>
-        <w:rPr>
-          <w:rFonts w:asciiTheme="minorHAnsi" w:hAnsiTheme="minorHAnsi" w:cstheme="minorHAnsi"/>
-          <w:sz w:val="22"/>
-          <w:szCs w:val="22"/>
-        </w:rPr>
-        <w:t xml:space="preserve"> </w:t>
+        <w:t xml:space="preserve">[The Future of AI in Big Data] </w:t>
       </w:r>
       <w:r>
         <w:rPr>
@@ -4052,43 +3805,7 @@
           <w:sz w:val="22"/>
           <w:szCs w:val="22"/>
         </w:rPr>
-        <w:t xml:space="preserve">[The Role </w:t>
-      </w:r>
-      <w:proofErr w:type="spellStart"/>
-      <w:r>
-        <w:rPr>
-          <w:rFonts w:asciiTheme="minorHAnsi" w:hAnsiTheme="minorHAnsi" w:cstheme="minorHAnsi"/>
-          <w:sz w:val="22"/>
-          <w:szCs w:val="22"/>
-        </w:rPr>
-        <w:t>of</w:t>
-      </w:r>
-      <w:proofErr w:type="spellEnd"/>
-      <w:r>
-        <w:rPr>
-          <w:rFonts w:asciiTheme="minorHAnsi" w:hAnsiTheme="minorHAnsi" w:cstheme="minorHAnsi"/>
-          <w:sz w:val="22"/>
-          <w:szCs w:val="22"/>
-        </w:rPr>
-        <w:t xml:space="preserve"> Cloud Computing in Big Data </w:t>
-      </w:r>
-      <w:proofErr w:type="spellStart"/>
-      <w:r>
-        <w:rPr>
-          <w:rFonts w:asciiTheme="minorHAnsi" w:hAnsiTheme="minorHAnsi" w:cstheme="minorHAnsi"/>
-          <w:sz w:val="22"/>
-          <w:szCs w:val="22"/>
-        </w:rPr>
-        <w:t>Analytics</w:t>
-      </w:r>
-      <w:proofErr w:type="spellEnd"/>
-      <w:r>
-        <w:rPr>
-          <w:rFonts w:asciiTheme="minorHAnsi" w:hAnsiTheme="minorHAnsi" w:cstheme="minorHAnsi"/>
-          <w:sz w:val="22"/>
-          <w:szCs w:val="22"/>
-        </w:rPr>
-        <w:t>]</w:t>
+        <w:t>[The Role of Cloud Computing in Big Data Analytics]</w:t>
       </w:r>
     </w:p>
     <w:p>
@@ -4227,79 +3944,7 @@
           <w:sz w:val="22"/>
           <w:szCs w:val="22"/>
         </w:rPr>
-        <w:t xml:space="preserve">[Big data </w:t>
-      </w:r>
-      <w:proofErr w:type="spellStart"/>
-      <w:r>
-        <w:rPr>
-          <w:rFonts w:asciiTheme="minorHAnsi" w:hAnsiTheme="minorHAnsi" w:cstheme="minorHAnsi"/>
-          <w:sz w:val="22"/>
-          <w:szCs w:val="22"/>
-        </w:rPr>
-        <w:t>analytics</w:t>
-      </w:r>
-      <w:proofErr w:type="spellEnd"/>
-      <w:r>
-        <w:rPr>
-          <w:rFonts w:asciiTheme="minorHAnsi" w:hAnsiTheme="minorHAnsi" w:cstheme="minorHAnsi"/>
-          <w:sz w:val="22"/>
-          <w:szCs w:val="22"/>
-        </w:rPr>
-        <w:t xml:space="preserve"> in Cloud </w:t>
-      </w:r>
-      <w:proofErr w:type="spellStart"/>
-      <w:r>
-        <w:rPr>
-          <w:rFonts w:asciiTheme="minorHAnsi" w:hAnsiTheme="minorHAnsi" w:cstheme="minorHAnsi"/>
-          <w:sz w:val="22"/>
-          <w:szCs w:val="22"/>
-        </w:rPr>
-        <w:t>computing</w:t>
-      </w:r>
-      <w:proofErr w:type="spellEnd"/>
-      <w:r>
-        <w:rPr>
-          <w:rFonts w:asciiTheme="minorHAnsi" w:hAnsiTheme="minorHAnsi" w:cstheme="minorHAnsi"/>
-          <w:sz w:val="22"/>
-          <w:szCs w:val="22"/>
-        </w:rPr>
-        <w:t xml:space="preserve">: </w:t>
-      </w:r>
-      <w:proofErr w:type="spellStart"/>
-      <w:r>
-        <w:rPr>
-          <w:rFonts w:asciiTheme="minorHAnsi" w:hAnsiTheme="minorHAnsi" w:cstheme="minorHAnsi"/>
-          <w:sz w:val="22"/>
-          <w:szCs w:val="22"/>
-        </w:rPr>
-        <w:t>an</w:t>
-      </w:r>
-      <w:proofErr w:type="spellEnd"/>
-      <w:r>
-        <w:rPr>
-          <w:rFonts w:asciiTheme="minorHAnsi" w:hAnsiTheme="minorHAnsi" w:cstheme="minorHAnsi"/>
-          <w:sz w:val="22"/>
-          <w:szCs w:val="22"/>
-        </w:rPr>
-        <w:t xml:space="preserve"> </w:t>
-      </w:r>
-      <w:proofErr w:type="spellStart"/>
-      <w:r>
-        <w:rPr>
-          <w:rFonts w:asciiTheme="minorHAnsi" w:hAnsiTheme="minorHAnsi" w:cstheme="minorHAnsi"/>
-          <w:sz w:val="22"/>
-          <w:szCs w:val="22"/>
-        </w:rPr>
-        <w:t>overview</w:t>
-      </w:r>
-      <w:proofErr w:type="spellEnd"/>
-      <w:r>
-        <w:rPr>
-          <w:rFonts w:asciiTheme="minorHAnsi" w:hAnsiTheme="minorHAnsi" w:cstheme="minorHAnsi"/>
-          <w:sz w:val="22"/>
-          <w:szCs w:val="22"/>
-        </w:rPr>
-        <w:t>].</w:t>
+        <w:t>[Big data analytics in Cloud computing: an overview].</w:t>
       </w:r>
       <w:r>
         <w:rPr>
@@ -4378,43 +4023,7 @@
           <w:sz w:val="22"/>
           <w:szCs w:val="22"/>
         </w:rPr>
-        <w:t>[</w:t>
-      </w:r>
-      <w:proofErr w:type="spellStart"/>
-      <w:r>
-        <w:rPr>
-          <w:rFonts w:asciiTheme="minorHAnsi" w:hAnsiTheme="minorHAnsi" w:cstheme="minorHAnsi"/>
-          <w:sz w:val="22"/>
-          <w:szCs w:val="22"/>
-        </w:rPr>
-        <w:t>Applications</w:t>
-      </w:r>
-      <w:proofErr w:type="spellEnd"/>
-      <w:r>
-        <w:rPr>
-          <w:rFonts w:asciiTheme="minorHAnsi" w:hAnsiTheme="minorHAnsi" w:cstheme="minorHAnsi"/>
-          <w:sz w:val="22"/>
-          <w:szCs w:val="22"/>
-        </w:rPr>
-        <w:t xml:space="preserve"> </w:t>
-      </w:r>
-      <w:proofErr w:type="spellStart"/>
-      <w:r>
-        <w:rPr>
-          <w:rFonts w:asciiTheme="minorHAnsi" w:hAnsiTheme="minorHAnsi" w:cstheme="minorHAnsi"/>
-          <w:sz w:val="22"/>
-          <w:szCs w:val="22"/>
-        </w:rPr>
-        <w:t>of</w:t>
-      </w:r>
-      <w:proofErr w:type="spellEnd"/>
-      <w:r>
-        <w:rPr>
-          <w:rFonts w:asciiTheme="minorHAnsi" w:hAnsiTheme="minorHAnsi" w:cstheme="minorHAnsi"/>
-          <w:sz w:val="22"/>
-          <w:szCs w:val="22"/>
-        </w:rPr>
-        <w:t xml:space="preserve"> AI in Cloud Computing].</w:t>
+        <w:t>[Applications of AI in Cloud Computing].</w:t>
       </w:r>
       <w:r>
         <w:rPr>
@@ -4763,6 +4372,1301 @@
     </w:p>
     <w:p>
       <w:pPr>
+        <w:pStyle w:val="Ttulo11"/>
+        <w:pBdr>
+          <w:top w:val="single" w:sz="4" w:space="1" w:color="auto"/>
+        </w:pBdr>
+        <w:ind w:left="720"/>
+        <w:jc w:val="both"/>
+        <w:rPr>
+          <w:rFonts w:asciiTheme="minorHAnsi" w:eastAsia="Arial Unicode MS" w:hAnsiTheme="minorHAnsi" w:cstheme="minorHAnsi"/>
+          <w:b w:val="0"/>
+          <w:bCs w:val="0"/>
+          <w:color w:val="000000"/>
+          <w:kern w:val="0"/>
+          <w:u w:color="000000"/>
+          <w:lang w:val="es-ES_tradnl"/>
+        </w:rPr>
+      </w:pPr>
+      <w:r>
+        <w:rPr>
+          <w:rFonts w:asciiTheme="minorHAnsi" w:eastAsia="Arial Unicode MS" w:hAnsiTheme="minorHAnsi" w:cstheme="minorHAnsi"/>
+          <w:b w:val="0"/>
+          <w:bCs w:val="0"/>
+          <w:color w:val="000000"/>
+          <w:kern w:val="0"/>
+          <w:u w:color="000000"/>
+          <w:lang w:val="es-ES_tradnl"/>
+        </w:rPr>
+        <w:t>Este trabajo se base en aplicar el método experimental-desarrollador</w:t>
+      </w:r>
+      <w:r>
+        <w:rPr>
+          <w:rFonts w:asciiTheme="minorHAnsi" w:eastAsia="Arial Unicode MS" w:hAnsiTheme="minorHAnsi" w:cstheme="minorHAnsi"/>
+          <w:b w:val="0"/>
+          <w:bCs w:val="0"/>
+          <w:color w:val="000000"/>
+          <w:kern w:val="0"/>
+          <w:u w:color="000000"/>
+          <w:lang w:val="es-ES_tradnl"/>
+        </w:rPr>
+        <w:t xml:space="preserve"> que se enfoque </w:t>
+      </w:r>
+      <w:r>
+        <w:rPr>
+          <w:rFonts w:asciiTheme="minorHAnsi" w:eastAsia="Arial Unicode MS" w:hAnsiTheme="minorHAnsi" w:cstheme="minorHAnsi"/>
+          <w:b w:val="0"/>
+          <w:bCs w:val="0"/>
+          <w:color w:val="000000"/>
+          <w:kern w:val="0"/>
+          <w:u w:color="000000"/>
+          <w:lang w:val="es-ES_tradnl"/>
+        </w:rPr>
+        <w:t xml:space="preserve">en </w:t>
+      </w:r>
+      <w:r>
+        <w:rPr>
+          <w:rFonts w:asciiTheme="minorHAnsi" w:eastAsia="Arial Unicode MS" w:hAnsiTheme="minorHAnsi" w:cstheme="minorHAnsi"/>
+          <w:b w:val="0"/>
+          <w:bCs w:val="0"/>
+          <w:color w:val="000000"/>
+          <w:kern w:val="0"/>
+          <w:u w:color="000000"/>
+          <w:lang w:val="es-ES_tradnl"/>
+        </w:rPr>
+        <w:t>crear, d</w:t>
+      </w:r>
+      <w:r>
+        <w:rPr>
+          <w:rFonts w:asciiTheme="minorHAnsi" w:eastAsia="Arial Unicode MS" w:hAnsiTheme="minorHAnsi" w:cstheme="minorHAnsi"/>
+          <w:b w:val="0"/>
+          <w:bCs w:val="0"/>
+          <w:color w:val="000000"/>
+          <w:kern w:val="0"/>
+          <w:u w:color="000000"/>
+          <w:lang w:val="es-ES_tradnl"/>
+        </w:rPr>
+        <w:t xml:space="preserve">iseñar y modelar </w:t>
+      </w:r>
+      <w:r>
+        <w:rPr>
+          <w:rFonts w:asciiTheme="minorHAnsi" w:eastAsia="Arial Unicode MS" w:hAnsiTheme="minorHAnsi" w:cstheme="minorHAnsi"/>
+          <w:b w:val="0"/>
+          <w:bCs w:val="0"/>
+          <w:color w:val="000000"/>
+          <w:kern w:val="0"/>
+          <w:u w:color="000000"/>
+          <w:lang w:val="es-ES_tradnl"/>
+        </w:rPr>
+        <w:t xml:space="preserve">de algoritmos inteligentes y luego </w:t>
+      </w:r>
+      <w:r>
+        <w:rPr>
+          <w:rFonts w:asciiTheme="minorHAnsi" w:eastAsia="Arial Unicode MS" w:hAnsiTheme="minorHAnsi" w:cstheme="minorHAnsi"/>
+          <w:b w:val="0"/>
+          <w:bCs w:val="0"/>
+          <w:color w:val="000000"/>
+          <w:kern w:val="0"/>
+          <w:u w:color="000000"/>
+          <w:lang w:val="es-ES_tradnl"/>
+        </w:rPr>
+        <w:t>ha</w:t>
+      </w:r>
+      <w:r>
+        <w:rPr>
+          <w:rFonts w:asciiTheme="minorHAnsi" w:eastAsia="Arial Unicode MS" w:hAnsiTheme="minorHAnsi" w:cstheme="minorHAnsi"/>
+          <w:b w:val="0"/>
+          <w:bCs w:val="0"/>
+          <w:color w:val="000000"/>
+          <w:kern w:val="0"/>
+          <w:u w:color="000000"/>
+          <w:lang w:val="es-ES_tradnl"/>
+        </w:rPr>
+        <w:t xml:space="preserve">cer las pruebas necesarias para </w:t>
+      </w:r>
+      <w:r>
+        <w:rPr>
+          <w:rFonts w:asciiTheme="minorHAnsi" w:eastAsia="Arial Unicode MS" w:hAnsiTheme="minorHAnsi" w:cstheme="minorHAnsi"/>
+          <w:b w:val="0"/>
+          <w:bCs w:val="0"/>
+          <w:color w:val="000000"/>
+          <w:kern w:val="0"/>
+          <w:u w:color="000000"/>
+          <w:lang w:val="es-ES_tradnl"/>
+        </w:rPr>
+        <w:t>validar</w:t>
+      </w:r>
+      <w:r>
+        <w:rPr>
+          <w:rFonts w:asciiTheme="minorHAnsi" w:eastAsia="Arial Unicode MS" w:hAnsiTheme="minorHAnsi" w:cstheme="minorHAnsi"/>
+          <w:b w:val="0"/>
+          <w:bCs w:val="0"/>
+          <w:color w:val="000000"/>
+          <w:kern w:val="0"/>
+          <w:u w:color="000000"/>
+          <w:lang w:val="es-ES_tradnl"/>
+        </w:rPr>
+        <w:t xml:space="preserve"> y </w:t>
+      </w:r>
+      <w:r>
+        <w:rPr>
+          <w:rFonts w:asciiTheme="minorHAnsi" w:eastAsia="Arial Unicode MS" w:hAnsiTheme="minorHAnsi" w:cstheme="minorHAnsi"/>
+          <w:b w:val="0"/>
+          <w:bCs w:val="0"/>
+          <w:color w:val="000000"/>
+          <w:kern w:val="0"/>
+          <w:u w:color="000000"/>
+          <w:lang w:val="es-ES_tradnl"/>
+        </w:rPr>
+        <w:t>evaluar su eficacia en un entorno que simula condiciones reales</w:t>
+      </w:r>
+      <w:r>
+        <w:rPr>
+          <w:rFonts w:asciiTheme="minorHAnsi" w:eastAsia="Arial Unicode MS" w:hAnsiTheme="minorHAnsi" w:cstheme="minorHAnsi"/>
+          <w:b w:val="0"/>
+          <w:bCs w:val="0"/>
+          <w:color w:val="000000"/>
+          <w:kern w:val="0"/>
+          <w:u w:color="000000"/>
+          <w:lang w:val="es-ES_tradnl"/>
+        </w:rPr>
+        <w:t>,</w:t>
+      </w:r>
+      <w:r>
+        <w:rPr>
+          <w:rFonts w:asciiTheme="minorHAnsi" w:eastAsia="Arial Unicode MS" w:hAnsiTheme="minorHAnsi" w:cstheme="minorHAnsi"/>
+          <w:b w:val="0"/>
+          <w:bCs w:val="0"/>
+          <w:color w:val="000000"/>
+          <w:kern w:val="0"/>
+          <w:u w:color="000000"/>
+          <w:lang w:val="es-ES_tradnl"/>
+        </w:rPr>
+        <w:t xml:space="preserve"> </w:t>
+      </w:r>
+      <w:r>
+        <w:rPr>
+          <w:rFonts w:asciiTheme="minorHAnsi" w:eastAsia="Arial Unicode MS" w:hAnsiTheme="minorHAnsi" w:cstheme="minorHAnsi"/>
+          <w:b w:val="0"/>
+          <w:bCs w:val="0"/>
+          <w:color w:val="000000"/>
+          <w:kern w:val="0"/>
+          <w:u w:color="000000"/>
+          <w:lang w:val="es-ES_tradnl"/>
+        </w:rPr>
+        <w:t>este trabajo se describe de la siguiente manera</w:t>
+      </w:r>
+      <w:r>
+        <w:rPr>
+          <w:rFonts w:asciiTheme="minorHAnsi" w:eastAsia="Arial Unicode MS" w:hAnsiTheme="minorHAnsi" w:cstheme="minorHAnsi"/>
+          <w:b w:val="0"/>
+          <w:bCs w:val="0"/>
+          <w:color w:val="000000"/>
+          <w:kern w:val="0"/>
+          <w:u w:color="000000"/>
+          <w:lang w:val="es-ES_tradnl"/>
+        </w:rPr>
+        <w:t>:</w:t>
+      </w:r>
+    </w:p>
+    <w:p>
+      <w:pPr>
+        <w:pStyle w:val="Ttulo11"/>
+        <w:numPr>
+          <w:ilvl w:val="0"/>
+          <w:numId w:val="6"/>
+        </w:numPr>
+        <w:pBdr>
+          <w:top w:val="single" w:sz="4" w:space="1" w:color="auto"/>
+        </w:pBdr>
+        <w:jc w:val="both"/>
+        <w:rPr>
+          <w:rFonts w:asciiTheme="minorHAnsi" w:eastAsia="Arial Unicode MS" w:hAnsiTheme="minorHAnsi" w:cstheme="minorHAnsi"/>
+          <w:b w:val="0"/>
+          <w:bCs w:val="0"/>
+          <w:color w:val="000000"/>
+          <w:kern w:val="0"/>
+          <w:u w:color="000000"/>
+          <w:lang w:val="es-ES_tradnl"/>
+        </w:rPr>
+      </w:pPr>
+      <w:r>
+        <w:rPr>
+          <w:rFonts w:asciiTheme="minorHAnsi" w:eastAsia="Arial Unicode MS" w:hAnsiTheme="minorHAnsi" w:cstheme="minorHAnsi"/>
+          <w:b w:val="0"/>
+          <w:bCs w:val="0"/>
+          <w:color w:val="000000"/>
+          <w:kern w:val="0"/>
+          <w:u w:color="000000"/>
+          <w:lang w:val="es-ES_tradnl"/>
+        </w:rPr>
+        <w:t>Primera fase</w:t>
+      </w:r>
+      <w:r>
+        <w:rPr>
+          <w:rFonts w:asciiTheme="minorHAnsi" w:eastAsia="Arial Unicode MS" w:hAnsiTheme="minorHAnsi" w:cstheme="minorHAnsi"/>
+          <w:b w:val="0"/>
+          <w:bCs w:val="0"/>
+          <w:color w:val="000000"/>
+          <w:kern w:val="0"/>
+          <w:u w:color="000000"/>
+          <w:lang w:val="es-ES_tradnl"/>
+        </w:rPr>
+        <w:t xml:space="preserve"> </w:t>
+      </w:r>
+      <w:r>
+        <w:rPr>
+          <w:rFonts w:asciiTheme="minorHAnsi" w:eastAsia="Arial Unicode MS" w:hAnsiTheme="minorHAnsi" w:cstheme="minorHAnsi"/>
+          <w:b w:val="0"/>
+          <w:bCs w:val="0"/>
+          <w:color w:val="000000"/>
+          <w:kern w:val="0"/>
+          <w:u w:color="000000"/>
+          <w:lang w:val="es-ES_tradnl"/>
+        </w:rPr>
+        <w:t xml:space="preserve">la </w:t>
+      </w:r>
+      <w:r>
+        <w:rPr>
+          <w:rFonts w:asciiTheme="minorHAnsi" w:eastAsia="Arial Unicode MS" w:hAnsiTheme="minorHAnsi" w:cstheme="minorHAnsi"/>
+          <w:b w:val="0"/>
+          <w:bCs w:val="0"/>
+          <w:color w:val="000000"/>
+          <w:kern w:val="0"/>
+          <w:u w:color="000000"/>
+          <w:lang w:val="es-ES_tradnl"/>
+        </w:rPr>
+        <w:t>Recolección y análisis de datos</w:t>
+      </w:r>
+      <w:r>
+        <w:rPr>
+          <w:rFonts w:asciiTheme="minorHAnsi" w:eastAsia="Arial Unicode MS" w:hAnsiTheme="minorHAnsi" w:cstheme="minorHAnsi"/>
+          <w:b w:val="0"/>
+          <w:bCs w:val="0"/>
+          <w:color w:val="000000"/>
+          <w:kern w:val="0"/>
+          <w:u w:color="000000"/>
+          <w:lang w:val="es-ES_tradnl"/>
+        </w:rPr>
+        <w:t xml:space="preserve">: </w:t>
+      </w:r>
+      <w:r>
+        <w:rPr>
+          <w:rFonts w:asciiTheme="minorHAnsi" w:eastAsia="Arial Unicode MS" w:hAnsiTheme="minorHAnsi" w:cstheme="minorHAnsi"/>
+          <w:b w:val="0"/>
+          <w:bCs w:val="0"/>
+          <w:color w:val="000000"/>
+          <w:kern w:val="0"/>
+          <w:u w:color="000000"/>
+          <w:lang w:val="es-ES_tradnl"/>
+        </w:rPr>
+        <w:t>Identifica</w:t>
+      </w:r>
+      <w:r>
+        <w:rPr>
+          <w:rFonts w:asciiTheme="minorHAnsi" w:eastAsia="Arial Unicode MS" w:hAnsiTheme="minorHAnsi" w:cstheme="minorHAnsi"/>
+          <w:b w:val="0"/>
+          <w:bCs w:val="0"/>
+          <w:color w:val="000000"/>
+          <w:kern w:val="0"/>
+          <w:u w:color="000000"/>
+          <w:lang w:val="es-ES_tradnl"/>
+        </w:rPr>
+        <w:t>r</w:t>
+      </w:r>
+      <w:r>
+        <w:rPr>
+          <w:rFonts w:asciiTheme="minorHAnsi" w:eastAsia="Arial Unicode MS" w:hAnsiTheme="minorHAnsi" w:cstheme="minorHAnsi"/>
+          <w:b w:val="0"/>
+          <w:bCs w:val="0"/>
+          <w:color w:val="000000"/>
+          <w:kern w:val="0"/>
+          <w:u w:color="000000"/>
+          <w:lang w:val="es-ES_tradnl"/>
+        </w:rPr>
+        <w:t xml:space="preserve"> de las fuentes de datos</w:t>
+      </w:r>
+      <w:r>
+        <w:rPr>
+          <w:rFonts w:asciiTheme="minorHAnsi" w:eastAsia="Arial Unicode MS" w:hAnsiTheme="minorHAnsi" w:cstheme="minorHAnsi"/>
+          <w:b w:val="0"/>
+          <w:bCs w:val="0"/>
+          <w:color w:val="000000"/>
+          <w:kern w:val="0"/>
+          <w:u w:color="000000"/>
+          <w:lang w:val="es-ES_tradnl"/>
+        </w:rPr>
+        <w:t xml:space="preserve"> que </w:t>
+      </w:r>
+      <w:r>
+        <w:rPr>
+          <w:rFonts w:asciiTheme="minorHAnsi" w:eastAsia="Arial Unicode MS" w:hAnsiTheme="minorHAnsi" w:cstheme="minorHAnsi"/>
+          <w:b w:val="0"/>
+          <w:bCs w:val="0"/>
+          <w:color w:val="000000"/>
+          <w:kern w:val="0"/>
+          <w:u w:color="000000"/>
+          <w:lang w:val="es-ES_tradnl"/>
+        </w:rPr>
+        <w:t xml:space="preserve">vamos a usar conjuntos de datos abiertos </w:t>
+      </w:r>
+      <w:r>
+        <w:rPr>
+          <w:rFonts w:asciiTheme="minorHAnsi" w:eastAsia="Arial Unicode MS" w:hAnsiTheme="minorHAnsi" w:cstheme="minorHAnsi"/>
+          <w:b w:val="0"/>
+          <w:bCs w:val="0"/>
+          <w:color w:val="000000"/>
+          <w:kern w:val="0"/>
+          <w:u w:color="000000"/>
+          <w:lang w:val="es-ES_tradnl"/>
+        </w:rPr>
+        <w:t>confiable</w:t>
+      </w:r>
+      <w:r>
+        <w:rPr>
+          <w:rFonts w:asciiTheme="minorHAnsi" w:eastAsia="Arial Unicode MS" w:hAnsiTheme="minorHAnsi" w:cstheme="minorHAnsi"/>
+          <w:b w:val="0"/>
+          <w:bCs w:val="0"/>
+          <w:color w:val="000000"/>
+          <w:kern w:val="0"/>
+          <w:u w:color="000000"/>
+          <w:lang w:val="es-ES_tradnl"/>
+        </w:rPr>
+        <w:t>s.</w:t>
+      </w:r>
+      <w:r>
+        <w:rPr>
+          <w:rFonts w:asciiTheme="minorHAnsi" w:eastAsia="Arial Unicode MS" w:hAnsiTheme="minorHAnsi" w:cstheme="minorHAnsi"/>
+          <w:b w:val="0"/>
+          <w:bCs w:val="0"/>
+          <w:color w:val="000000"/>
+          <w:kern w:val="0"/>
+          <w:u w:color="000000"/>
+          <w:lang w:val="es-ES_tradnl"/>
+        </w:rPr>
+        <w:t xml:space="preserve"> Y haremos el p</w:t>
+      </w:r>
+      <w:r>
+        <w:rPr>
+          <w:rFonts w:asciiTheme="minorHAnsi" w:eastAsia="Arial Unicode MS" w:hAnsiTheme="minorHAnsi" w:cstheme="minorHAnsi"/>
+          <w:b w:val="0"/>
+          <w:bCs w:val="0"/>
+          <w:color w:val="000000"/>
+          <w:kern w:val="0"/>
+          <w:u w:color="000000"/>
+          <w:lang w:val="es-ES_tradnl"/>
+        </w:rPr>
+        <w:t>rocesamiento de datos</w:t>
+      </w:r>
+      <w:r>
+        <w:rPr>
+          <w:rFonts w:asciiTheme="minorHAnsi" w:eastAsia="Arial Unicode MS" w:hAnsiTheme="minorHAnsi" w:cstheme="minorHAnsi"/>
+          <w:b w:val="0"/>
+          <w:bCs w:val="0"/>
+          <w:color w:val="000000"/>
+          <w:kern w:val="0"/>
+          <w:u w:color="000000"/>
+          <w:lang w:val="es-ES_tradnl"/>
+        </w:rPr>
+        <w:t xml:space="preserve"> limpiar los datos </w:t>
+      </w:r>
+      <w:r>
+        <w:rPr>
+          <w:rFonts w:asciiTheme="minorHAnsi" w:eastAsia="Arial Unicode MS" w:hAnsiTheme="minorHAnsi" w:cstheme="minorHAnsi"/>
+          <w:b w:val="0"/>
+          <w:bCs w:val="0"/>
+          <w:color w:val="000000"/>
+          <w:kern w:val="0"/>
+          <w:u w:color="000000"/>
+          <w:lang w:val="es-ES_tradnl"/>
+        </w:rPr>
+        <w:t xml:space="preserve">y </w:t>
+      </w:r>
+      <w:r>
+        <w:rPr>
+          <w:rFonts w:asciiTheme="minorHAnsi" w:eastAsia="Arial Unicode MS" w:hAnsiTheme="minorHAnsi" w:cstheme="minorHAnsi"/>
+          <w:b w:val="0"/>
+          <w:bCs w:val="0"/>
+          <w:color w:val="000000"/>
+          <w:kern w:val="0"/>
+          <w:u w:color="000000"/>
+          <w:lang w:val="es-ES_tradnl"/>
+        </w:rPr>
+        <w:t>transforma</w:t>
+      </w:r>
+      <w:r>
+        <w:rPr>
+          <w:rFonts w:asciiTheme="minorHAnsi" w:eastAsia="Arial Unicode MS" w:hAnsiTheme="minorHAnsi" w:cstheme="minorHAnsi"/>
+          <w:b w:val="0"/>
+          <w:bCs w:val="0"/>
+          <w:color w:val="000000"/>
+          <w:kern w:val="0"/>
+          <w:u w:color="000000"/>
+          <w:lang w:val="es-ES_tradnl"/>
+        </w:rPr>
+        <w:t xml:space="preserve">rlos </w:t>
+      </w:r>
+      <w:r>
+        <w:rPr>
+          <w:rFonts w:asciiTheme="minorHAnsi" w:eastAsia="Arial Unicode MS" w:hAnsiTheme="minorHAnsi" w:cstheme="minorHAnsi"/>
+          <w:b w:val="0"/>
+          <w:bCs w:val="0"/>
+          <w:color w:val="000000"/>
+          <w:kern w:val="0"/>
+          <w:u w:color="000000"/>
+          <w:lang w:val="es-ES_tradnl"/>
+        </w:rPr>
+        <w:t>en formatos analizables</w:t>
+      </w:r>
+      <w:r>
+        <w:rPr>
+          <w:rFonts w:asciiTheme="minorHAnsi" w:eastAsia="Arial Unicode MS" w:hAnsiTheme="minorHAnsi" w:cstheme="minorHAnsi"/>
+          <w:b w:val="0"/>
+          <w:bCs w:val="0"/>
+          <w:color w:val="000000"/>
+          <w:kern w:val="0"/>
+          <w:u w:color="000000"/>
+          <w:lang w:val="es-ES_tradnl"/>
+        </w:rPr>
+        <w:t xml:space="preserve"> para descubrir los patrones históricos </w:t>
+      </w:r>
+      <w:r>
+        <w:rPr>
+          <w:rFonts w:asciiTheme="minorHAnsi" w:eastAsia="Arial Unicode MS" w:hAnsiTheme="minorHAnsi" w:cstheme="minorHAnsi"/>
+          <w:b w:val="0"/>
+          <w:bCs w:val="0"/>
+          <w:color w:val="000000"/>
+          <w:kern w:val="0"/>
+          <w:u w:color="000000"/>
+          <w:lang w:val="es-ES_tradnl"/>
+        </w:rPr>
+        <w:t>del consumo de los recursos.</w:t>
+      </w:r>
+    </w:p>
+    <w:p>
+      <w:pPr>
+        <w:pStyle w:val="Ttulo11"/>
+        <w:numPr>
+          <w:ilvl w:val="0"/>
+          <w:numId w:val="6"/>
+        </w:numPr>
+        <w:pBdr>
+          <w:top w:val="single" w:sz="4" w:space="1" w:color="auto"/>
+        </w:pBdr>
+        <w:jc w:val="both"/>
+        <w:rPr>
+          <w:rFonts w:asciiTheme="minorHAnsi" w:eastAsia="Arial Unicode MS" w:hAnsiTheme="minorHAnsi" w:cstheme="minorHAnsi"/>
+          <w:b w:val="0"/>
+          <w:bCs w:val="0"/>
+          <w:color w:val="000000"/>
+          <w:kern w:val="0"/>
+          <w:u w:color="000000"/>
+          <w:lang w:val="es-ES_tradnl"/>
+        </w:rPr>
+      </w:pPr>
+      <w:r>
+        <w:rPr>
+          <w:rFonts w:asciiTheme="minorHAnsi" w:eastAsia="Arial Unicode MS" w:hAnsiTheme="minorHAnsi" w:cstheme="minorHAnsi"/>
+          <w:b w:val="0"/>
+          <w:bCs w:val="0"/>
+          <w:color w:val="000000"/>
+          <w:kern w:val="0"/>
+          <w:u w:color="000000"/>
+          <w:lang w:val="es-ES_tradnl"/>
+        </w:rPr>
+        <w:t xml:space="preserve">Segunda fase </w:t>
+      </w:r>
+      <w:r>
+        <w:rPr>
+          <w:rFonts w:asciiTheme="minorHAnsi" w:eastAsia="Arial Unicode MS" w:hAnsiTheme="minorHAnsi" w:cstheme="minorHAnsi"/>
+          <w:b w:val="0"/>
+          <w:bCs w:val="0"/>
+          <w:color w:val="000000"/>
+          <w:kern w:val="0"/>
+          <w:u w:color="000000"/>
+          <w:lang w:val="es-ES_tradnl"/>
+        </w:rPr>
+        <w:t xml:space="preserve">el </w:t>
+      </w:r>
+      <w:r>
+        <w:rPr>
+          <w:rFonts w:asciiTheme="minorHAnsi" w:eastAsia="Arial Unicode MS" w:hAnsiTheme="minorHAnsi" w:cstheme="minorHAnsi"/>
+          <w:b w:val="0"/>
+          <w:bCs w:val="0"/>
+          <w:color w:val="000000"/>
+          <w:kern w:val="0"/>
+          <w:u w:color="000000"/>
+          <w:lang w:val="es-ES_tradnl"/>
+        </w:rPr>
+        <w:t>diseñ</w:t>
+      </w:r>
+      <w:r>
+        <w:rPr>
+          <w:rFonts w:asciiTheme="minorHAnsi" w:eastAsia="Arial Unicode MS" w:hAnsiTheme="minorHAnsi" w:cstheme="minorHAnsi"/>
+          <w:b w:val="0"/>
+          <w:bCs w:val="0"/>
+          <w:color w:val="000000"/>
+          <w:kern w:val="0"/>
+          <w:u w:color="000000"/>
+          <w:lang w:val="es-ES_tradnl"/>
+        </w:rPr>
+        <w:t>o</w:t>
+      </w:r>
+      <w:r>
+        <w:rPr>
+          <w:rFonts w:asciiTheme="minorHAnsi" w:eastAsia="Arial Unicode MS" w:hAnsiTheme="minorHAnsi" w:cstheme="minorHAnsi"/>
+          <w:b w:val="0"/>
+          <w:bCs w:val="0"/>
+          <w:color w:val="000000"/>
+          <w:kern w:val="0"/>
+          <w:u w:color="000000"/>
+          <w:lang w:val="es-ES_tradnl"/>
+        </w:rPr>
+        <w:t xml:space="preserve"> </w:t>
+      </w:r>
+      <w:r>
+        <w:rPr>
+          <w:rFonts w:asciiTheme="minorHAnsi" w:eastAsia="Arial Unicode MS" w:hAnsiTheme="minorHAnsi" w:cstheme="minorHAnsi"/>
+          <w:b w:val="0"/>
+          <w:bCs w:val="0"/>
+          <w:color w:val="000000"/>
+          <w:kern w:val="0"/>
+          <w:u w:color="000000"/>
+          <w:lang w:val="es-ES_tradnl"/>
+        </w:rPr>
+        <w:t>d</w:t>
+      </w:r>
+      <w:r>
+        <w:rPr>
+          <w:rFonts w:asciiTheme="minorHAnsi" w:eastAsia="Arial Unicode MS" w:hAnsiTheme="minorHAnsi" w:cstheme="minorHAnsi"/>
+          <w:b w:val="0"/>
+          <w:bCs w:val="0"/>
+          <w:color w:val="000000"/>
+          <w:kern w:val="0"/>
+          <w:u w:color="000000"/>
+          <w:lang w:val="es-ES_tradnl"/>
+        </w:rPr>
+        <w:t>e</w:t>
+      </w:r>
+      <w:r>
+        <w:rPr>
+          <w:rFonts w:asciiTheme="minorHAnsi" w:eastAsia="Arial Unicode MS" w:hAnsiTheme="minorHAnsi" w:cstheme="minorHAnsi"/>
+          <w:b w:val="0"/>
+          <w:bCs w:val="0"/>
+          <w:color w:val="000000"/>
+          <w:kern w:val="0"/>
+          <w:u w:color="000000"/>
+          <w:lang w:val="es-ES_tradnl"/>
+        </w:rPr>
+        <w:t xml:space="preserve">l </w:t>
+      </w:r>
+      <w:r>
+        <w:rPr>
+          <w:rFonts w:asciiTheme="minorHAnsi" w:eastAsia="Arial Unicode MS" w:hAnsiTheme="minorHAnsi" w:cstheme="minorHAnsi"/>
+          <w:b w:val="0"/>
+          <w:bCs w:val="0"/>
+          <w:color w:val="000000"/>
+          <w:kern w:val="0"/>
+          <w:u w:color="000000"/>
+          <w:lang w:val="es-ES_tradnl"/>
+        </w:rPr>
+        <w:t>modelo de predicción</w:t>
+      </w:r>
+      <w:r>
+        <w:rPr>
+          <w:rFonts w:asciiTheme="minorHAnsi" w:eastAsia="Arial Unicode MS" w:hAnsiTheme="minorHAnsi" w:cstheme="minorHAnsi"/>
+          <w:b w:val="0"/>
+          <w:bCs w:val="0"/>
+          <w:color w:val="000000"/>
+          <w:kern w:val="0"/>
+          <w:u w:color="000000"/>
+          <w:lang w:val="es-ES_tradnl"/>
+        </w:rPr>
+        <w:t xml:space="preserve">: </w:t>
+      </w:r>
+      <w:r>
+        <w:rPr>
+          <w:rFonts w:asciiTheme="minorHAnsi" w:eastAsia="Arial Unicode MS" w:hAnsiTheme="minorHAnsi" w:cstheme="minorHAnsi"/>
+          <w:b w:val="0"/>
+          <w:bCs w:val="0"/>
+          <w:color w:val="000000"/>
+          <w:kern w:val="0"/>
+          <w:u w:color="000000"/>
+          <w:lang w:val="es-ES_tradnl"/>
+        </w:rPr>
+        <w:t xml:space="preserve">elegir </w:t>
+      </w:r>
+      <w:r>
+        <w:rPr>
+          <w:rFonts w:asciiTheme="minorHAnsi" w:eastAsia="Arial Unicode MS" w:hAnsiTheme="minorHAnsi" w:cstheme="minorHAnsi"/>
+          <w:b w:val="0"/>
+          <w:bCs w:val="0"/>
+          <w:color w:val="000000"/>
+          <w:kern w:val="0"/>
+          <w:u w:color="000000"/>
+          <w:lang w:val="es-ES_tradnl"/>
+        </w:rPr>
+        <w:t>algoritmos adecuados</w:t>
+      </w:r>
+      <w:r>
+        <w:rPr>
+          <w:rFonts w:asciiTheme="minorHAnsi" w:eastAsia="Arial Unicode MS" w:hAnsiTheme="minorHAnsi" w:cstheme="minorHAnsi"/>
+          <w:b w:val="0"/>
+          <w:bCs w:val="0"/>
+          <w:color w:val="000000"/>
+          <w:kern w:val="0"/>
+          <w:u w:color="000000"/>
+          <w:lang w:val="es-ES_tradnl"/>
+        </w:rPr>
+        <w:t xml:space="preserve"> </w:t>
+      </w:r>
+      <w:r>
+        <w:rPr>
+          <w:rFonts w:asciiTheme="minorHAnsi" w:eastAsia="Arial Unicode MS" w:hAnsiTheme="minorHAnsi" w:cstheme="minorHAnsi"/>
+          <w:b w:val="0"/>
+          <w:bCs w:val="0"/>
+          <w:color w:val="000000"/>
+          <w:kern w:val="0"/>
+          <w:u w:color="000000"/>
+          <w:lang w:val="es-ES_tradnl"/>
+        </w:rPr>
+        <w:t xml:space="preserve">que vamos a crear un modelo </w:t>
+      </w:r>
+      <w:r>
+        <w:rPr>
+          <w:rFonts w:asciiTheme="minorHAnsi" w:eastAsia="Arial Unicode MS" w:hAnsiTheme="minorHAnsi" w:cstheme="minorHAnsi"/>
+          <w:b w:val="0"/>
+          <w:bCs w:val="0"/>
+          <w:color w:val="000000"/>
+          <w:kern w:val="0"/>
+          <w:u w:color="000000"/>
+          <w:lang w:val="es-ES_tradnl"/>
+        </w:rPr>
+        <w:t xml:space="preserve">que se base en aprendizaje profunda </w:t>
+      </w:r>
+      <w:r>
+        <w:rPr>
+          <w:rFonts w:asciiTheme="minorHAnsi" w:eastAsia="Arial Unicode MS" w:hAnsiTheme="minorHAnsi" w:cstheme="minorHAnsi"/>
+          <w:b w:val="0"/>
+          <w:bCs w:val="0"/>
+          <w:color w:val="000000"/>
+          <w:kern w:val="0"/>
+          <w:u w:color="000000"/>
+          <w:lang w:val="es-ES_tradnl"/>
+        </w:rPr>
+        <w:t>o las redes neuronales</w:t>
+      </w:r>
+      <w:r>
+        <w:rPr>
+          <w:rFonts w:asciiTheme="minorHAnsi" w:eastAsia="Arial Unicode MS" w:hAnsiTheme="minorHAnsi" w:cstheme="minorHAnsi"/>
+          <w:b w:val="0"/>
+          <w:bCs w:val="0"/>
+          <w:color w:val="000000"/>
+          <w:kern w:val="0"/>
+          <w:u w:color="000000"/>
+          <w:lang w:val="es-ES_tradnl"/>
+        </w:rPr>
+        <w:t xml:space="preserve"> por su potencia elevada </w:t>
+      </w:r>
+      <w:r>
+        <w:rPr>
+          <w:rFonts w:asciiTheme="minorHAnsi" w:eastAsia="Arial Unicode MS" w:hAnsiTheme="minorHAnsi" w:cstheme="minorHAnsi"/>
+          <w:b w:val="0"/>
+          <w:bCs w:val="0"/>
+          <w:color w:val="000000"/>
+          <w:kern w:val="0"/>
+          <w:u w:color="000000"/>
+          <w:lang w:val="es-ES_tradnl"/>
+        </w:rPr>
+        <w:t xml:space="preserve">de predecir </w:t>
+      </w:r>
+      <w:r>
+        <w:rPr>
+          <w:rFonts w:asciiTheme="minorHAnsi" w:eastAsia="Arial Unicode MS" w:hAnsiTheme="minorHAnsi" w:cstheme="minorHAnsi"/>
+          <w:b w:val="0"/>
+          <w:bCs w:val="0"/>
+          <w:color w:val="000000"/>
+          <w:kern w:val="0"/>
+          <w:u w:color="000000"/>
+          <w:lang w:val="es-ES_tradnl"/>
+        </w:rPr>
+        <w:t>de series de tiempo para (workload pattrens)</w:t>
+      </w:r>
+      <w:r>
+        <w:rPr>
+          <w:rFonts w:asciiTheme="minorHAnsi" w:eastAsia="Arial Unicode MS" w:hAnsiTheme="minorHAnsi" w:cstheme="minorHAnsi"/>
+          <w:b w:val="0"/>
+          <w:bCs w:val="0"/>
+          <w:color w:val="000000"/>
+          <w:kern w:val="0"/>
+          <w:u w:color="000000"/>
+          <w:lang w:val="es-ES_tradnl"/>
+        </w:rPr>
+        <w:t xml:space="preserve">. </w:t>
+      </w:r>
+      <w:r>
+        <w:rPr>
+          <w:rFonts w:asciiTheme="minorHAnsi" w:eastAsia="Arial Unicode MS" w:hAnsiTheme="minorHAnsi" w:cstheme="minorHAnsi"/>
+          <w:b w:val="0"/>
+          <w:bCs w:val="0"/>
+          <w:color w:val="000000"/>
+          <w:kern w:val="0"/>
+          <w:u w:color="000000"/>
+          <w:lang w:val="es-ES_tradnl"/>
+        </w:rPr>
+        <w:t xml:space="preserve">usaremos los datos </w:t>
+      </w:r>
+      <w:r>
+        <w:rPr>
+          <w:rFonts w:asciiTheme="minorHAnsi" w:eastAsia="Arial Unicode MS" w:hAnsiTheme="minorHAnsi" w:cstheme="minorHAnsi"/>
+          <w:b w:val="0"/>
+          <w:bCs w:val="0"/>
+          <w:color w:val="000000"/>
+          <w:kern w:val="0"/>
+          <w:u w:color="000000"/>
+          <w:lang w:val="es-ES_tradnl"/>
+        </w:rPr>
+        <w:t xml:space="preserve">históricos </w:t>
+      </w:r>
+      <w:r>
+        <w:rPr>
+          <w:rFonts w:asciiTheme="minorHAnsi" w:eastAsia="Arial Unicode MS" w:hAnsiTheme="minorHAnsi" w:cstheme="minorHAnsi"/>
+          <w:b w:val="0"/>
+          <w:bCs w:val="0"/>
+          <w:color w:val="000000"/>
+          <w:kern w:val="0"/>
+          <w:u w:color="000000"/>
+          <w:lang w:val="es-ES_tradnl"/>
+        </w:rPr>
+        <w:t>en</w:t>
+      </w:r>
+      <w:r>
+        <w:rPr>
+          <w:rFonts w:asciiTheme="minorHAnsi" w:eastAsia="Arial Unicode MS" w:hAnsiTheme="minorHAnsi" w:cstheme="minorHAnsi"/>
+          <w:b w:val="0"/>
+          <w:bCs w:val="0"/>
+          <w:color w:val="000000"/>
+          <w:kern w:val="0"/>
+          <w:u w:color="000000"/>
+          <w:lang w:val="es-ES_tradnl"/>
+        </w:rPr>
+        <w:t xml:space="preserve"> el entrenamiento del modelo</w:t>
+      </w:r>
+      <w:r>
+        <w:rPr>
+          <w:rFonts w:asciiTheme="minorHAnsi" w:eastAsia="Arial Unicode MS" w:hAnsiTheme="minorHAnsi" w:cstheme="minorHAnsi"/>
+          <w:b w:val="0"/>
+          <w:bCs w:val="0"/>
+          <w:color w:val="000000"/>
+          <w:kern w:val="0"/>
+          <w:u w:color="000000"/>
+          <w:lang w:val="es-ES_tradnl"/>
+        </w:rPr>
+        <w:t xml:space="preserve"> </w:t>
+      </w:r>
+      <w:r>
+        <w:rPr>
+          <w:rFonts w:asciiTheme="minorHAnsi" w:eastAsia="Arial Unicode MS" w:hAnsiTheme="minorHAnsi" w:cstheme="minorHAnsi"/>
+          <w:b w:val="0"/>
+          <w:bCs w:val="0"/>
+          <w:color w:val="000000"/>
+          <w:kern w:val="0"/>
+          <w:u w:color="000000"/>
+          <w:lang w:val="es-ES_tradnl"/>
+        </w:rPr>
+        <w:t xml:space="preserve">para </w:t>
+      </w:r>
+      <w:r>
+        <w:rPr>
+          <w:rFonts w:asciiTheme="minorHAnsi" w:eastAsia="Arial Unicode MS" w:hAnsiTheme="minorHAnsi" w:cstheme="minorHAnsi"/>
+          <w:b w:val="0"/>
+          <w:bCs w:val="0"/>
+          <w:color w:val="000000"/>
+          <w:kern w:val="0"/>
+          <w:u w:color="000000"/>
+          <w:lang w:val="es-ES_tradnl"/>
+        </w:rPr>
+        <w:t>predecir (peak times) 'periodos de inactividad' (idle times) en la demanda de datos.</w:t>
+      </w:r>
+    </w:p>
+    <w:p>
+      <w:pPr>
+        <w:pStyle w:val="Ttulo11"/>
+        <w:numPr>
+          <w:ilvl w:val="0"/>
+          <w:numId w:val="6"/>
+        </w:numPr>
+        <w:pBdr>
+          <w:top w:val="single" w:sz="4" w:space="1" w:color="auto"/>
+        </w:pBdr>
+        <w:jc w:val="both"/>
+        <w:rPr>
+          <w:rFonts w:asciiTheme="minorHAnsi" w:eastAsia="Arial Unicode MS" w:hAnsiTheme="minorHAnsi" w:cstheme="minorHAnsi"/>
+          <w:b w:val="0"/>
+          <w:bCs w:val="0"/>
+          <w:color w:val="000000"/>
+          <w:kern w:val="0"/>
+          <w:u w:color="000000"/>
+          <w:lang w:val="es-ES_tradnl"/>
+        </w:rPr>
+      </w:pPr>
+      <w:r>
+        <w:rPr>
+          <w:rFonts w:asciiTheme="minorHAnsi" w:eastAsia="Arial Unicode MS" w:hAnsiTheme="minorHAnsi" w:cstheme="minorHAnsi"/>
+          <w:b w:val="0"/>
+          <w:bCs w:val="0"/>
+          <w:color w:val="000000"/>
+          <w:kern w:val="0"/>
+          <w:u w:color="000000"/>
+          <w:lang w:val="es-ES_tradnl"/>
+        </w:rPr>
+        <w:t xml:space="preserve">Tercera fase la </w:t>
+      </w:r>
+      <w:r>
+        <w:rPr>
+          <w:rFonts w:asciiTheme="minorHAnsi" w:eastAsia="Arial Unicode MS" w:hAnsiTheme="minorHAnsi" w:cstheme="minorHAnsi"/>
+          <w:b w:val="0"/>
+          <w:bCs w:val="0"/>
+          <w:color w:val="000000"/>
+          <w:kern w:val="0"/>
+          <w:u w:color="000000"/>
+          <w:lang w:val="es-ES_tradnl"/>
+        </w:rPr>
+        <w:t xml:space="preserve">simulación y los entornos: </w:t>
+      </w:r>
+      <w:r>
+        <w:rPr>
+          <w:rFonts w:asciiTheme="minorHAnsi" w:eastAsia="Arial Unicode MS" w:hAnsiTheme="minorHAnsi" w:cstheme="minorHAnsi"/>
+          <w:b w:val="0"/>
+          <w:bCs w:val="0"/>
+          <w:color w:val="000000"/>
+          <w:kern w:val="0"/>
+          <w:u w:color="000000"/>
+          <w:lang w:val="es-ES_tradnl"/>
+        </w:rPr>
+        <w:t xml:space="preserve">por la dificultad </w:t>
+      </w:r>
+      <w:r>
+        <w:rPr>
+          <w:rFonts w:asciiTheme="minorHAnsi" w:eastAsia="Arial Unicode MS" w:hAnsiTheme="minorHAnsi" w:cstheme="minorHAnsi"/>
+          <w:b w:val="0"/>
+          <w:bCs w:val="0"/>
+          <w:color w:val="000000"/>
+          <w:kern w:val="0"/>
+          <w:u w:color="000000"/>
+          <w:lang w:val="es-ES_tradnl"/>
+        </w:rPr>
+        <w:t>ir presencialmente a los centros de datos</w:t>
+      </w:r>
+      <w:r>
+        <w:rPr>
+          <w:rFonts w:asciiTheme="minorHAnsi" w:eastAsia="Arial Unicode MS" w:hAnsiTheme="minorHAnsi" w:cstheme="minorHAnsi"/>
+          <w:b w:val="0"/>
+          <w:bCs w:val="0"/>
+          <w:color w:val="000000"/>
+          <w:kern w:val="0"/>
+          <w:u w:color="000000"/>
+          <w:lang w:val="es-ES_tradnl"/>
+        </w:rPr>
+        <w:t xml:space="preserve">, usaremos herramientas de </w:t>
+      </w:r>
+      <w:r>
+        <w:rPr>
+          <w:rFonts w:asciiTheme="minorHAnsi" w:eastAsia="Arial Unicode MS" w:hAnsiTheme="minorHAnsi" w:cstheme="minorHAnsi"/>
+          <w:b w:val="0"/>
+          <w:bCs w:val="0"/>
+          <w:color w:val="000000"/>
+          <w:kern w:val="0"/>
+          <w:u w:color="000000"/>
+          <w:lang w:val="es-ES_tradnl"/>
+        </w:rPr>
+        <w:t>simulación</w:t>
+      </w:r>
+      <w:r>
+        <w:rPr>
+          <w:rFonts w:asciiTheme="minorHAnsi" w:eastAsia="Arial Unicode MS" w:hAnsiTheme="minorHAnsi" w:cstheme="minorHAnsi"/>
+          <w:b w:val="0"/>
+          <w:bCs w:val="0"/>
+          <w:color w:val="000000"/>
+          <w:kern w:val="0"/>
+          <w:u w:color="000000"/>
+          <w:lang w:val="es-ES_tradnl"/>
+        </w:rPr>
+        <w:t xml:space="preserve"> como </w:t>
+      </w:r>
+      <w:r>
+        <w:rPr>
+          <w:rFonts w:asciiTheme="minorHAnsi" w:eastAsia="Arial Unicode MS" w:hAnsiTheme="minorHAnsi" w:cstheme="minorHAnsi"/>
+          <w:b w:val="0"/>
+          <w:bCs w:val="0"/>
+          <w:color w:val="000000"/>
+          <w:kern w:val="0"/>
+          <w:u w:color="000000"/>
+          <w:lang w:val="es-ES_tradnl"/>
+        </w:rPr>
+        <w:t>C</w:t>
+      </w:r>
+      <w:r>
+        <w:rPr>
+          <w:rFonts w:asciiTheme="minorHAnsi" w:eastAsia="Arial Unicode MS" w:hAnsiTheme="minorHAnsi" w:cstheme="minorHAnsi"/>
+          <w:b w:val="0"/>
+          <w:bCs w:val="0"/>
+          <w:color w:val="000000"/>
+          <w:kern w:val="0"/>
+          <w:u w:color="000000"/>
+          <w:lang w:val="es-ES_tradnl"/>
+        </w:rPr>
+        <w:t>loudsim</w:t>
+      </w:r>
+      <w:r>
+        <w:rPr>
+          <w:rFonts w:asciiTheme="minorHAnsi" w:eastAsia="Arial Unicode MS" w:hAnsiTheme="minorHAnsi" w:cstheme="minorHAnsi"/>
+          <w:b w:val="0"/>
+          <w:bCs w:val="0"/>
+          <w:color w:val="000000"/>
+          <w:kern w:val="0"/>
+          <w:u w:color="000000"/>
+          <w:lang w:val="es-ES_tradnl"/>
+        </w:rPr>
+        <w:t xml:space="preserve"> o </w:t>
+      </w:r>
+      <w:r>
+        <w:rPr>
+          <w:rFonts w:asciiTheme="minorHAnsi" w:eastAsia="Arial Unicode MS" w:hAnsiTheme="minorHAnsi" w:cstheme="minorHAnsi"/>
+          <w:b w:val="0"/>
+          <w:bCs w:val="0"/>
+          <w:color w:val="000000"/>
+          <w:kern w:val="0"/>
+          <w:u w:color="000000"/>
+          <w:lang w:val="es-ES_tradnl"/>
+        </w:rPr>
+        <w:t>iFogSim</w:t>
+      </w:r>
+      <w:r>
+        <w:rPr>
+          <w:rFonts w:asciiTheme="minorHAnsi" w:eastAsia="Arial Unicode MS" w:hAnsiTheme="minorHAnsi" w:cstheme="minorHAnsi"/>
+          <w:b w:val="0"/>
+          <w:bCs w:val="0"/>
+          <w:color w:val="000000"/>
+          <w:kern w:val="0"/>
+          <w:u w:color="000000"/>
+          <w:lang w:val="es-ES_tradnl"/>
+        </w:rPr>
+        <w:t xml:space="preserve"> para co</w:t>
+      </w:r>
+      <w:r>
+        <w:rPr>
+          <w:rFonts w:asciiTheme="minorHAnsi" w:eastAsia="Arial Unicode MS" w:hAnsiTheme="minorHAnsi" w:cstheme="minorHAnsi"/>
+          <w:b w:val="0"/>
+          <w:bCs w:val="0"/>
+          <w:color w:val="000000"/>
+          <w:kern w:val="0"/>
+          <w:u w:color="000000"/>
+          <w:lang w:val="es-ES_tradnl"/>
+        </w:rPr>
+        <w:t xml:space="preserve">nstruir entornos de </w:t>
+      </w:r>
+      <w:r>
+        <w:rPr>
+          <w:rFonts w:asciiTheme="minorHAnsi" w:eastAsia="Arial Unicode MS" w:hAnsiTheme="minorHAnsi" w:cstheme="minorHAnsi"/>
+          <w:b w:val="0"/>
+          <w:bCs w:val="0"/>
+          <w:color w:val="000000"/>
+          <w:kern w:val="0"/>
+          <w:u w:color="000000"/>
+          <w:lang w:val="es-ES_tradnl"/>
+        </w:rPr>
+        <w:t xml:space="preserve">nube </w:t>
+      </w:r>
+      <w:r>
+        <w:rPr>
+          <w:rFonts w:asciiTheme="minorHAnsi" w:eastAsia="Arial Unicode MS" w:hAnsiTheme="minorHAnsi" w:cstheme="minorHAnsi"/>
+          <w:b w:val="0"/>
+          <w:bCs w:val="0"/>
+          <w:color w:val="000000"/>
+          <w:kern w:val="0"/>
+          <w:u w:color="000000"/>
+          <w:lang w:val="es-ES_tradnl"/>
+        </w:rPr>
+        <w:t>virtual</w:t>
+      </w:r>
+      <w:r>
+        <w:rPr>
+          <w:rFonts w:asciiTheme="minorHAnsi" w:eastAsia="Arial Unicode MS" w:hAnsiTheme="minorHAnsi" w:cstheme="minorHAnsi"/>
+          <w:b w:val="0"/>
+          <w:bCs w:val="0"/>
+          <w:color w:val="000000"/>
+          <w:kern w:val="0"/>
+          <w:u w:color="000000"/>
+          <w:lang w:val="es-ES_tradnl"/>
+        </w:rPr>
+        <w:t xml:space="preserve"> así podremos aplicar </w:t>
+      </w:r>
+      <w:r>
+        <w:rPr>
+          <w:rFonts w:asciiTheme="minorHAnsi" w:eastAsia="Arial Unicode MS" w:hAnsiTheme="minorHAnsi" w:cstheme="minorHAnsi"/>
+          <w:b w:val="0"/>
+          <w:bCs w:val="0"/>
+          <w:color w:val="000000"/>
+          <w:kern w:val="0"/>
+          <w:u w:color="000000"/>
+          <w:lang w:val="es-ES_tradnl"/>
+        </w:rPr>
+        <w:t xml:space="preserve">algoritmos </w:t>
+      </w:r>
+      <w:r>
+        <w:rPr>
+          <w:rFonts w:asciiTheme="minorHAnsi" w:eastAsia="Arial Unicode MS" w:hAnsiTheme="minorHAnsi" w:cstheme="minorHAnsi"/>
+          <w:b w:val="0"/>
+          <w:bCs w:val="0"/>
+          <w:color w:val="000000"/>
+          <w:kern w:val="0"/>
+          <w:u w:color="000000"/>
+          <w:lang w:val="es-ES_tradnl"/>
+        </w:rPr>
+        <w:t>para las</w:t>
+      </w:r>
+      <w:r>
+        <w:rPr>
+          <w:rFonts w:asciiTheme="minorHAnsi" w:eastAsia="Arial Unicode MS" w:hAnsiTheme="minorHAnsi" w:cstheme="minorHAnsi"/>
+          <w:b w:val="0"/>
+          <w:bCs w:val="0"/>
+          <w:color w:val="000000"/>
+          <w:kern w:val="0"/>
+          <w:u w:color="000000"/>
+          <w:lang w:val="es-ES_tradnl"/>
+        </w:rPr>
+        <w:t xml:space="preserve"> gestiones</w:t>
+      </w:r>
+      <w:r>
+        <w:rPr>
+          <w:rFonts w:asciiTheme="minorHAnsi" w:eastAsia="Arial Unicode MS" w:hAnsiTheme="minorHAnsi" w:cstheme="minorHAnsi"/>
+          <w:b w:val="0"/>
+          <w:bCs w:val="0"/>
+          <w:color w:val="000000"/>
+          <w:kern w:val="0"/>
+          <w:u w:color="000000"/>
+          <w:lang w:val="es-ES_tradnl"/>
+        </w:rPr>
+        <w:t xml:space="preserve"> de recursos que </w:t>
+      </w:r>
+      <w:r>
+        <w:rPr>
+          <w:rFonts w:asciiTheme="minorHAnsi" w:eastAsia="Arial Unicode MS" w:hAnsiTheme="minorHAnsi" w:cstheme="minorHAnsi"/>
+          <w:b w:val="0"/>
+          <w:bCs w:val="0"/>
+          <w:color w:val="000000"/>
+          <w:kern w:val="0"/>
+          <w:u w:color="000000"/>
+          <w:lang w:val="es-ES_tradnl"/>
+        </w:rPr>
+        <w:t xml:space="preserve">encenderán y </w:t>
+      </w:r>
+      <w:r>
+        <w:rPr>
+          <w:rFonts w:asciiTheme="minorHAnsi" w:eastAsia="Arial Unicode MS" w:hAnsiTheme="minorHAnsi" w:cstheme="minorHAnsi"/>
+          <w:b w:val="0"/>
+          <w:bCs w:val="0"/>
+          <w:color w:val="000000"/>
+          <w:kern w:val="0"/>
+          <w:u w:color="000000"/>
+          <w:lang w:val="es-ES_tradnl"/>
+        </w:rPr>
+        <w:t>apagarán</w:t>
+      </w:r>
+      <w:r>
+        <w:rPr>
+          <w:rFonts w:asciiTheme="minorHAnsi" w:eastAsia="Arial Unicode MS" w:hAnsiTheme="minorHAnsi" w:cstheme="minorHAnsi"/>
+          <w:b w:val="0"/>
+          <w:bCs w:val="0"/>
+          <w:color w:val="000000"/>
+          <w:kern w:val="0"/>
+          <w:u w:color="000000"/>
+          <w:lang w:val="es-ES_tradnl"/>
+        </w:rPr>
+        <w:t xml:space="preserve"> los servidores </w:t>
+      </w:r>
+      <w:r>
+        <w:rPr>
+          <w:rFonts w:asciiTheme="minorHAnsi" w:eastAsia="Arial Unicode MS" w:hAnsiTheme="minorHAnsi" w:cstheme="minorHAnsi"/>
+          <w:b w:val="0"/>
+          <w:bCs w:val="0"/>
+          <w:color w:val="000000"/>
+          <w:kern w:val="0"/>
+          <w:u w:color="000000"/>
+          <w:lang w:val="es-ES_tradnl"/>
+        </w:rPr>
+        <w:t>virtuales (</w:t>
+      </w:r>
+      <w:r>
+        <w:rPr>
+          <w:rFonts w:asciiTheme="minorHAnsi" w:eastAsia="Arial Unicode MS" w:hAnsiTheme="minorHAnsi" w:cstheme="minorHAnsi"/>
+          <w:b w:val="0"/>
+          <w:bCs w:val="0"/>
+          <w:color w:val="000000"/>
+          <w:kern w:val="0"/>
+          <w:u w:color="000000"/>
+          <w:lang w:val="es-ES_tradnl"/>
+        </w:rPr>
+        <w:t xml:space="preserve">VMs) según al resultado de los modelos generados </w:t>
+      </w:r>
+      <w:r>
+        <w:rPr>
+          <w:rFonts w:asciiTheme="minorHAnsi" w:eastAsia="Arial Unicode MS" w:hAnsiTheme="minorHAnsi" w:cstheme="minorHAnsi"/>
+          <w:b w:val="0"/>
+          <w:bCs w:val="0"/>
+          <w:color w:val="000000"/>
+          <w:kern w:val="0"/>
+          <w:u w:color="000000"/>
+          <w:lang w:val="es-ES_tradnl"/>
+        </w:rPr>
+        <w:t>anteriormente.</w:t>
+      </w:r>
+    </w:p>
+    <w:p>
+      <w:pPr>
+        <w:pStyle w:val="Ttulo11"/>
+        <w:numPr>
+          <w:ilvl w:val="0"/>
+          <w:numId w:val="6"/>
+        </w:numPr>
+        <w:pBdr>
+          <w:top w:val="single" w:sz="4" w:space="1" w:color="auto"/>
+        </w:pBdr>
+        <w:jc w:val="both"/>
+        <w:rPr>
+          <w:rFonts w:asciiTheme="minorHAnsi" w:eastAsia="Arial Unicode MS" w:hAnsiTheme="minorHAnsi" w:cstheme="minorHAnsi"/>
+          <w:b w:val="0"/>
+          <w:bCs w:val="0"/>
+          <w:color w:val="000000"/>
+          <w:kern w:val="0"/>
+          <w:u w:color="000000"/>
+          <w:lang w:val="es-ES_tradnl"/>
+        </w:rPr>
+      </w:pPr>
+      <w:r>
+        <w:rPr>
+          <w:rFonts w:asciiTheme="minorHAnsi" w:eastAsia="Arial Unicode MS" w:hAnsiTheme="minorHAnsi" w:cstheme="minorHAnsi"/>
+          <w:b w:val="0"/>
+          <w:bCs w:val="0"/>
+          <w:color w:val="000000"/>
+          <w:kern w:val="0"/>
+          <w:u w:color="000000"/>
+          <w:lang w:val="es-ES_tradnl"/>
+        </w:rPr>
+        <w:t xml:space="preserve"> </w:t>
+      </w:r>
+      <w:r>
+        <w:rPr>
+          <w:rFonts w:asciiTheme="minorHAnsi" w:eastAsia="Arial Unicode MS" w:hAnsiTheme="minorHAnsi" w:cstheme="minorHAnsi"/>
+          <w:b w:val="0"/>
+          <w:bCs w:val="0"/>
+          <w:color w:val="000000"/>
+          <w:kern w:val="0"/>
+          <w:u w:color="000000"/>
+          <w:lang w:val="es-ES_tradnl"/>
+        </w:rPr>
+        <w:t xml:space="preserve">Ultima fase la evaluación y validación: </w:t>
+      </w:r>
+      <w:r>
+        <w:rPr>
+          <w:rFonts w:asciiTheme="minorHAnsi" w:eastAsia="Arial Unicode MS" w:hAnsiTheme="minorHAnsi" w:cstheme="minorHAnsi"/>
+          <w:b w:val="0"/>
+          <w:bCs w:val="0"/>
+          <w:color w:val="000000"/>
+          <w:kern w:val="0"/>
+          <w:u w:color="000000"/>
+          <w:lang w:val="es-ES_tradnl"/>
+        </w:rPr>
+        <w:t xml:space="preserve">en esta fase </w:t>
+      </w:r>
+      <w:r>
+        <w:rPr>
+          <w:rFonts w:asciiTheme="minorHAnsi" w:eastAsia="Arial Unicode MS" w:hAnsiTheme="minorHAnsi" w:cstheme="minorHAnsi"/>
+          <w:b w:val="0"/>
+          <w:bCs w:val="0"/>
+          <w:color w:val="000000"/>
+          <w:kern w:val="0"/>
+          <w:u w:color="000000"/>
+          <w:lang w:val="es-ES_tradnl"/>
+        </w:rPr>
+        <w:t xml:space="preserve">evaluaremos y validaremos </w:t>
+      </w:r>
+      <w:r>
+        <w:rPr>
+          <w:rFonts w:asciiTheme="minorHAnsi" w:eastAsia="Arial Unicode MS" w:hAnsiTheme="minorHAnsi" w:cstheme="minorHAnsi"/>
+          <w:b w:val="0"/>
+          <w:bCs w:val="0"/>
+          <w:color w:val="000000"/>
+          <w:kern w:val="0"/>
+          <w:u w:color="000000"/>
+          <w:lang w:val="es-ES_tradnl"/>
+        </w:rPr>
+        <w:t>Energy Saving</w:t>
+      </w:r>
+      <w:r>
+        <w:rPr>
+          <w:rFonts w:asciiTheme="minorHAnsi" w:eastAsia="Arial Unicode MS" w:hAnsiTheme="minorHAnsi" w:cstheme="minorHAnsi"/>
+          <w:b w:val="0"/>
+          <w:bCs w:val="0"/>
+          <w:color w:val="000000"/>
+          <w:kern w:val="0"/>
+          <w:u w:color="000000"/>
+          <w:lang w:val="es-ES_tradnl"/>
+        </w:rPr>
+        <w:t xml:space="preserve">, </w:t>
+      </w:r>
+      <w:r>
+        <w:rPr>
+          <w:rFonts w:asciiTheme="minorHAnsi" w:eastAsia="Arial Unicode MS" w:hAnsiTheme="minorHAnsi" w:cstheme="minorHAnsi"/>
+          <w:b w:val="0"/>
+          <w:bCs w:val="0"/>
+          <w:color w:val="000000"/>
+          <w:kern w:val="0"/>
+          <w:u w:color="000000"/>
+          <w:lang w:val="es-ES_tradnl"/>
+        </w:rPr>
+        <w:t>Prediction Accuracy</w:t>
+      </w:r>
+      <w:r>
+        <w:rPr>
+          <w:rFonts w:asciiTheme="minorHAnsi" w:eastAsia="Arial Unicode MS" w:hAnsiTheme="minorHAnsi" w:cstheme="minorHAnsi"/>
+          <w:b w:val="0"/>
+          <w:bCs w:val="0"/>
+          <w:color w:val="000000"/>
+          <w:kern w:val="0"/>
+          <w:u w:color="000000"/>
+          <w:lang w:val="es-ES_tradnl"/>
+        </w:rPr>
+        <w:t xml:space="preserve">, </w:t>
+      </w:r>
+      <w:r>
+        <w:rPr>
+          <w:rFonts w:asciiTheme="minorHAnsi" w:eastAsia="Arial Unicode MS" w:hAnsiTheme="minorHAnsi" w:cstheme="minorHAnsi"/>
+          <w:b w:val="0"/>
+          <w:bCs w:val="0"/>
+          <w:color w:val="000000"/>
+          <w:kern w:val="0"/>
+          <w:u w:color="000000"/>
+          <w:lang w:val="es-ES_tradnl"/>
+        </w:rPr>
+        <w:t>SLA Violation</w:t>
+      </w:r>
+      <w:r>
+        <w:rPr>
+          <w:rFonts w:asciiTheme="minorHAnsi" w:eastAsia="Arial Unicode MS" w:hAnsiTheme="minorHAnsi" w:cstheme="minorHAnsi"/>
+          <w:b w:val="0"/>
+          <w:bCs w:val="0"/>
+          <w:color w:val="000000"/>
+          <w:kern w:val="0"/>
+          <w:u w:color="000000"/>
+          <w:lang w:val="es-ES_tradnl"/>
+        </w:rPr>
+        <w:t>.</w:t>
+      </w:r>
+    </w:p>
+    <w:p>
+      <w:pPr>
         <w:pStyle w:val="Default"/>
         <w:ind w:firstLine="0"/>
         <w:rPr>
@@ -4792,14 +5696,1269 @@
     </w:p>
     <w:p>
       <w:pPr>
-        <w:pStyle w:val="Default"/>
-        <w:ind w:firstLine="0"/>
-        <w:rPr>
-          <w:rStyle w:val="Ninguno"/>
-          <w:rFonts w:asciiTheme="minorHAnsi" w:eastAsia="Calibri" w:hAnsiTheme="minorHAnsi" w:cstheme="minorHAnsi"/>
-          <w:sz w:val="22"/>
-          <w:szCs w:val="22"/>
-          <w:lang w:val="es-ES"/>
+        <w:pStyle w:val="Ttulo11"/>
+        <w:pBdr>
+          <w:top w:val="single" w:sz="4" w:space="1" w:color="auto"/>
+        </w:pBdr>
+        <w:jc w:val="left"/>
+        <w:rPr>
+          <w:rFonts w:asciiTheme="minorHAnsi" w:eastAsia="Arial Unicode MS" w:hAnsiTheme="minorHAnsi" w:cstheme="minorHAnsi"/>
+          <w:b w:val="0"/>
+          <w:bCs w:val="0"/>
+          <w:color w:val="000000"/>
+          <w:kern w:val="0"/>
+          <w:u w:color="000000"/>
+          <w:lang w:val="es-ES_tradnl"/>
+        </w:rPr>
+      </w:pPr>
+      <w:r>
+        <w:rPr>
+          <w:rFonts w:asciiTheme="minorHAnsi" w:eastAsia="Arial Unicode MS" w:hAnsiTheme="minorHAnsi" w:cstheme="minorHAnsi"/>
+          <w:b w:val="0"/>
+          <w:bCs w:val="0"/>
+          <w:color w:val="000000"/>
+          <w:kern w:val="0"/>
+          <w:u w:color="000000"/>
+          <w:lang w:val="es-ES_tradnl"/>
+        </w:rPr>
+        <w:t xml:space="preserve">El trabajo </w:t>
+      </w:r>
+      <w:r>
+        <w:rPr>
+          <w:rFonts w:asciiTheme="minorHAnsi" w:eastAsia="Arial Unicode MS" w:hAnsiTheme="minorHAnsi" w:cstheme="minorHAnsi"/>
+          <w:b w:val="0"/>
+          <w:bCs w:val="0"/>
+          <w:color w:val="000000"/>
+          <w:kern w:val="0"/>
+          <w:u w:color="000000"/>
+          <w:lang w:val="es-ES_tradnl"/>
+        </w:rPr>
+        <w:t xml:space="preserve">se desarrollará en tres años </w:t>
+      </w:r>
+      <w:r>
+        <w:rPr>
+          <w:rFonts w:asciiTheme="minorHAnsi" w:eastAsia="Arial Unicode MS" w:hAnsiTheme="minorHAnsi" w:cstheme="minorHAnsi"/>
+          <w:b w:val="0"/>
+          <w:bCs w:val="0"/>
+          <w:color w:val="000000"/>
+          <w:kern w:val="0"/>
+          <w:u w:color="000000"/>
+          <w:lang w:val="es-ES_tradnl"/>
+        </w:rPr>
+        <w:t>orientados hacia la producción de investigaciones científicas de alto nivel</w:t>
+      </w:r>
+      <w:r>
+        <w:rPr>
+          <w:rFonts w:asciiTheme="minorHAnsi" w:eastAsia="Arial Unicode MS" w:hAnsiTheme="minorHAnsi" w:cstheme="minorHAnsi"/>
+          <w:b w:val="0"/>
+          <w:bCs w:val="0"/>
+          <w:color w:val="000000"/>
+          <w:kern w:val="0"/>
+          <w:u w:color="000000"/>
+          <w:lang w:val="es-ES_tradnl"/>
+        </w:rPr>
+        <w:t xml:space="preserve">. </w:t>
+      </w:r>
+      <w:r>
+        <w:rPr>
+          <w:rFonts w:asciiTheme="minorHAnsi" w:eastAsia="Arial Unicode MS" w:hAnsiTheme="minorHAnsi" w:cstheme="minorHAnsi"/>
+          <w:b w:val="0"/>
+          <w:bCs w:val="0"/>
+          <w:color w:val="000000"/>
+          <w:kern w:val="0"/>
+          <w:u w:color="000000"/>
+          <w:lang w:val="es-ES_tradnl"/>
+        </w:rPr>
+        <w:t>A continuación, se detalla la planificación de actividades</w:t>
+      </w:r>
+      <w:r>
+        <w:rPr>
+          <w:rFonts w:asciiTheme="minorHAnsi" w:eastAsia="Arial Unicode MS" w:hAnsiTheme="minorHAnsi" w:cstheme="minorHAnsi"/>
+          <w:b w:val="0"/>
+          <w:bCs w:val="0"/>
+          <w:color w:val="000000"/>
+          <w:kern w:val="0"/>
+          <w:u w:color="000000"/>
+          <w:lang w:val="es-ES_tradnl"/>
+        </w:rPr>
+        <w:t>:</w:t>
+      </w:r>
+    </w:p>
+    <w:p>
+      <w:pPr>
+        <w:pStyle w:val="Ttulo11"/>
+        <w:pBdr>
+          <w:top w:val="single" w:sz="4" w:space="1" w:color="auto"/>
+        </w:pBdr>
+        <w:jc w:val="left"/>
+        <w:rPr>
+          <w:rFonts w:asciiTheme="minorHAnsi" w:eastAsia="Arial Unicode MS" w:hAnsiTheme="minorHAnsi" w:cstheme="minorHAnsi"/>
+        </w:rPr>
+      </w:pPr>
+    </w:p>
+    <w:tbl>
+      <w:tblPr>
+        <w:tblW w:w="5000" w:type="pct"/>
+        <w:tblBorders>
+          <w:top w:val="single" w:sz="4" w:space="0" w:color="auto"/>
+          <w:left w:val="single" w:sz="4" w:space="0" w:color="auto"/>
+          <w:bottom w:val="single" w:sz="4" w:space="0" w:color="auto"/>
+          <w:right w:val="single" w:sz="4" w:space="0" w:color="auto"/>
+          <w:insideH w:val="single" w:sz="4" w:space="0" w:color="auto"/>
+          <w:insideV w:val="single" w:sz="4" w:space="0" w:color="auto"/>
+        </w:tblBorders>
+        <w:tblLook w:val="04A0" w:firstRow="1" w:lastRow="0" w:firstColumn="1" w:lastColumn="0" w:noHBand="0" w:noVBand="1"/>
+      </w:tblPr>
+      <w:tblGrid>
+        <w:gridCol w:w="2547"/>
+        <w:gridCol w:w="2264"/>
+        <w:gridCol w:w="2264"/>
+        <w:gridCol w:w="2265"/>
+      </w:tblGrid>
+      <w:tr>
+        <w:tc>
+          <w:tcPr>
+            <w:tcW w:w="2547" w:type="dxa"/>
+            <w:tcBorders>
+              <w:top w:val="single" w:sz="4" w:space="0" w:color="auto"/>
+              <w:left w:val="single" w:sz="4" w:space="0" w:color="auto"/>
+              <w:bottom w:val="single" w:sz="4" w:space="0" w:color="auto"/>
+              <w:right w:val="single" w:sz="4" w:space="0" w:color="auto"/>
+            </w:tcBorders>
+            <w:shd w:val="clear" w:color="auto" w:fill="F4B083"/>
+            <w:noWrap/>
+            <w:vAlign w:val="center"/>
+          </w:tcPr>
+          <w:p>
+            <w:pPr>
+              <w:pStyle w:val="Ttulo11"/>
+              <w:pBdr>
+                <w:top w:val="single" w:sz="4" w:space="1" w:color="auto"/>
+              </w:pBdr>
+              <w:rPr>
+                <w:rFonts w:asciiTheme="minorHAnsi" w:eastAsia="Arial Unicode MS" w:hAnsiTheme="minorHAnsi" w:cstheme="minorHAnsi"/>
+              </w:rPr>
+            </w:pPr>
+          </w:p>
+        </w:tc>
+        <w:tc>
+          <w:tcPr>
+            <w:tcW w:w="2264" w:type="dxa"/>
+            <w:tcBorders>
+              <w:top w:val="single" w:sz="4" w:space="0" w:color="auto"/>
+              <w:left w:val="single" w:sz="4" w:space="0" w:color="auto"/>
+              <w:bottom w:val="single" w:sz="4" w:space="0" w:color="auto"/>
+              <w:right w:val="single" w:sz="4" w:space="0" w:color="auto"/>
+            </w:tcBorders>
+            <w:shd w:val="clear" w:color="auto" w:fill="F4B083"/>
+            <w:vAlign w:val="center"/>
+            <w:hideMark/>
+          </w:tcPr>
+          <w:p>
+            <w:pPr>
+              <w:pStyle w:val="Ttulo11"/>
+              <w:pBdr>
+                <w:top w:val="single" w:sz="4" w:space="1" w:color="auto"/>
+              </w:pBdr>
+              <w:jc w:val="left"/>
+              <w:rPr>
+                <w:rFonts w:asciiTheme="minorHAnsi" w:eastAsia="Arial Unicode MS" w:hAnsiTheme="minorHAnsi" w:cstheme="minorHAnsi"/>
+              </w:rPr>
+            </w:pPr>
+            <w:r>
+              <w:rPr>
+                <w:rFonts w:asciiTheme="minorHAnsi" w:eastAsia="Arial Unicode MS" w:hAnsiTheme="minorHAnsi" w:cstheme="minorHAnsi"/>
+              </w:rPr>
+              <w:t>Año 1</w:t>
+            </w:r>
+          </w:p>
+        </w:tc>
+        <w:tc>
+          <w:tcPr>
+            <w:tcW w:w="2264" w:type="dxa"/>
+            <w:tcBorders>
+              <w:top w:val="single" w:sz="4" w:space="0" w:color="auto"/>
+              <w:left w:val="single" w:sz="4" w:space="0" w:color="auto"/>
+              <w:bottom w:val="single" w:sz="4" w:space="0" w:color="auto"/>
+              <w:right w:val="single" w:sz="4" w:space="0" w:color="auto"/>
+            </w:tcBorders>
+            <w:shd w:val="clear" w:color="auto" w:fill="F4B083"/>
+            <w:vAlign w:val="center"/>
+            <w:hideMark/>
+          </w:tcPr>
+          <w:p>
+            <w:pPr>
+              <w:pStyle w:val="Ttulo11"/>
+              <w:pBdr>
+                <w:top w:val="single" w:sz="4" w:space="1" w:color="auto"/>
+              </w:pBdr>
+              <w:jc w:val="left"/>
+              <w:rPr>
+                <w:rFonts w:asciiTheme="minorHAnsi" w:eastAsia="Arial Unicode MS" w:hAnsiTheme="minorHAnsi" w:cstheme="minorHAnsi"/>
+              </w:rPr>
+            </w:pPr>
+            <w:r>
+              <w:rPr>
+                <w:rFonts w:asciiTheme="minorHAnsi" w:eastAsia="Arial Unicode MS" w:hAnsiTheme="minorHAnsi" w:cstheme="minorHAnsi"/>
+              </w:rPr>
+              <w:t>Año 2</w:t>
+            </w:r>
+          </w:p>
+        </w:tc>
+        <w:tc>
+          <w:tcPr>
+            <w:tcW w:w="2265" w:type="dxa"/>
+            <w:tcBorders>
+              <w:top w:val="single" w:sz="4" w:space="0" w:color="auto"/>
+              <w:left w:val="single" w:sz="4" w:space="0" w:color="auto"/>
+              <w:bottom w:val="single" w:sz="4" w:space="0" w:color="auto"/>
+              <w:right w:val="single" w:sz="4" w:space="0" w:color="auto"/>
+            </w:tcBorders>
+            <w:shd w:val="clear" w:color="auto" w:fill="F4B083"/>
+            <w:vAlign w:val="center"/>
+            <w:hideMark/>
+          </w:tcPr>
+          <w:p>
+            <w:pPr>
+              <w:pStyle w:val="Ttulo11"/>
+              <w:pBdr>
+                <w:top w:val="single" w:sz="4" w:space="1" w:color="auto"/>
+              </w:pBdr>
+              <w:jc w:val="left"/>
+              <w:rPr>
+                <w:rFonts w:asciiTheme="minorHAnsi" w:eastAsia="Arial Unicode MS" w:hAnsiTheme="minorHAnsi" w:cstheme="minorHAnsi"/>
+              </w:rPr>
+            </w:pPr>
+            <w:r>
+              <w:rPr>
+                <w:rFonts w:asciiTheme="minorHAnsi" w:eastAsia="Arial Unicode MS" w:hAnsiTheme="minorHAnsi" w:cstheme="minorHAnsi"/>
+              </w:rPr>
+              <w:t>Año 3</w:t>
+            </w:r>
+          </w:p>
+        </w:tc>
+      </w:tr>
+      <w:tr>
+        <w:tc>
+          <w:tcPr>
+            <w:tcW w:w="2547" w:type="dxa"/>
+            <w:tcBorders>
+              <w:top w:val="single" w:sz="4" w:space="0" w:color="auto"/>
+              <w:left w:val="single" w:sz="4" w:space="0" w:color="auto"/>
+              <w:bottom w:val="single" w:sz="4" w:space="0" w:color="auto"/>
+              <w:right w:val="single" w:sz="4" w:space="0" w:color="auto"/>
+            </w:tcBorders>
+            <w:shd w:val="clear" w:color="auto" w:fill="BDD6EE"/>
+            <w:noWrap/>
+            <w:hideMark/>
+          </w:tcPr>
+          <w:p>
+            <w:pPr>
+              <w:pStyle w:val="Ttulo11"/>
+              <w:pBdr>
+                <w:top w:val="single" w:sz="4" w:space="1" w:color="auto"/>
+              </w:pBdr>
+              <w:rPr>
+                <w:rFonts w:asciiTheme="minorHAnsi" w:eastAsia="Arial Unicode MS" w:hAnsiTheme="minorHAnsi" w:cstheme="minorHAnsi"/>
+              </w:rPr>
+            </w:pPr>
+            <w:r>
+              <w:rPr>
+                <w:rFonts w:asciiTheme="minorHAnsi" w:eastAsia="Arial Unicode MS" w:hAnsiTheme="minorHAnsi" w:cstheme="minorHAnsi"/>
+              </w:rPr>
+              <w:t>Publicación científica</w:t>
+            </w:r>
+          </w:p>
+        </w:tc>
+        <w:tc>
+          <w:tcPr>
+            <w:tcW w:w="2264" w:type="dxa"/>
+            <w:tcBorders>
+              <w:top w:val="single" w:sz="4" w:space="0" w:color="auto"/>
+              <w:left w:val="single" w:sz="4" w:space="0" w:color="auto"/>
+              <w:bottom w:val="single" w:sz="4" w:space="0" w:color="auto"/>
+              <w:right w:val="single" w:sz="4" w:space="0" w:color="auto"/>
+            </w:tcBorders>
+            <w:hideMark/>
+          </w:tcPr>
+          <w:p>
+            <w:pPr>
+              <w:pStyle w:val="Ttulo11"/>
+              <w:pBdr>
+                <w:top w:val="single" w:sz="4" w:space="1" w:color="auto"/>
+              </w:pBdr>
+              <w:rPr>
+                <w:rFonts w:asciiTheme="minorHAnsi" w:eastAsia="Arial Unicode MS" w:hAnsiTheme="minorHAnsi" w:cstheme="minorHAnsi"/>
+                <w:b w:val="0"/>
+                <w:bCs w:val="0"/>
+                <w:color w:val="000000"/>
+                <w:kern w:val="0"/>
+                <w:u w:color="000000"/>
+                <w:lang w:val="es-ES_tradnl"/>
+              </w:rPr>
+            </w:pPr>
+            <w:r>
+              <w:rPr>
+                <w:rFonts w:asciiTheme="minorHAnsi" w:eastAsia="Arial Unicode MS" w:hAnsiTheme="minorHAnsi" w:cstheme="minorHAnsi"/>
+                <w:b w:val="0"/>
+                <w:bCs w:val="0"/>
+                <w:color w:val="000000"/>
+                <w:kern w:val="0"/>
+                <w:u w:color="000000"/>
+                <w:lang w:val="es-ES_tradnl"/>
+              </w:rPr>
+              <w:t xml:space="preserve">Una revisión </w:t>
+            </w:r>
+            <w:r>
+              <w:rPr>
+                <w:rFonts w:asciiTheme="minorHAnsi" w:eastAsia="Arial Unicode MS" w:hAnsiTheme="minorHAnsi" w:cstheme="minorHAnsi"/>
+                <w:b w:val="0"/>
+                <w:bCs w:val="0"/>
+                <w:color w:val="000000"/>
+                <w:kern w:val="0"/>
+                <w:u w:color="000000"/>
+                <w:lang w:val="es-ES_tradnl"/>
+              </w:rPr>
+              <w:t>amplia</w:t>
+            </w:r>
+            <w:r>
+              <w:rPr>
+                <w:rFonts w:asciiTheme="minorHAnsi" w:eastAsia="Arial Unicode MS" w:hAnsiTheme="minorHAnsi" w:cstheme="minorHAnsi"/>
+                <w:b w:val="0"/>
+                <w:bCs w:val="0"/>
+                <w:color w:val="000000"/>
+                <w:kern w:val="0"/>
+                <w:u w:color="000000"/>
+                <w:lang w:val="es-ES_tradnl"/>
+              </w:rPr>
+              <w:t xml:space="preserve"> de los desafíos energéticos en la computación en la nube</w:t>
+            </w:r>
+          </w:p>
+        </w:tc>
+        <w:tc>
+          <w:tcPr>
+            <w:tcW w:w="2264" w:type="dxa"/>
+            <w:tcBorders>
+              <w:top w:val="single" w:sz="4" w:space="0" w:color="auto"/>
+              <w:left w:val="single" w:sz="4" w:space="0" w:color="auto"/>
+              <w:bottom w:val="single" w:sz="4" w:space="0" w:color="auto"/>
+              <w:right w:val="single" w:sz="4" w:space="0" w:color="auto"/>
+            </w:tcBorders>
+            <w:hideMark/>
+          </w:tcPr>
+          <w:p>
+            <w:pPr>
+              <w:pStyle w:val="Ttulo11"/>
+              <w:pBdr>
+                <w:top w:val="single" w:sz="4" w:space="1" w:color="auto"/>
+              </w:pBdr>
+              <w:jc w:val="both"/>
+              <w:rPr>
+                <w:rFonts w:asciiTheme="minorHAnsi" w:eastAsia="Arial Unicode MS" w:hAnsiTheme="minorHAnsi" w:cstheme="minorHAnsi"/>
+                <w:b w:val="0"/>
+                <w:bCs w:val="0"/>
+                <w:color w:val="000000"/>
+                <w:kern w:val="0"/>
+                <w:u w:color="000000"/>
+                <w:lang w:val="es-ES_tradnl"/>
+              </w:rPr>
+            </w:pPr>
+            <w:r>
+              <w:rPr>
+                <w:rFonts w:asciiTheme="minorHAnsi" w:eastAsia="Arial Unicode MS" w:hAnsiTheme="minorHAnsi" w:cstheme="minorHAnsi"/>
+                <w:b w:val="0"/>
+                <w:bCs w:val="0"/>
+                <w:color w:val="000000"/>
+                <w:kern w:val="0"/>
+                <w:u w:color="000000"/>
+                <w:lang w:val="es-ES_tradnl"/>
+              </w:rPr>
+              <w:t xml:space="preserve">modelo </w:t>
+            </w:r>
+            <w:r>
+              <w:rPr>
+                <w:rFonts w:asciiTheme="minorHAnsi" w:eastAsia="Arial Unicode MS" w:hAnsiTheme="minorHAnsi" w:cstheme="minorHAnsi"/>
+                <w:b w:val="0"/>
+                <w:bCs w:val="0"/>
+                <w:color w:val="000000"/>
+                <w:kern w:val="0"/>
+                <w:u w:color="000000"/>
+                <w:lang w:val="es-ES_tradnl"/>
+              </w:rPr>
+              <w:t xml:space="preserve">predictivo </w:t>
+            </w:r>
+            <w:r>
+              <w:rPr>
+                <w:rFonts w:asciiTheme="minorHAnsi" w:eastAsia="Arial Unicode MS" w:hAnsiTheme="minorHAnsi" w:cstheme="minorHAnsi"/>
+                <w:b w:val="0"/>
+                <w:bCs w:val="0"/>
+                <w:color w:val="000000"/>
+                <w:kern w:val="0"/>
+                <w:u w:color="000000"/>
+                <w:lang w:val="es-ES_tradnl"/>
+              </w:rPr>
+              <w:t>para la gestión de recursos de Big Data</w:t>
+            </w:r>
+          </w:p>
+        </w:tc>
+        <w:tc>
+          <w:tcPr>
+            <w:tcW w:w="2265" w:type="dxa"/>
+            <w:tcBorders>
+              <w:top w:val="single" w:sz="4" w:space="0" w:color="auto"/>
+              <w:left w:val="single" w:sz="4" w:space="0" w:color="auto"/>
+              <w:bottom w:val="single" w:sz="4" w:space="0" w:color="auto"/>
+              <w:right w:val="single" w:sz="4" w:space="0" w:color="auto"/>
+            </w:tcBorders>
+            <w:hideMark/>
+          </w:tcPr>
+          <w:p>
+            <w:pPr>
+              <w:pStyle w:val="Ttulo11"/>
+              <w:pBdr>
+                <w:top w:val="single" w:sz="4" w:space="1" w:color="auto"/>
+              </w:pBdr>
+              <w:rPr>
+                <w:rFonts w:asciiTheme="minorHAnsi" w:eastAsia="Arial Unicode MS" w:hAnsiTheme="minorHAnsi" w:cstheme="minorHAnsi"/>
+                <w:b w:val="0"/>
+                <w:bCs w:val="0"/>
+                <w:color w:val="000000"/>
+                <w:kern w:val="0"/>
+                <w:u w:color="000000"/>
+                <w:lang w:val="es-ES_tradnl"/>
+              </w:rPr>
+            </w:pPr>
+            <w:r>
+              <w:rPr>
+                <w:rFonts w:asciiTheme="minorHAnsi" w:eastAsia="Arial Unicode MS" w:hAnsiTheme="minorHAnsi" w:cstheme="minorHAnsi"/>
+                <w:b w:val="0"/>
+                <w:bCs w:val="0"/>
+                <w:color w:val="000000"/>
+                <w:kern w:val="0"/>
+                <w:u w:color="000000"/>
+                <w:lang w:val="es-ES_tradnl"/>
+              </w:rPr>
+              <w:t>Un algoritmo inteligente para optimizar la eficiencia energética sostenible</w:t>
+            </w:r>
+          </w:p>
+        </w:tc>
+      </w:tr>
+      <w:tr>
+        <w:tc>
+          <w:tcPr>
+            <w:tcW w:w="2547" w:type="dxa"/>
+            <w:tcBorders>
+              <w:top w:val="single" w:sz="4" w:space="0" w:color="auto"/>
+              <w:left w:val="single" w:sz="4" w:space="0" w:color="auto"/>
+              <w:bottom w:val="single" w:sz="4" w:space="0" w:color="auto"/>
+              <w:right w:val="single" w:sz="4" w:space="0" w:color="auto"/>
+            </w:tcBorders>
+            <w:shd w:val="clear" w:color="auto" w:fill="BDD6EE"/>
+            <w:noWrap/>
+            <w:hideMark/>
+          </w:tcPr>
+          <w:p>
+            <w:pPr>
+              <w:pStyle w:val="Ttulo11"/>
+              <w:pBdr>
+                <w:top w:val="single" w:sz="4" w:space="1" w:color="auto"/>
+              </w:pBdr>
+              <w:rPr>
+                <w:rFonts w:asciiTheme="minorHAnsi" w:eastAsia="Arial Unicode MS" w:hAnsiTheme="minorHAnsi" w:cstheme="minorHAnsi"/>
+              </w:rPr>
+            </w:pPr>
+            <w:r>
+              <w:rPr>
+                <w:rFonts w:asciiTheme="minorHAnsi" w:eastAsia="Arial Unicode MS" w:hAnsiTheme="minorHAnsi" w:cstheme="minorHAnsi"/>
+              </w:rPr>
+              <w:t xml:space="preserve">Marco teórico </w:t>
+            </w:r>
+          </w:p>
+        </w:tc>
+        <w:tc>
+          <w:tcPr>
+            <w:tcW w:w="2264" w:type="dxa"/>
+            <w:tcBorders>
+              <w:top w:val="single" w:sz="4" w:space="0" w:color="auto"/>
+              <w:left w:val="single" w:sz="4" w:space="0" w:color="auto"/>
+              <w:bottom w:val="single" w:sz="4" w:space="0" w:color="auto"/>
+              <w:right w:val="single" w:sz="4" w:space="0" w:color="auto"/>
+            </w:tcBorders>
+            <w:hideMark/>
+          </w:tcPr>
+          <w:p>
+            <w:pPr>
+              <w:pStyle w:val="Ttulo11"/>
+              <w:pBdr>
+                <w:top w:val="single" w:sz="4" w:space="1" w:color="auto"/>
+              </w:pBdr>
+              <w:rPr>
+                <w:rFonts w:asciiTheme="minorHAnsi" w:eastAsia="Arial Unicode MS" w:hAnsiTheme="minorHAnsi" w:cstheme="minorHAnsi"/>
+                <w:b w:val="0"/>
+                <w:bCs w:val="0"/>
+                <w:color w:val="000000"/>
+                <w:kern w:val="0"/>
+                <w:u w:color="000000"/>
+                <w:lang w:val="es-ES_tradnl"/>
+              </w:rPr>
+            </w:pPr>
+            <w:r>
+              <w:rPr>
+                <w:rFonts w:asciiTheme="minorHAnsi" w:eastAsia="Arial Unicode MS" w:hAnsiTheme="minorHAnsi" w:cstheme="minorHAnsi"/>
+                <w:b w:val="0"/>
+                <w:bCs w:val="0"/>
+                <w:color w:val="000000"/>
+                <w:kern w:val="0"/>
+                <w:u w:color="000000"/>
+                <w:lang w:val="es-ES_tradnl"/>
+              </w:rPr>
+              <w:t>Revisión sistemática y estado del arte</w:t>
+            </w:r>
+          </w:p>
+        </w:tc>
+        <w:tc>
+          <w:tcPr>
+            <w:tcW w:w="2264" w:type="dxa"/>
+            <w:tcBorders>
+              <w:top w:val="single" w:sz="4" w:space="0" w:color="auto"/>
+              <w:left w:val="single" w:sz="4" w:space="0" w:color="auto"/>
+              <w:bottom w:val="single" w:sz="4" w:space="0" w:color="auto"/>
+              <w:right w:val="single" w:sz="4" w:space="0" w:color="auto"/>
+            </w:tcBorders>
+            <w:hideMark/>
+          </w:tcPr>
+          <w:p>
+            <w:pPr>
+              <w:pStyle w:val="Ttulo11"/>
+              <w:pBdr>
+                <w:top w:val="single" w:sz="4" w:space="1" w:color="auto"/>
+              </w:pBdr>
+              <w:rPr>
+                <w:rFonts w:asciiTheme="minorHAnsi" w:eastAsia="Arial Unicode MS" w:hAnsiTheme="minorHAnsi" w:cstheme="minorHAnsi"/>
+                <w:b w:val="0"/>
+                <w:bCs w:val="0"/>
+                <w:color w:val="000000"/>
+                <w:kern w:val="0"/>
+                <w:u w:color="000000"/>
+                <w:lang w:val="es-ES_tradnl"/>
+              </w:rPr>
+            </w:pPr>
+            <w:r>
+              <w:rPr>
+                <w:rFonts w:asciiTheme="minorHAnsi" w:eastAsia="Arial Unicode MS" w:hAnsiTheme="minorHAnsi" w:cstheme="minorHAnsi"/>
+                <w:b w:val="0"/>
+                <w:bCs w:val="0"/>
+                <w:color w:val="000000"/>
+                <w:kern w:val="0"/>
+                <w:u w:color="000000"/>
+                <w:lang w:val="es-ES_tradnl"/>
+              </w:rPr>
+              <w:t>Revisión bibliográfica</w:t>
+            </w:r>
+          </w:p>
+        </w:tc>
+        <w:tc>
+          <w:tcPr>
+            <w:tcW w:w="2265" w:type="dxa"/>
+            <w:tcBorders>
+              <w:top w:val="single" w:sz="4" w:space="0" w:color="auto"/>
+              <w:left w:val="single" w:sz="4" w:space="0" w:color="auto"/>
+              <w:bottom w:val="single" w:sz="4" w:space="0" w:color="auto"/>
+              <w:right w:val="single" w:sz="4" w:space="0" w:color="auto"/>
+            </w:tcBorders>
+            <w:hideMark/>
+          </w:tcPr>
+          <w:p>
+            <w:pPr>
+              <w:pStyle w:val="Ttulo11"/>
+              <w:pBdr>
+                <w:top w:val="single" w:sz="4" w:space="1" w:color="auto"/>
+              </w:pBdr>
+              <w:rPr>
+                <w:rFonts w:asciiTheme="minorHAnsi" w:eastAsia="Arial Unicode MS" w:hAnsiTheme="minorHAnsi" w:cstheme="minorHAnsi"/>
+                <w:b w:val="0"/>
+                <w:bCs w:val="0"/>
+                <w:color w:val="000000"/>
+                <w:kern w:val="0"/>
+                <w:u w:color="000000"/>
+                <w:lang w:val="es-ES_tradnl"/>
+              </w:rPr>
+            </w:pPr>
+            <w:r>
+              <w:rPr>
+                <w:rFonts w:asciiTheme="minorHAnsi" w:eastAsia="Arial Unicode MS" w:hAnsiTheme="minorHAnsi" w:cstheme="minorHAnsi"/>
+                <w:b w:val="0"/>
+                <w:bCs w:val="0"/>
+                <w:color w:val="000000"/>
+                <w:kern w:val="0"/>
+                <w:u w:color="000000"/>
+                <w:lang w:val="es-ES_tradnl"/>
+              </w:rPr>
+              <w:t>Profundización teórica</w:t>
+            </w:r>
+          </w:p>
+        </w:tc>
+      </w:tr>
+      <w:tr>
+        <w:tc>
+          <w:tcPr>
+            <w:tcW w:w="2547" w:type="dxa"/>
+            <w:tcBorders>
+              <w:top w:val="single" w:sz="4" w:space="0" w:color="auto"/>
+              <w:left w:val="single" w:sz="4" w:space="0" w:color="auto"/>
+              <w:bottom w:val="single" w:sz="4" w:space="0" w:color="auto"/>
+              <w:right w:val="single" w:sz="4" w:space="0" w:color="auto"/>
+            </w:tcBorders>
+            <w:shd w:val="clear" w:color="auto" w:fill="BDD6EE"/>
+            <w:noWrap/>
+            <w:hideMark/>
+          </w:tcPr>
+          <w:p>
+            <w:pPr>
+              <w:pStyle w:val="Ttulo11"/>
+              <w:pBdr>
+                <w:top w:val="single" w:sz="4" w:space="1" w:color="auto"/>
+              </w:pBdr>
+              <w:rPr>
+                <w:rFonts w:asciiTheme="minorHAnsi" w:eastAsia="Arial Unicode MS" w:hAnsiTheme="minorHAnsi" w:cstheme="minorHAnsi"/>
+              </w:rPr>
+            </w:pPr>
+            <w:r>
+              <w:rPr>
+                <w:rFonts w:asciiTheme="minorHAnsi" w:eastAsia="Arial Unicode MS" w:hAnsiTheme="minorHAnsi" w:cstheme="minorHAnsi"/>
+              </w:rPr>
+              <w:t>Mejora de calidad y colaboración</w:t>
+            </w:r>
+          </w:p>
+        </w:tc>
+        <w:tc>
+          <w:tcPr>
+            <w:tcW w:w="2264" w:type="dxa"/>
+            <w:tcBorders>
+              <w:top w:val="single" w:sz="4" w:space="0" w:color="auto"/>
+              <w:left w:val="single" w:sz="4" w:space="0" w:color="auto"/>
+              <w:bottom w:val="single" w:sz="4" w:space="0" w:color="auto"/>
+              <w:right w:val="single" w:sz="4" w:space="0" w:color="auto"/>
+            </w:tcBorders>
+          </w:tcPr>
+          <w:p>
+            <w:pPr>
+              <w:pStyle w:val="Ttulo11"/>
+              <w:pBdr>
+                <w:top w:val="single" w:sz="4" w:space="1" w:color="auto"/>
+              </w:pBdr>
+              <w:rPr>
+                <w:rFonts w:asciiTheme="minorHAnsi" w:eastAsia="Arial Unicode MS" w:hAnsiTheme="minorHAnsi" w:cstheme="minorHAnsi"/>
+                <w:b w:val="0"/>
+                <w:bCs w:val="0"/>
+                <w:color w:val="000000"/>
+                <w:kern w:val="0"/>
+                <w:u w:color="000000"/>
+                <w:lang w:val="es-ES_tradnl"/>
+              </w:rPr>
+            </w:pPr>
+            <w:r>
+              <w:rPr>
+                <w:rFonts w:asciiTheme="minorHAnsi" w:eastAsia="Arial Unicode MS" w:hAnsiTheme="minorHAnsi" w:cstheme="minorHAnsi"/>
+                <w:b w:val="0"/>
+                <w:bCs w:val="0"/>
+                <w:color w:val="000000"/>
+                <w:kern w:val="0"/>
+                <w:u w:color="000000"/>
+                <w:lang w:val="es-ES_tradnl"/>
+              </w:rPr>
+              <w:t>Estudio de los estándares de seguridad de datos en el entorno de la nube</w:t>
+            </w:r>
+          </w:p>
+        </w:tc>
+        <w:tc>
+          <w:tcPr>
+            <w:tcW w:w="2264" w:type="dxa"/>
+            <w:tcBorders>
+              <w:top w:val="single" w:sz="4" w:space="0" w:color="auto"/>
+              <w:left w:val="single" w:sz="4" w:space="0" w:color="auto"/>
+              <w:bottom w:val="single" w:sz="4" w:space="0" w:color="auto"/>
+              <w:right w:val="single" w:sz="4" w:space="0" w:color="auto"/>
+            </w:tcBorders>
+            <w:hideMark/>
+          </w:tcPr>
+          <w:p>
+            <w:pPr>
+              <w:pStyle w:val="Ttulo11"/>
+              <w:pBdr>
+                <w:top w:val="single" w:sz="4" w:space="1" w:color="auto"/>
+              </w:pBdr>
+              <w:rPr>
+                <w:rFonts w:asciiTheme="minorHAnsi" w:eastAsia="Arial Unicode MS" w:hAnsiTheme="minorHAnsi" w:cstheme="minorHAnsi"/>
+                <w:b w:val="0"/>
+                <w:bCs w:val="0"/>
+                <w:color w:val="000000"/>
+                <w:kern w:val="0"/>
+                <w:u w:color="000000"/>
+                <w:lang w:val="es-ES_tradnl"/>
+              </w:rPr>
+            </w:pPr>
+            <w:r>
+              <w:rPr>
+                <w:rFonts w:asciiTheme="minorHAnsi" w:eastAsia="Arial Unicode MS" w:hAnsiTheme="minorHAnsi" w:cstheme="minorHAnsi"/>
+                <w:b w:val="0"/>
+                <w:bCs w:val="0"/>
+                <w:color w:val="000000"/>
+                <w:kern w:val="0"/>
+                <w:u w:color="000000"/>
+                <w:lang w:val="es-ES_tradnl"/>
+              </w:rPr>
+              <w:t>Aplicación de estándares de aseguramiento de la calidad y pruebas de estabilidad del sistema</w:t>
+            </w:r>
+          </w:p>
+        </w:tc>
+        <w:tc>
+          <w:tcPr>
+            <w:tcW w:w="2265" w:type="dxa"/>
+            <w:tcBorders>
+              <w:top w:val="single" w:sz="4" w:space="0" w:color="auto"/>
+              <w:left w:val="single" w:sz="4" w:space="0" w:color="auto"/>
+              <w:bottom w:val="single" w:sz="4" w:space="0" w:color="auto"/>
+              <w:right w:val="single" w:sz="4" w:space="0" w:color="auto"/>
+            </w:tcBorders>
+          </w:tcPr>
+          <w:p>
+            <w:pPr>
+              <w:pStyle w:val="Ttulo11"/>
+              <w:pBdr>
+                <w:top w:val="single" w:sz="4" w:space="1" w:color="auto"/>
+              </w:pBdr>
+              <w:rPr>
+                <w:rFonts w:asciiTheme="minorHAnsi" w:eastAsia="Arial Unicode MS" w:hAnsiTheme="minorHAnsi" w:cstheme="minorHAnsi"/>
+                <w:b w:val="0"/>
+                <w:bCs w:val="0"/>
+                <w:color w:val="000000"/>
+                <w:kern w:val="0"/>
+                <w:u w:color="000000"/>
+                <w:lang w:val="es-ES_tradnl"/>
+              </w:rPr>
+            </w:pPr>
+            <w:r>
+              <w:rPr>
+                <w:rFonts w:asciiTheme="minorHAnsi" w:eastAsia="Arial Unicode MS" w:hAnsiTheme="minorHAnsi" w:cstheme="minorHAnsi"/>
+                <w:b w:val="0"/>
+                <w:bCs w:val="0"/>
+                <w:color w:val="000000"/>
+                <w:kern w:val="0"/>
+                <w:u w:color="000000"/>
+                <w:lang w:val="es-ES_tradnl"/>
+              </w:rPr>
+              <w:t>validación final de los estándares de sostenibilidad de los recursos</w:t>
+            </w:r>
+          </w:p>
+        </w:tc>
+      </w:tr>
+      <w:tr>
+        <w:tc>
+          <w:tcPr>
+            <w:tcW w:w="2547" w:type="dxa"/>
+            <w:tcBorders>
+              <w:top w:val="single" w:sz="4" w:space="0" w:color="auto"/>
+              <w:left w:val="single" w:sz="4" w:space="0" w:color="auto"/>
+              <w:bottom w:val="single" w:sz="4" w:space="0" w:color="auto"/>
+              <w:right w:val="single" w:sz="4" w:space="0" w:color="auto"/>
+            </w:tcBorders>
+            <w:shd w:val="clear" w:color="auto" w:fill="BDD6EE"/>
+            <w:noWrap/>
+            <w:hideMark/>
+          </w:tcPr>
+          <w:p>
+            <w:pPr>
+              <w:pStyle w:val="Ttulo11"/>
+              <w:pBdr>
+                <w:top w:val="single" w:sz="4" w:space="1" w:color="auto"/>
+              </w:pBdr>
+              <w:rPr>
+                <w:rFonts w:asciiTheme="minorHAnsi" w:eastAsia="Arial Unicode MS" w:hAnsiTheme="minorHAnsi" w:cstheme="minorHAnsi"/>
+              </w:rPr>
+            </w:pPr>
+            <w:r>
+              <w:rPr>
+                <w:rFonts w:asciiTheme="minorHAnsi" w:eastAsia="Arial Unicode MS" w:hAnsiTheme="minorHAnsi" w:cstheme="minorHAnsi"/>
+              </w:rPr>
+              <w:t>Evaluación</w:t>
+            </w:r>
+          </w:p>
+        </w:tc>
+        <w:tc>
+          <w:tcPr>
+            <w:tcW w:w="2264" w:type="dxa"/>
+            <w:tcBorders>
+              <w:top w:val="single" w:sz="4" w:space="0" w:color="auto"/>
+              <w:left w:val="single" w:sz="4" w:space="0" w:color="auto"/>
+              <w:bottom w:val="single" w:sz="4" w:space="0" w:color="auto"/>
+              <w:right w:val="single" w:sz="4" w:space="0" w:color="auto"/>
+            </w:tcBorders>
+            <w:hideMark/>
+          </w:tcPr>
+          <w:p>
+            <w:pPr>
+              <w:pStyle w:val="Ttulo11"/>
+              <w:pBdr>
+                <w:top w:val="single" w:sz="4" w:space="1" w:color="auto"/>
+              </w:pBdr>
+              <w:rPr>
+                <w:rFonts w:asciiTheme="minorHAnsi" w:eastAsia="Arial Unicode MS" w:hAnsiTheme="minorHAnsi" w:cstheme="minorHAnsi"/>
+                <w:b w:val="0"/>
+                <w:bCs w:val="0"/>
+                <w:color w:val="000000"/>
+                <w:kern w:val="0"/>
+                <w:u w:color="000000"/>
+                <w:lang w:val="es-ES_tradnl"/>
+              </w:rPr>
+            </w:pPr>
+            <w:r>
+              <w:rPr>
+                <w:rFonts w:asciiTheme="minorHAnsi" w:eastAsia="Arial Unicode MS" w:hAnsiTheme="minorHAnsi" w:cstheme="minorHAnsi"/>
+                <w:b w:val="0"/>
+                <w:bCs w:val="0"/>
+                <w:color w:val="000000"/>
+                <w:kern w:val="0"/>
+                <w:u w:color="000000"/>
+                <w:lang w:val="es-ES_tradnl"/>
+              </w:rPr>
+              <w:t>Evaluación inicial</w:t>
+            </w:r>
+          </w:p>
+        </w:tc>
+        <w:tc>
+          <w:tcPr>
+            <w:tcW w:w="2264" w:type="dxa"/>
+            <w:tcBorders>
+              <w:top w:val="single" w:sz="4" w:space="0" w:color="auto"/>
+              <w:left w:val="single" w:sz="4" w:space="0" w:color="auto"/>
+              <w:bottom w:val="single" w:sz="4" w:space="0" w:color="auto"/>
+              <w:right w:val="single" w:sz="4" w:space="0" w:color="auto"/>
+            </w:tcBorders>
+            <w:hideMark/>
+          </w:tcPr>
+          <w:p>
+            <w:pPr>
+              <w:pStyle w:val="Ttulo11"/>
+              <w:pBdr>
+                <w:top w:val="single" w:sz="4" w:space="1" w:color="auto"/>
+              </w:pBdr>
+              <w:rPr>
+                <w:rFonts w:asciiTheme="minorHAnsi" w:eastAsia="Arial Unicode MS" w:hAnsiTheme="minorHAnsi" w:cstheme="minorHAnsi"/>
+                <w:b w:val="0"/>
+                <w:bCs w:val="0"/>
+                <w:color w:val="000000"/>
+                <w:kern w:val="0"/>
+                <w:u w:color="000000"/>
+                <w:lang w:val="es-ES_tradnl"/>
+              </w:rPr>
+            </w:pPr>
+            <w:r>
+              <w:rPr>
+                <w:rFonts w:asciiTheme="minorHAnsi" w:eastAsia="Arial Unicode MS" w:hAnsiTheme="minorHAnsi" w:cstheme="minorHAnsi"/>
+                <w:b w:val="0"/>
+                <w:bCs w:val="0"/>
+                <w:color w:val="000000"/>
+                <w:kern w:val="0"/>
+                <w:u w:color="000000"/>
+                <w:lang w:val="es-ES_tradnl"/>
+              </w:rPr>
+              <w:t>Evaluación intermedia</w:t>
+            </w:r>
+          </w:p>
+        </w:tc>
+        <w:tc>
+          <w:tcPr>
+            <w:tcW w:w="2265" w:type="dxa"/>
+            <w:tcBorders>
+              <w:top w:val="single" w:sz="4" w:space="0" w:color="auto"/>
+              <w:left w:val="single" w:sz="4" w:space="0" w:color="auto"/>
+              <w:bottom w:val="single" w:sz="4" w:space="0" w:color="auto"/>
+              <w:right w:val="single" w:sz="4" w:space="0" w:color="auto"/>
+            </w:tcBorders>
+            <w:hideMark/>
+          </w:tcPr>
+          <w:p>
+            <w:pPr>
+              <w:pStyle w:val="Ttulo11"/>
+              <w:pBdr>
+                <w:top w:val="single" w:sz="4" w:space="1" w:color="auto"/>
+              </w:pBdr>
+              <w:rPr>
+                <w:rFonts w:asciiTheme="minorHAnsi" w:eastAsia="Arial Unicode MS" w:hAnsiTheme="minorHAnsi" w:cstheme="minorHAnsi"/>
+                <w:b w:val="0"/>
+                <w:bCs w:val="0"/>
+                <w:color w:val="000000"/>
+                <w:kern w:val="0"/>
+                <w:u w:color="000000"/>
+                <w:lang w:val="es-ES_tradnl"/>
+              </w:rPr>
+            </w:pPr>
+            <w:r>
+              <w:rPr>
+                <w:rFonts w:asciiTheme="minorHAnsi" w:eastAsia="Arial Unicode MS" w:hAnsiTheme="minorHAnsi" w:cstheme="minorHAnsi"/>
+                <w:b w:val="0"/>
+                <w:bCs w:val="0"/>
+                <w:color w:val="000000"/>
+                <w:kern w:val="0"/>
+                <w:u w:color="000000"/>
+                <w:lang w:val="es-ES_tradnl"/>
+              </w:rPr>
+              <w:t>Validación final e hipótesis</w:t>
+            </w:r>
+          </w:p>
+        </w:tc>
+      </w:tr>
+      <w:tr>
+        <w:tc>
+          <w:tcPr>
+            <w:tcW w:w="2547" w:type="dxa"/>
+            <w:tcBorders>
+              <w:top w:val="single" w:sz="4" w:space="0" w:color="auto"/>
+              <w:left w:val="single" w:sz="4" w:space="0" w:color="auto"/>
+              <w:bottom w:val="single" w:sz="4" w:space="0" w:color="auto"/>
+              <w:right w:val="single" w:sz="4" w:space="0" w:color="auto"/>
+            </w:tcBorders>
+            <w:shd w:val="clear" w:color="auto" w:fill="BDD6EE"/>
+            <w:noWrap/>
+            <w:hideMark/>
+          </w:tcPr>
+          <w:p>
+            <w:pPr>
+              <w:pStyle w:val="Ttulo11"/>
+              <w:pBdr>
+                <w:top w:val="single" w:sz="4" w:space="1" w:color="auto"/>
+              </w:pBdr>
+              <w:rPr>
+                <w:rFonts w:asciiTheme="minorHAnsi" w:eastAsia="Arial Unicode MS" w:hAnsiTheme="minorHAnsi" w:cstheme="minorHAnsi"/>
+              </w:rPr>
+            </w:pPr>
+            <w:r>
+              <w:rPr>
+                <w:rFonts w:asciiTheme="minorHAnsi" w:eastAsia="Arial Unicode MS" w:hAnsiTheme="minorHAnsi" w:cstheme="minorHAnsi"/>
+              </w:rPr>
+              <w:t>Transferencia de resultados</w:t>
+            </w:r>
+          </w:p>
+        </w:tc>
+        <w:tc>
+          <w:tcPr>
+            <w:tcW w:w="2264" w:type="dxa"/>
+            <w:tcBorders>
+              <w:top w:val="single" w:sz="4" w:space="0" w:color="auto"/>
+              <w:left w:val="single" w:sz="4" w:space="0" w:color="auto"/>
+              <w:bottom w:val="single" w:sz="4" w:space="0" w:color="auto"/>
+              <w:right w:val="single" w:sz="4" w:space="0" w:color="auto"/>
+            </w:tcBorders>
+          </w:tcPr>
+          <w:p>
+            <w:pPr>
+              <w:pStyle w:val="Ttulo11"/>
+              <w:pBdr>
+                <w:top w:val="single" w:sz="4" w:space="1" w:color="auto"/>
+              </w:pBdr>
+              <w:rPr>
+                <w:rFonts w:asciiTheme="minorHAnsi" w:eastAsia="Arial Unicode MS" w:hAnsiTheme="minorHAnsi" w:cstheme="minorHAnsi"/>
+                <w:b w:val="0"/>
+                <w:bCs w:val="0"/>
+                <w:color w:val="000000"/>
+                <w:kern w:val="0"/>
+                <w:u w:color="000000"/>
+                <w:lang w:val="es-ES_tradnl"/>
+              </w:rPr>
+            </w:pPr>
+            <w:r>
+              <w:rPr>
+                <w:rFonts w:asciiTheme="minorHAnsi" w:eastAsia="Arial Unicode MS" w:hAnsiTheme="minorHAnsi" w:cstheme="minorHAnsi"/>
+                <w:b w:val="0"/>
+                <w:bCs w:val="0"/>
+                <w:color w:val="000000"/>
+                <w:kern w:val="0"/>
+                <w:u w:color="000000"/>
+                <w:lang w:val="es-ES_tradnl"/>
+              </w:rPr>
+              <w:t xml:space="preserve">Compartición </w:t>
+            </w:r>
+            <w:r>
+              <w:rPr>
+                <w:rFonts w:asciiTheme="minorHAnsi" w:eastAsia="Arial Unicode MS" w:hAnsiTheme="minorHAnsi" w:cstheme="minorHAnsi"/>
+                <w:b w:val="0"/>
+                <w:bCs w:val="0"/>
+                <w:color w:val="000000"/>
+                <w:kern w:val="0"/>
+                <w:u w:color="000000"/>
+                <w:lang w:val="es-ES_tradnl"/>
+              </w:rPr>
+              <w:t>de resultados preliminares en conferencias especializadas</w:t>
+            </w:r>
+          </w:p>
+        </w:tc>
+        <w:tc>
+          <w:tcPr>
+            <w:tcW w:w="2264" w:type="dxa"/>
+            <w:tcBorders>
+              <w:top w:val="single" w:sz="4" w:space="0" w:color="auto"/>
+              <w:left w:val="single" w:sz="4" w:space="0" w:color="auto"/>
+              <w:bottom w:val="single" w:sz="4" w:space="0" w:color="auto"/>
+              <w:right w:val="single" w:sz="4" w:space="0" w:color="auto"/>
+            </w:tcBorders>
+          </w:tcPr>
+          <w:p>
+            <w:pPr>
+              <w:pStyle w:val="Ttulo11"/>
+              <w:pBdr>
+                <w:top w:val="single" w:sz="4" w:space="1" w:color="auto"/>
+              </w:pBdr>
+              <w:rPr>
+                <w:rFonts w:asciiTheme="minorHAnsi" w:eastAsia="Arial Unicode MS" w:hAnsiTheme="minorHAnsi" w:cstheme="minorHAnsi"/>
+                <w:b w:val="0"/>
+                <w:bCs w:val="0"/>
+                <w:color w:val="000000"/>
+                <w:kern w:val="0"/>
+                <w:u w:color="000000"/>
+                <w:lang w:val="es-ES_tradnl"/>
+              </w:rPr>
+            </w:pPr>
+            <w:r>
+              <w:rPr>
+                <w:rFonts w:asciiTheme="minorHAnsi" w:eastAsia="Arial Unicode MS" w:hAnsiTheme="minorHAnsi" w:cstheme="minorHAnsi"/>
+                <w:b w:val="0"/>
+                <w:bCs w:val="0"/>
+                <w:color w:val="000000"/>
+                <w:kern w:val="0"/>
+                <w:u w:color="000000"/>
+                <w:lang w:val="es-ES_tradnl"/>
+              </w:rPr>
+              <w:t>Desarrollo de prototipos experimentales y su presentación.</w:t>
+            </w:r>
+          </w:p>
+        </w:tc>
+        <w:tc>
+          <w:tcPr>
+            <w:tcW w:w="2265" w:type="dxa"/>
+            <w:tcBorders>
+              <w:top w:val="single" w:sz="4" w:space="0" w:color="auto"/>
+              <w:left w:val="single" w:sz="4" w:space="0" w:color="auto"/>
+              <w:bottom w:val="single" w:sz="4" w:space="0" w:color="auto"/>
+              <w:right w:val="single" w:sz="4" w:space="0" w:color="auto"/>
+            </w:tcBorders>
+            <w:hideMark/>
+          </w:tcPr>
+          <w:p>
+            <w:pPr>
+              <w:pStyle w:val="Ttulo11"/>
+              <w:pBdr>
+                <w:top w:val="single" w:sz="4" w:space="1" w:color="auto"/>
+              </w:pBdr>
+              <w:rPr>
+                <w:rFonts w:asciiTheme="minorHAnsi" w:eastAsia="Arial Unicode MS" w:hAnsiTheme="minorHAnsi" w:cstheme="minorHAnsi"/>
+                <w:b w:val="0"/>
+                <w:bCs w:val="0"/>
+                <w:color w:val="000000"/>
+                <w:kern w:val="0"/>
+                <w:u w:color="000000"/>
+                <w:lang w:val="es-ES_tradnl"/>
+              </w:rPr>
+            </w:pPr>
+            <w:r>
+              <w:rPr>
+                <w:rFonts w:asciiTheme="minorHAnsi" w:eastAsia="Arial Unicode MS" w:hAnsiTheme="minorHAnsi" w:cstheme="minorHAnsi"/>
+                <w:b w:val="0"/>
+                <w:bCs w:val="0"/>
+                <w:color w:val="000000"/>
+                <w:kern w:val="0"/>
+                <w:u w:color="000000"/>
+                <w:lang w:val="es-ES_tradnl"/>
+              </w:rPr>
+              <w:t>Guías, plantillas y difusión</w:t>
+            </w:r>
+          </w:p>
+        </w:tc>
+      </w:tr>
+      <w:tr>
+        <w:tc>
+          <w:tcPr>
+            <w:tcW w:w="2547" w:type="dxa"/>
+            <w:tcBorders>
+              <w:top w:val="single" w:sz="4" w:space="0" w:color="auto"/>
+              <w:left w:val="single" w:sz="4" w:space="0" w:color="auto"/>
+              <w:bottom w:val="single" w:sz="4" w:space="0" w:color="auto"/>
+              <w:right w:val="single" w:sz="4" w:space="0" w:color="auto"/>
+            </w:tcBorders>
+            <w:shd w:val="clear" w:color="auto" w:fill="BDD6EE"/>
+            <w:noWrap/>
+            <w:hideMark/>
+          </w:tcPr>
+          <w:p>
+            <w:pPr>
+              <w:pStyle w:val="Ttulo11"/>
+              <w:pBdr>
+                <w:top w:val="single" w:sz="4" w:space="1" w:color="auto"/>
+              </w:pBdr>
+              <w:rPr>
+                <w:rFonts w:asciiTheme="minorHAnsi" w:eastAsia="Arial Unicode MS" w:hAnsiTheme="minorHAnsi" w:cstheme="minorHAnsi"/>
+              </w:rPr>
+            </w:pPr>
+            <w:r>
+              <w:rPr>
+                <w:rFonts w:asciiTheme="minorHAnsi" w:eastAsia="Arial Unicode MS" w:hAnsiTheme="minorHAnsi" w:cstheme="minorHAnsi"/>
+              </w:rPr>
+              <w:t>Redacción y defensa de tesis</w:t>
+            </w:r>
+          </w:p>
+        </w:tc>
+        <w:tc>
+          <w:tcPr>
+            <w:tcW w:w="2264" w:type="dxa"/>
+            <w:tcBorders>
+              <w:top w:val="single" w:sz="4" w:space="0" w:color="auto"/>
+              <w:left w:val="single" w:sz="4" w:space="0" w:color="auto"/>
+              <w:bottom w:val="single" w:sz="4" w:space="0" w:color="auto"/>
+              <w:right w:val="single" w:sz="4" w:space="0" w:color="auto"/>
+            </w:tcBorders>
+          </w:tcPr>
+          <w:p>
+            <w:pPr>
+              <w:pStyle w:val="Ttulo11"/>
+              <w:pBdr>
+                <w:top w:val="single" w:sz="4" w:space="1" w:color="auto"/>
+              </w:pBdr>
+              <w:rPr>
+                <w:rFonts w:asciiTheme="minorHAnsi" w:eastAsia="Arial Unicode MS" w:hAnsiTheme="minorHAnsi" w:cstheme="minorHAnsi"/>
+                <w:b w:val="0"/>
+                <w:bCs w:val="0"/>
+                <w:color w:val="000000"/>
+                <w:kern w:val="0"/>
+                <w:u w:color="000000"/>
+                <w:lang w:val="es-ES_tradnl"/>
+              </w:rPr>
+            </w:pPr>
+            <w:r>
+              <w:rPr>
+                <w:rFonts w:asciiTheme="minorHAnsi" w:eastAsia="Arial Unicode MS" w:hAnsiTheme="minorHAnsi" w:cstheme="minorHAnsi"/>
+                <w:b w:val="0"/>
+                <w:bCs w:val="0"/>
+                <w:color w:val="000000"/>
+                <w:kern w:val="0"/>
+                <w:u w:color="000000"/>
+                <w:lang w:val="es-ES_tradnl"/>
+              </w:rPr>
+              <w:t>Elaboración de la propuesta de investigación</w:t>
+            </w:r>
+          </w:p>
+        </w:tc>
+        <w:tc>
+          <w:tcPr>
+            <w:tcW w:w="2264" w:type="dxa"/>
+            <w:tcBorders>
+              <w:top w:val="single" w:sz="4" w:space="0" w:color="auto"/>
+              <w:left w:val="single" w:sz="4" w:space="0" w:color="auto"/>
+              <w:bottom w:val="single" w:sz="4" w:space="0" w:color="auto"/>
+              <w:right w:val="single" w:sz="4" w:space="0" w:color="auto"/>
+            </w:tcBorders>
+          </w:tcPr>
+          <w:p>
+            <w:pPr>
+              <w:pStyle w:val="Ttulo11"/>
+              <w:pBdr>
+                <w:top w:val="single" w:sz="4" w:space="1" w:color="auto"/>
+              </w:pBdr>
+              <w:rPr>
+                <w:rFonts w:asciiTheme="minorHAnsi" w:eastAsia="Arial Unicode MS" w:hAnsiTheme="minorHAnsi" w:cstheme="minorHAnsi"/>
+                <w:b w:val="0"/>
+                <w:bCs w:val="0"/>
+                <w:color w:val="000000"/>
+                <w:kern w:val="0"/>
+                <w:u w:color="000000"/>
+                <w:lang w:val="es-ES_tradnl"/>
+              </w:rPr>
+            </w:pPr>
+            <w:r>
+              <w:rPr>
+                <w:rFonts w:asciiTheme="minorHAnsi" w:eastAsia="Arial Unicode MS" w:hAnsiTheme="minorHAnsi" w:cstheme="minorHAnsi"/>
+                <w:b w:val="0"/>
+                <w:bCs w:val="0"/>
+                <w:color w:val="000000"/>
+                <w:kern w:val="0"/>
+                <w:u w:color="000000"/>
+                <w:lang w:val="es-ES_tradnl"/>
+              </w:rPr>
+              <w:t xml:space="preserve">Escribir de los capítulos </w:t>
+            </w:r>
+            <w:r>
+              <w:rPr>
+                <w:rFonts w:asciiTheme="minorHAnsi" w:eastAsia="Arial Unicode MS" w:hAnsiTheme="minorHAnsi" w:cstheme="minorHAnsi"/>
+                <w:b w:val="0"/>
+                <w:bCs w:val="0"/>
+                <w:color w:val="000000"/>
+                <w:kern w:val="0"/>
+                <w:u w:color="000000"/>
+                <w:lang w:val="es-ES_tradnl"/>
+              </w:rPr>
+              <w:lastRenderedPageBreak/>
+              <w:t>metodológico y experimental</w:t>
+            </w:r>
+          </w:p>
+        </w:tc>
+        <w:tc>
+          <w:tcPr>
+            <w:tcW w:w="2265" w:type="dxa"/>
+            <w:tcBorders>
+              <w:top w:val="single" w:sz="4" w:space="0" w:color="auto"/>
+              <w:left w:val="single" w:sz="4" w:space="0" w:color="auto"/>
+              <w:bottom w:val="single" w:sz="4" w:space="0" w:color="auto"/>
+              <w:right w:val="single" w:sz="4" w:space="0" w:color="auto"/>
+            </w:tcBorders>
+            <w:hideMark/>
+          </w:tcPr>
+          <w:p>
+            <w:pPr>
+              <w:pStyle w:val="Ttulo11"/>
+              <w:pBdr>
+                <w:top w:val="single" w:sz="4" w:space="1" w:color="auto"/>
+              </w:pBdr>
+              <w:rPr>
+                <w:rFonts w:asciiTheme="minorHAnsi" w:eastAsia="Arial Unicode MS" w:hAnsiTheme="minorHAnsi" w:cstheme="minorHAnsi"/>
+                <w:b w:val="0"/>
+                <w:bCs w:val="0"/>
+                <w:color w:val="000000"/>
+                <w:kern w:val="0"/>
+                <w:u w:color="000000"/>
+                <w:lang w:val="es-ES_tradnl"/>
+              </w:rPr>
+            </w:pPr>
+            <w:r>
+              <w:rPr>
+                <w:rFonts w:asciiTheme="minorHAnsi" w:eastAsia="Arial Unicode MS" w:hAnsiTheme="minorHAnsi" w:cstheme="minorHAnsi"/>
+                <w:b w:val="0"/>
+                <w:bCs w:val="0"/>
+                <w:color w:val="000000"/>
+                <w:kern w:val="0"/>
+                <w:u w:color="000000"/>
+                <w:lang w:val="es-ES_tradnl"/>
+              </w:rPr>
+              <w:lastRenderedPageBreak/>
+              <w:t>Memoria final y defensa</w:t>
+            </w:r>
+          </w:p>
+        </w:tc>
+      </w:tr>
+    </w:tbl>
+    <w:p>
+      <w:pPr>
+        <w:pStyle w:val="Ttulo11"/>
+        <w:pBdr>
+          <w:top w:val="single" w:sz="4" w:space="1" w:color="auto"/>
+        </w:pBdr>
+        <w:jc w:val="left"/>
+        <w:rPr>
+          <w:rFonts w:asciiTheme="minorHAnsi" w:eastAsia="Arial Unicode MS" w:hAnsiTheme="minorHAnsi" w:cstheme="minorHAnsi"/>
+          <w:b w:val="0"/>
+          <w:bCs w:val="0"/>
+          <w:color w:val="000000"/>
+          <w:kern w:val="0"/>
+          <w:u w:color="000000"/>
+          <w:lang w:val="es-ES_tradnl"/>
         </w:rPr>
       </w:pPr>
     </w:p>
@@ -4809,29 +6968,17 @@
         <w:pBdr>
           <w:top w:val="single" w:sz="4" w:space="1" w:color="auto"/>
         </w:pBdr>
-        <w:rPr>
-          <w:rFonts w:asciiTheme="minorHAnsi" w:hAnsiTheme="minorHAnsi" w:cstheme="minorHAnsi"/>
+        <w:jc w:val="left"/>
+        <w:rPr>
+          <w:rFonts w:asciiTheme="minorHAnsi" w:eastAsia="Arial Unicode MS" w:hAnsiTheme="minorHAnsi" w:cstheme="minorHAnsi"/>
+          <w:b w:val="0"/>
+          <w:bCs w:val="0"/>
+          <w:color w:val="000000"/>
+          <w:kern w:val="0"/>
+          <w:u w:color="000000"/>
+          <w:lang w:val="es-ES_tradnl"/>
         </w:rPr>
       </w:pPr>
-      <w:r>
-        <w:rPr>
-          <w:rFonts w:asciiTheme="minorHAnsi" w:hAnsiTheme="minorHAnsi" w:cstheme="minorHAnsi"/>
-        </w:rPr>
-        <w:t>Medios y financiación</w:t>
-      </w:r>
-    </w:p>
-    <w:p>
-      <w:pPr>
-        <w:pStyle w:val="Default"/>
-        <w:ind w:firstLine="0"/>
-        <w:rPr>
-          <w:rStyle w:val="Ninguno"/>
-          <w:rFonts w:asciiTheme="minorHAnsi" w:hAnsiTheme="minorHAnsi" w:cstheme="minorHAnsi"/>
-        </w:rPr>
-      </w:pPr>
-      <w:r>
-        <w:br/>
-      </w:r>
     </w:p>
     <w:p>
       <w:pPr>
@@ -4840,25 +6987,540 @@
           <w:top w:val="single" w:sz="4" w:space="1" w:color="auto"/>
         </w:pBdr>
         <w:rPr>
-          <w:rFonts w:asciiTheme="minorHAnsi" w:hAnsiTheme="minorHAnsi" w:cstheme="minorHAnsi"/>
+          <w:rFonts w:asciiTheme="minorHAnsi" w:eastAsia="Arial Unicode MS" w:hAnsiTheme="minorHAnsi" w:cstheme="minorHAnsi"/>
+          <w:b w:val="0"/>
+          <w:bCs w:val="0"/>
+          <w:color w:val="000000"/>
+          <w:kern w:val="0"/>
+          <w:u w:color="000000"/>
+          <w:rtl/>
+          <w:lang w:val="es-ES_tradnl"/>
         </w:rPr>
       </w:pPr>
-      <w:r>
-        <w:rPr>
-          <w:rFonts w:asciiTheme="minorHAnsi" w:hAnsiTheme="minorHAnsi" w:cstheme="minorHAnsi"/>
-        </w:rPr>
-        <w:t>Referencias bibliográficas</w:t>
-      </w:r>
+    </w:p>
+    <w:p>
+      <w:pPr>
+        <w:pStyle w:val="Ttulo11"/>
+        <w:pBdr>
+          <w:top w:val="single" w:sz="4" w:space="1" w:color="auto"/>
+        </w:pBdr>
+        <w:rPr>
+          <w:rFonts w:asciiTheme="minorHAnsi" w:hAnsiTheme="minorHAnsi" w:cstheme="minorHAnsi"/>
+          <w:lang w:val="es-ES_tradnl"/>
+        </w:rPr>
+      </w:pPr>
     </w:p>
     <w:p>
       <w:pPr>
         <w:pStyle w:val="Default"/>
         <w:ind w:firstLine="0"/>
         <w:rPr>
-          <w:rFonts w:asciiTheme="minorHAnsi" w:hAnsiTheme="minorHAnsi" w:cstheme="minorHAnsi"/>
-          <w:sz w:val="22"/>
-          <w:szCs w:val="22"/>
-          <w:lang w:val="en-US"/>
+          <w:rStyle w:val="Ninguno"/>
+          <w:rFonts w:asciiTheme="minorHAnsi" w:eastAsia="Calibri" w:hAnsiTheme="minorHAnsi" w:cstheme="minorHAnsi"/>
+          <w:sz w:val="22"/>
+          <w:szCs w:val="22"/>
+          <w:lang w:val="es-ES"/>
+        </w:rPr>
+      </w:pPr>
+    </w:p>
+    <w:p>
+      <w:pPr>
+        <w:pStyle w:val="Ttulo11"/>
+        <w:pBdr>
+          <w:top w:val="single" w:sz="4" w:space="1" w:color="auto"/>
+        </w:pBdr>
+        <w:rPr>
+          <w:rFonts w:asciiTheme="minorHAnsi" w:hAnsiTheme="minorHAnsi" w:cstheme="minorHAnsi"/>
+        </w:rPr>
+      </w:pPr>
+      <w:r>
+        <w:rPr>
+          <w:rFonts w:asciiTheme="minorHAnsi" w:hAnsiTheme="minorHAnsi" w:cstheme="minorHAnsi"/>
+        </w:rPr>
+        <w:t>Medios y financiación</w:t>
+      </w:r>
+    </w:p>
+    <w:p>
+      <w:pPr>
+        <w:pStyle w:val="Default"/>
+        <w:ind w:firstLine="0"/>
+        <w:rPr>
+          <w:rFonts w:asciiTheme="minorHAnsi" w:hAnsiTheme="minorHAnsi" w:cstheme="minorHAnsi"/>
+          <w:sz w:val="22"/>
+          <w:szCs w:val="22"/>
+        </w:rPr>
+      </w:pPr>
+      <w:r>
+        <w:rPr>
+          <w:rFonts w:asciiTheme="minorHAnsi" w:hAnsiTheme="minorHAnsi" w:cstheme="minorHAnsi"/>
+          <w:sz w:val="22"/>
+          <w:szCs w:val="22"/>
+        </w:rPr>
+        <w:t>Para ejecutar las tareas</w:t>
+      </w:r>
+      <w:r>
+        <w:rPr>
+          <w:rFonts w:asciiTheme="minorHAnsi" w:hAnsiTheme="minorHAnsi" w:cstheme="minorHAnsi"/>
+          <w:sz w:val="22"/>
+          <w:szCs w:val="22"/>
+        </w:rPr>
+        <w:t xml:space="preserve"> </w:t>
+      </w:r>
+      <w:r>
+        <w:rPr>
+          <w:rFonts w:asciiTheme="minorHAnsi" w:hAnsiTheme="minorHAnsi" w:cstheme="minorHAnsi"/>
+          <w:sz w:val="22"/>
+          <w:szCs w:val="22"/>
+        </w:rPr>
+        <w:t xml:space="preserve">requeridas, el doctorando </w:t>
+      </w:r>
+      <w:r>
+        <w:rPr>
+          <w:rFonts w:asciiTheme="minorHAnsi" w:hAnsiTheme="minorHAnsi" w:cstheme="minorHAnsi"/>
+          <w:sz w:val="22"/>
+          <w:szCs w:val="22"/>
+        </w:rPr>
+        <w:t>tiene accesos</w:t>
+      </w:r>
+      <w:r>
+        <w:rPr>
+          <w:rFonts w:asciiTheme="minorHAnsi" w:hAnsiTheme="minorHAnsi" w:cstheme="minorHAnsi"/>
+          <w:sz w:val="22"/>
+          <w:szCs w:val="22"/>
+        </w:rPr>
+        <w:t xml:space="preserve"> a la </w:t>
+      </w:r>
+      <w:r>
+        <w:rPr>
+          <w:rFonts w:asciiTheme="minorHAnsi" w:hAnsiTheme="minorHAnsi" w:cstheme="minorHAnsi"/>
+          <w:sz w:val="22"/>
+          <w:szCs w:val="22"/>
+        </w:rPr>
+        <w:t xml:space="preserve">infraestructura tecnológica </w:t>
+      </w:r>
+      <w:r>
+        <w:rPr>
+          <w:rFonts w:asciiTheme="minorHAnsi" w:hAnsiTheme="minorHAnsi" w:cstheme="minorHAnsi"/>
+          <w:sz w:val="22"/>
+          <w:szCs w:val="22"/>
+        </w:rPr>
+        <w:t>avanzadas integradas en su entorno profesiona</w:t>
+      </w:r>
+      <w:r>
+        <w:rPr>
+          <w:rFonts w:asciiTheme="minorHAnsi" w:hAnsiTheme="minorHAnsi" w:cstheme="minorHAnsi"/>
+          <w:sz w:val="22"/>
+          <w:szCs w:val="22"/>
+        </w:rPr>
+        <w:t xml:space="preserve">l que es </w:t>
+      </w:r>
+      <w:r>
+        <w:rPr>
+          <w:rFonts w:asciiTheme="minorHAnsi" w:hAnsiTheme="minorHAnsi" w:cstheme="minorHAnsi"/>
+          <w:sz w:val="22"/>
+          <w:szCs w:val="22"/>
+        </w:rPr>
+        <w:t xml:space="preserve">necesaria </w:t>
+      </w:r>
+      <w:r>
+        <w:rPr>
+          <w:rFonts w:asciiTheme="minorHAnsi" w:hAnsiTheme="minorHAnsi" w:cstheme="minorHAnsi"/>
+          <w:sz w:val="22"/>
+          <w:szCs w:val="22"/>
+        </w:rPr>
+        <w:t xml:space="preserve">para el proceso del </w:t>
+      </w:r>
+      <w:r>
+        <w:rPr>
+          <w:rFonts w:asciiTheme="minorHAnsi" w:hAnsiTheme="minorHAnsi" w:cstheme="minorHAnsi"/>
+          <w:sz w:val="22"/>
+          <w:szCs w:val="22"/>
+        </w:rPr>
+        <w:t>B</w:t>
+      </w:r>
+      <w:r>
+        <w:rPr>
+          <w:rFonts w:asciiTheme="minorHAnsi" w:hAnsiTheme="minorHAnsi" w:cstheme="minorHAnsi"/>
+          <w:sz w:val="22"/>
+          <w:szCs w:val="22"/>
+        </w:rPr>
+        <w:t xml:space="preserve">ig data y la simulación </w:t>
+      </w:r>
+      <w:r>
+        <w:rPr>
+          <w:rFonts w:asciiTheme="minorHAnsi" w:hAnsiTheme="minorHAnsi" w:cstheme="minorHAnsi"/>
+          <w:sz w:val="22"/>
+          <w:szCs w:val="22"/>
+        </w:rPr>
+        <w:t>s</w:t>
+      </w:r>
+      <w:r>
+        <w:rPr>
+          <w:rFonts w:asciiTheme="minorHAnsi" w:hAnsiTheme="minorHAnsi" w:cstheme="minorHAnsi"/>
+          <w:sz w:val="22"/>
+          <w:szCs w:val="22"/>
+        </w:rPr>
+        <w:t>e cuenta con recursos de computación en la nube de</w:t>
+      </w:r>
+      <w:r>
+        <w:rPr>
+          <w:rFonts w:asciiTheme="minorHAnsi" w:hAnsiTheme="minorHAnsi" w:cstheme="minorHAnsi"/>
+          <w:sz w:val="22"/>
+          <w:szCs w:val="22"/>
+        </w:rPr>
+        <w:t xml:space="preserve"> </w:t>
+      </w:r>
+      <w:r>
+        <w:rPr>
+          <w:rFonts w:asciiTheme="minorHAnsi" w:hAnsiTheme="minorHAnsi" w:cstheme="minorHAnsi"/>
+          <w:sz w:val="22"/>
+          <w:szCs w:val="22"/>
+        </w:rPr>
+        <w:t>Amazon Web Services (AWS), específicamente AWS ECS, S3 y RDS</w:t>
+      </w:r>
+      <w:r>
+        <w:rPr>
+          <w:rFonts w:asciiTheme="minorHAnsi" w:hAnsiTheme="minorHAnsi" w:cstheme="minorHAnsi"/>
+          <w:sz w:val="22"/>
+          <w:szCs w:val="22"/>
+        </w:rPr>
+        <w:t xml:space="preserve">. </w:t>
+      </w:r>
+      <w:r>
+        <w:rPr>
+          <w:rFonts w:asciiTheme="minorHAnsi" w:hAnsiTheme="minorHAnsi" w:cstheme="minorHAnsi"/>
+          <w:sz w:val="22"/>
+          <w:szCs w:val="22"/>
+        </w:rPr>
+        <w:t xml:space="preserve">Estos medios </w:t>
+      </w:r>
+      <w:r>
+        <w:rPr>
+          <w:rFonts w:asciiTheme="minorHAnsi" w:hAnsiTheme="minorHAnsi" w:cstheme="minorHAnsi"/>
+          <w:sz w:val="22"/>
+          <w:szCs w:val="22"/>
+        </w:rPr>
+        <w:t>serán suficientes para implementar</w:t>
+      </w:r>
+      <w:r>
+        <w:rPr>
+          <w:rFonts w:asciiTheme="minorHAnsi" w:hAnsiTheme="minorHAnsi" w:cstheme="minorHAnsi"/>
+          <w:sz w:val="22"/>
+          <w:szCs w:val="22"/>
+        </w:rPr>
+        <w:t xml:space="preserve"> y probar </w:t>
+      </w:r>
+      <w:r>
+        <w:rPr>
+          <w:rFonts w:asciiTheme="minorHAnsi" w:hAnsiTheme="minorHAnsi" w:cstheme="minorHAnsi"/>
+          <w:sz w:val="22"/>
+          <w:szCs w:val="22"/>
+        </w:rPr>
+        <w:t xml:space="preserve">los modelos </w:t>
+      </w:r>
+      <w:r>
+        <w:rPr>
+          <w:rFonts w:asciiTheme="minorHAnsi" w:hAnsiTheme="minorHAnsi" w:cstheme="minorHAnsi"/>
+          <w:sz w:val="22"/>
+          <w:szCs w:val="22"/>
+        </w:rPr>
+        <w:t xml:space="preserve">predictivos </w:t>
+      </w:r>
+      <w:r>
+        <w:rPr>
+          <w:rFonts w:asciiTheme="minorHAnsi" w:hAnsiTheme="minorHAnsi" w:cstheme="minorHAnsi"/>
+          <w:sz w:val="22"/>
+          <w:szCs w:val="22"/>
+        </w:rPr>
+        <w:t>propuestos</w:t>
+      </w:r>
+      <w:r>
+        <w:rPr>
+          <w:rFonts w:asciiTheme="minorHAnsi" w:hAnsiTheme="minorHAnsi" w:cstheme="minorHAnsi"/>
+          <w:sz w:val="22"/>
+          <w:szCs w:val="22"/>
+        </w:rPr>
+        <w:t xml:space="preserve"> p</w:t>
+      </w:r>
+      <w:r>
+        <w:rPr>
+          <w:rFonts w:asciiTheme="minorHAnsi" w:hAnsiTheme="minorHAnsi" w:cstheme="minorHAnsi"/>
+          <w:sz w:val="22"/>
+          <w:szCs w:val="22"/>
+        </w:rPr>
+        <w:t>ara mejorar la eficiencia energética</w:t>
+      </w:r>
+      <w:r>
+        <w:rPr>
+          <w:rFonts w:asciiTheme="minorHAnsi" w:hAnsiTheme="minorHAnsi" w:cstheme="minorHAnsi"/>
+          <w:sz w:val="22"/>
+          <w:szCs w:val="22"/>
+        </w:rPr>
+        <w:t xml:space="preserve"> sin incurrir en costes añadidos</w:t>
+      </w:r>
+      <w:r>
+        <w:rPr>
+          <w:rFonts w:asciiTheme="minorHAnsi" w:hAnsiTheme="minorHAnsi" w:cstheme="minorHAnsi"/>
+          <w:sz w:val="22"/>
+          <w:szCs w:val="22"/>
+        </w:rPr>
+        <w:t xml:space="preserve"> para </w:t>
+      </w:r>
+      <w:r>
+        <w:rPr>
+          <w:rFonts w:asciiTheme="minorHAnsi" w:hAnsiTheme="minorHAnsi" w:cstheme="minorHAnsi"/>
+          <w:sz w:val="22"/>
+          <w:szCs w:val="22"/>
+        </w:rPr>
+        <w:t>la adquisición de equipos físicos</w:t>
+      </w:r>
+      <w:r>
+        <w:rPr>
+          <w:rFonts w:asciiTheme="minorHAnsi" w:hAnsiTheme="minorHAnsi" w:cstheme="minorHAnsi"/>
+          <w:sz w:val="22"/>
+          <w:szCs w:val="22"/>
+        </w:rPr>
+        <w:t>.</w:t>
+      </w:r>
+      <w:r>
+        <w:rPr>
+          <w:rFonts w:asciiTheme="minorHAnsi" w:hAnsiTheme="minorHAnsi" w:cstheme="minorHAnsi"/>
+          <w:sz w:val="22"/>
+          <w:szCs w:val="22"/>
+        </w:rPr>
+        <w:t xml:space="preserve"> </w:t>
+      </w:r>
+    </w:p>
+    <w:p>
+      <w:pPr>
+        <w:pStyle w:val="Default"/>
+        <w:ind w:firstLine="0"/>
+        <w:rPr>
+          <w:rStyle w:val="Ninguno"/>
+          <w:rFonts w:asciiTheme="minorHAnsi" w:hAnsiTheme="minorHAnsi" w:cstheme="minorHAnsi"/>
+          <w:sz w:val="22"/>
+          <w:szCs w:val="22"/>
+        </w:rPr>
+      </w:pPr>
+      <w:r>
+        <w:rPr>
+          <w:rFonts w:asciiTheme="minorHAnsi" w:hAnsiTheme="minorHAnsi" w:cstheme="minorHAnsi"/>
+          <w:sz w:val="22"/>
+          <w:szCs w:val="22"/>
+        </w:rPr>
+        <w:t>La financiación se apoya en recursos propios</w:t>
+      </w:r>
+      <w:r>
+        <w:rPr>
+          <w:rFonts w:asciiTheme="minorHAnsi" w:hAnsiTheme="minorHAnsi" w:cstheme="minorHAnsi"/>
+          <w:sz w:val="22"/>
+          <w:szCs w:val="22"/>
+        </w:rPr>
+        <w:t xml:space="preserve"> y</w:t>
+      </w:r>
+      <w:r>
+        <w:rPr>
+          <w:rFonts w:asciiTheme="minorHAnsi" w:hAnsiTheme="minorHAnsi" w:cstheme="minorHAnsi"/>
+          <w:sz w:val="22"/>
+          <w:szCs w:val="22"/>
+        </w:rPr>
+        <w:t xml:space="preserve"> </w:t>
+      </w:r>
+      <w:r>
+        <w:rPr>
+          <w:rFonts w:asciiTheme="minorHAnsi" w:hAnsiTheme="minorHAnsi" w:cstheme="minorHAnsi"/>
+          <w:sz w:val="22"/>
+          <w:szCs w:val="22"/>
+        </w:rPr>
+        <w:t>el doctoran</w:t>
+      </w:r>
+      <w:r>
+        <w:rPr>
+          <w:rFonts w:asciiTheme="minorHAnsi" w:hAnsiTheme="minorHAnsi" w:cstheme="minorHAnsi"/>
+          <w:sz w:val="22"/>
+          <w:szCs w:val="22"/>
+        </w:rPr>
+        <w:t xml:space="preserve"> se encuentra c</w:t>
+      </w:r>
+      <w:r>
+        <w:rPr>
+          <w:rFonts w:asciiTheme="minorHAnsi" w:hAnsiTheme="minorHAnsi" w:cstheme="minorHAnsi"/>
+          <w:sz w:val="22"/>
+          <w:szCs w:val="22"/>
+        </w:rPr>
+        <w:t>omo Senior Analyst en proyectos estratégicos (</w:t>
+      </w:r>
+      <w:r>
+        <w:rPr>
+          <w:rFonts w:asciiTheme="minorHAnsi" w:hAnsiTheme="minorHAnsi" w:cstheme="minorHAnsi"/>
+          <w:sz w:val="22"/>
+          <w:szCs w:val="22"/>
+        </w:rPr>
+        <w:t xml:space="preserve">Generalitat </w:t>
+      </w:r>
+      <w:r>
+        <w:rPr>
+          <w:rFonts w:asciiTheme="minorHAnsi" w:hAnsiTheme="minorHAnsi" w:cstheme="minorHAnsi"/>
+          <w:sz w:val="22"/>
+          <w:szCs w:val="22"/>
+        </w:rPr>
+        <w:t>CTTI</w:t>
+      </w:r>
+      <w:r>
+        <w:rPr>
+          <w:rFonts w:asciiTheme="minorHAnsi" w:hAnsiTheme="minorHAnsi" w:cstheme="minorHAnsi"/>
+          <w:sz w:val="22"/>
+          <w:szCs w:val="22"/>
+        </w:rPr>
+        <w:t xml:space="preserve">, </w:t>
+      </w:r>
+      <w:r>
+        <w:rPr>
+          <w:rFonts w:asciiTheme="minorHAnsi" w:hAnsiTheme="minorHAnsi" w:cstheme="minorHAnsi"/>
+          <w:sz w:val="22"/>
+          <w:szCs w:val="22"/>
+        </w:rPr>
+        <w:t>Vodafone</w:t>
+      </w:r>
+      <w:r>
+        <w:rPr>
+          <w:rFonts w:asciiTheme="minorHAnsi" w:hAnsiTheme="minorHAnsi" w:cstheme="minorHAnsi"/>
+          <w:sz w:val="22"/>
+          <w:szCs w:val="22"/>
+        </w:rPr>
+        <w:t xml:space="preserve"> &amp; Inditex</w:t>
+      </w:r>
+      <w:r>
+        <w:rPr>
+          <w:rFonts w:asciiTheme="minorHAnsi" w:hAnsiTheme="minorHAnsi" w:cstheme="minorHAnsi"/>
+          <w:sz w:val="22"/>
+          <w:szCs w:val="22"/>
+        </w:rPr>
+        <w:t>).</w:t>
+      </w:r>
+      <w:r>
+        <w:rPr>
+          <w:rFonts w:asciiTheme="minorHAnsi" w:hAnsiTheme="minorHAnsi" w:cstheme="minorHAnsi"/>
+          <w:sz w:val="22"/>
+          <w:szCs w:val="22"/>
+        </w:rPr>
+        <w:t xml:space="preserve"> </w:t>
+      </w:r>
+      <w:r>
+        <w:rPr>
+          <w:rFonts w:asciiTheme="minorHAnsi" w:hAnsiTheme="minorHAnsi" w:cstheme="minorHAnsi"/>
+          <w:sz w:val="22"/>
+          <w:szCs w:val="22"/>
+        </w:rPr>
+        <w:t xml:space="preserve">Desde su posición </w:t>
+      </w:r>
+      <w:r>
+        <w:rPr>
+          <w:rFonts w:asciiTheme="minorHAnsi" w:hAnsiTheme="minorHAnsi" w:cstheme="minorHAnsi"/>
+          <w:sz w:val="22"/>
+          <w:szCs w:val="22"/>
+        </w:rPr>
+        <w:t>tiene garantía de</w:t>
+      </w:r>
+      <w:r>
+        <w:rPr>
+          <w:rFonts w:asciiTheme="minorHAnsi" w:hAnsiTheme="minorHAnsi" w:cstheme="minorHAnsi"/>
+          <w:sz w:val="22"/>
+          <w:szCs w:val="22"/>
+        </w:rPr>
+        <w:t xml:space="preserve"> una</w:t>
+      </w:r>
+      <w:r>
+        <w:rPr>
+          <w:rFonts w:asciiTheme="minorHAnsi" w:hAnsiTheme="minorHAnsi" w:cstheme="minorHAnsi"/>
+          <w:sz w:val="22"/>
+          <w:szCs w:val="22"/>
+        </w:rPr>
+        <w:t xml:space="preserve"> </w:t>
+      </w:r>
+      <w:r>
+        <w:rPr>
+          <w:rFonts w:asciiTheme="minorHAnsi" w:hAnsiTheme="minorHAnsi" w:cstheme="minorHAnsi"/>
+          <w:sz w:val="22"/>
+          <w:szCs w:val="22"/>
+        </w:rPr>
+        <w:t>dedicación estable al proyecto de investigación y soporte</w:t>
+      </w:r>
+      <w:r>
+        <w:rPr>
+          <w:rFonts w:asciiTheme="minorHAnsi" w:hAnsiTheme="minorHAnsi" w:cstheme="minorHAnsi"/>
+          <w:sz w:val="22"/>
+          <w:szCs w:val="22"/>
+        </w:rPr>
+        <w:t>s</w:t>
+      </w:r>
+      <w:r>
+        <w:rPr>
+          <w:rFonts w:asciiTheme="minorHAnsi" w:hAnsiTheme="minorHAnsi" w:cstheme="minorHAnsi"/>
+          <w:sz w:val="22"/>
+          <w:szCs w:val="22"/>
+        </w:rPr>
+        <w:t xml:space="preserve"> logístico</w:t>
+      </w:r>
+      <w:r>
+        <w:rPr>
+          <w:rFonts w:asciiTheme="minorHAnsi" w:hAnsiTheme="minorHAnsi" w:cstheme="minorHAnsi"/>
+          <w:sz w:val="22"/>
+          <w:szCs w:val="22"/>
+        </w:rPr>
+        <w:t>s</w:t>
+      </w:r>
+      <w:r>
+        <w:rPr>
+          <w:rFonts w:asciiTheme="minorHAnsi" w:hAnsiTheme="minorHAnsi" w:cstheme="minorHAnsi"/>
+          <w:sz w:val="22"/>
+          <w:szCs w:val="22"/>
+        </w:rPr>
+        <w:t xml:space="preserve"> para la validación</w:t>
+      </w:r>
+      <w:r>
+        <w:rPr>
+          <w:rFonts w:asciiTheme="minorHAnsi" w:hAnsiTheme="minorHAnsi" w:cstheme="minorHAnsi"/>
+          <w:sz w:val="22"/>
+          <w:szCs w:val="22"/>
+        </w:rPr>
+        <w:t xml:space="preserve"> requerida</w:t>
+      </w:r>
+      <w:r>
+        <w:rPr>
+          <w:rFonts w:asciiTheme="minorHAnsi" w:hAnsiTheme="minorHAnsi" w:cstheme="minorHAnsi"/>
+          <w:sz w:val="22"/>
+          <w:szCs w:val="22"/>
+        </w:rPr>
+        <w:t>, sin necesidad de financiación externa.</w:t>
+      </w:r>
+    </w:p>
+    <w:p>
+      <w:pPr>
+        <w:pStyle w:val="Ttulo11"/>
+        <w:pBdr>
+          <w:top w:val="single" w:sz="4" w:space="1" w:color="auto"/>
+        </w:pBdr>
+        <w:rPr>
+          <w:rFonts w:asciiTheme="minorHAnsi" w:hAnsiTheme="minorHAnsi" w:cstheme="minorHAnsi"/>
+        </w:rPr>
+      </w:pPr>
+      <w:r>
+        <w:rPr>
+          <w:rFonts w:asciiTheme="minorHAnsi" w:hAnsiTheme="minorHAnsi" w:cstheme="minorHAnsi"/>
+        </w:rPr>
+        <w:t>Referencias bibliográficas</w:t>
+      </w:r>
+    </w:p>
+    <w:p>
+      <w:pPr>
+        <w:pStyle w:val="Default"/>
+        <w:ind w:firstLine="0"/>
+        <w:rPr>
+          <w:rFonts w:asciiTheme="minorHAnsi" w:hAnsiTheme="minorHAnsi" w:cstheme="minorHAnsi"/>
+          <w:sz w:val="22"/>
+          <w:szCs w:val="22"/>
+          <w:lang w:val="es-ES"/>
         </w:rPr>
       </w:pPr>
     </w:p>
@@ -5262,6 +7924,208 @@
     </w:lvl>
   </w:abstractNum>
   <w:abstractNum w:abstractNumId="2" w15:restartNumberingAfterBreak="0">
+    <w:nsid w:val="653B4FBA"/>
+    <w:multiLevelType w:val="hybridMultilevel"/>
+    <w:tmpl w:val="BCDA85D2"/>
+    <w:lvl w:ilvl="0" w:tplc="81900F7E">
+      <w:start w:val="1"/>
+      <w:numFmt w:val="decimal"/>
+      <w:lvlText w:val="%1-"/>
+      <w:lvlJc w:val="left"/>
+      <w:pPr>
+        <w:ind w:left="720" w:hanging="360"/>
+      </w:pPr>
+      <w:rPr>
+        <w:rFonts w:hint="default"/>
+      </w:rPr>
+    </w:lvl>
+    <w:lvl w:ilvl="1" w:tplc="0C0A0019" w:tentative="1">
+      <w:start w:val="1"/>
+      <w:numFmt w:val="lowerLetter"/>
+      <w:lvlText w:val="%2."/>
+      <w:lvlJc w:val="left"/>
+      <w:pPr>
+        <w:ind w:left="1440" w:hanging="360"/>
+      </w:pPr>
+    </w:lvl>
+    <w:lvl w:ilvl="2" w:tplc="0C0A001B" w:tentative="1">
+      <w:start w:val="1"/>
+      <w:numFmt w:val="lowerRoman"/>
+      <w:lvlText w:val="%3."/>
+      <w:lvlJc w:val="right"/>
+      <w:pPr>
+        <w:ind w:left="2160" w:hanging="180"/>
+      </w:pPr>
+    </w:lvl>
+    <w:lvl w:ilvl="3" w:tplc="0C0A000F" w:tentative="1">
+      <w:start w:val="1"/>
+      <w:numFmt w:val="decimal"/>
+      <w:lvlText w:val="%4."/>
+      <w:lvlJc w:val="left"/>
+      <w:pPr>
+        <w:ind w:left="2880" w:hanging="360"/>
+      </w:pPr>
+    </w:lvl>
+    <w:lvl w:ilvl="4" w:tplc="0C0A0019" w:tentative="1">
+      <w:start w:val="1"/>
+      <w:numFmt w:val="lowerLetter"/>
+      <w:lvlText w:val="%5."/>
+      <w:lvlJc w:val="left"/>
+      <w:pPr>
+        <w:ind w:left="3600" w:hanging="360"/>
+      </w:pPr>
+    </w:lvl>
+    <w:lvl w:ilvl="5" w:tplc="0C0A001B" w:tentative="1">
+      <w:start w:val="1"/>
+      <w:numFmt w:val="lowerRoman"/>
+      <w:lvlText w:val="%6."/>
+      <w:lvlJc w:val="right"/>
+      <w:pPr>
+        <w:ind w:left="4320" w:hanging="180"/>
+      </w:pPr>
+    </w:lvl>
+    <w:lvl w:ilvl="6" w:tplc="0C0A000F" w:tentative="1">
+      <w:start w:val="1"/>
+      <w:numFmt w:val="decimal"/>
+      <w:lvlText w:val="%7."/>
+      <w:lvlJc w:val="left"/>
+      <w:pPr>
+        <w:ind w:left="5040" w:hanging="360"/>
+      </w:pPr>
+    </w:lvl>
+    <w:lvl w:ilvl="7" w:tplc="0C0A0019" w:tentative="1">
+      <w:start w:val="1"/>
+      <w:numFmt w:val="lowerLetter"/>
+      <w:lvlText w:val="%8."/>
+      <w:lvlJc w:val="left"/>
+      <w:pPr>
+        <w:ind w:left="5760" w:hanging="360"/>
+      </w:pPr>
+    </w:lvl>
+    <w:lvl w:ilvl="8" w:tplc="0C0A001B" w:tentative="1">
+      <w:start w:val="1"/>
+      <w:numFmt w:val="lowerRoman"/>
+      <w:lvlText w:val="%9."/>
+      <w:lvlJc w:val="right"/>
+      <w:pPr>
+        <w:ind w:left="6480" w:hanging="180"/>
+      </w:pPr>
+    </w:lvl>
+  </w:abstractNum>
+  <w:abstractNum w:abstractNumId="3" w15:restartNumberingAfterBreak="0">
+    <w:nsid w:val="689A2476"/>
+    <w:multiLevelType w:val="hybridMultilevel"/>
+    <w:tmpl w:val="A5926044"/>
+    <w:lvl w:ilvl="0" w:tplc="5F4AF542">
+      <w:start w:val="1"/>
+      <w:numFmt w:val="bullet"/>
+      <w:lvlText w:val="-"/>
+      <w:lvlJc w:val="left"/>
+      <w:pPr>
+        <w:ind w:left="720" w:hanging="360"/>
+      </w:pPr>
+      <w:rPr>
+        <w:rFonts w:ascii="Calibri" w:eastAsia="Arial Unicode MS" w:hAnsi="Calibri" w:cs="Calibri" w:hint="default"/>
+      </w:rPr>
+    </w:lvl>
+    <w:lvl w:ilvl="1" w:tplc="0C0A0003">
+      <w:start w:val="1"/>
+      <w:numFmt w:val="bullet"/>
+      <w:lvlText w:val="o"/>
+      <w:lvlJc w:val="left"/>
+      <w:pPr>
+        <w:ind w:left="1440" w:hanging="360"/>
+      </w:pPr>
+      <w:rPr>
+        <w:rFonts w:ascii="Courier New" w:hAnsi="Courier New" w:cs="Courier New" w:hint="default"/>
+      </w:rPr>
+    </w:lvl>
+    <w:lvl w:ilvl="2" w:tplc="0C0A0005" w:tentative="1">
+      <w:start w:val="1"/>
+      <w:numFmt w:val="bullet"/>
+      <w:lvlText w:val=""/>
+      <w:lvlJc w:val="left"/>
+      <w:pPr>
+        <w:ind w:left="2160" w:hanging="360"/>
+      </w:pPr>
+      <w:rPr>
+        <w:rFonts w:ascii="Wingdings" w:hAnsi="Wingdings" w:hint="default"/>
+      </w:rPr>
+    </w:lvl>
+    <w:lvl w:ilvl="3" w:tplc="0C0A0001" w:tentative="1">
+      <w:start w:val="1"/>
+      <w:numFmt w:val="bullet"/>
+      <w:lvlText w:val=""/>
+      <w:lvlJc w:val="left"/>
+      <w:pPr>
+        <w:ind w:left="2880" w:hanging="360"/>
+      </w:pPr>
+      <w:rPr>
+        <w:rFonts w:ascii="Symbol" w:hAnsi="Symbol" w:hint="default"/>
+      </w:rPr>
+    </w:lvl>
+    <w:lvl w:ilvl="4" w:tplc="0C0A0003" w:tentative="1">
+      <w:start w:val="1"/>
+      <w:numFmt w:val="bullet"/>
+      <w:lvlText w:val="o"/>
+      <w:lvlJc w:val="left"/>
+      <w:pPr>
+        <w:ind w:left="3600" w:hanging="360"/>
+      </w:pPr>
+      <w:rPr>
+        <w:rFonts w:ascii="Courier New" w:hAnsi="Courier New" w:cs="Courier New" w:hint="default"/>
+      </w:rPr>
+    </w:lvl>
+    <w:lvl w:ilvl="5" w:tplc="0C0A0005" w:tentative="1">
+      <w:start w:val="1"/>
+      <w:numFmt w:val="bullet"/>
+      <w:lvlText w:val=""/>
+      <w:lvlJc w:val="left"/>
+      <w:pPr>
+        <w:ind w:left="4320" w:hanging="360"/>
+      </w:pPr>
+      <w:rPr>
+        <w:rFonts w:ascii="Wingdings" w:hAnsi="Wingdings" w:hint="default"/>
+      </w:rPr>
+    </w:lvl>
+    <w:lvl w:ilvl="6" w:tplc="0C0A0001" w:tentative="1">
+      <w:start w:val="1"/>
+      <w:numFmt w:val="bullet"/>
+      <w:lvlText w:val=""/>
+      <w:lvlJc w:val="left"/>
+      <w:pPr>
+        <w:ind w:left="5040" w:hanging="360"/>
+      </w:pPr>
+      <w:rPr>
+        <w:rFonts w:ascii="Symbol" w:hAnsi="Symbol" w:hint="default"/>
+      </w:rPr>
+    </w:lvl>
+    <w:lvl w:ilvl="7" w:tplc="0C0A0003" w:tentative="1">
+      <w:start w:val="1"/>
+      <w:numFmt w:val="bullet"/>
+      <w:lvlText w:val="o"/>
+      <w:lvlJc w:val="left"/>
+      <w:pPr>
+        <w:ind w:left="5760" w:hanging="360"/>
+      </w:pPr>
+      <w:rPr>
+        <w:rFonts w:ascii="Courier New" w:hAnsi="Courier New" w:cs="Courier New" w:hint="default"/>
+      </w:rPr>
+    </w:lvl>
+    <w:lvl w:ilvl="8" w:tplc="0C0A0005" w:tentative="1">
+      <w:start w:val="1"/>
+      <w:numFmt w:val="bullet"/>
+      <w:lvlText w:val=""/>
+      <w:lvlJc w:val="left"/>
+      <w:pPr>
+        <w:ind w:left="6480" w:hanging="360"/>
+      </w:pPr>
+      <w:rPr>
+        <w:rFonts w:ascii="Wingdings" w:hAnsi="Wingdings" w:hint="default"/>
+      </w:rPr>
+    </w:lvl>
+  </w:abstractNum>
+  <w:abstractNum w:abstractNumId="4" w15:restartNumberingAfterBreak="0">
     <w:nsid w:val="7CBF7B87"/>
     <w:multiLevelType w:val="hybridMultilevel"/>
     <w:tmpl w:val="894EE873"/>
@@ -5315,10 +8179,10 @@
     <w:abstractNumId w:val="0"/>
   </w:num>
   <w:num w:numId="2" w16cid:durableId="348260981">
-    <w:abstractNumId w:val="2"/>
+    <w:abstractNumId w:val="4"/>
   </w:num>
   <w:num w:numId="3" w16cid:durableId="1773476764">
-    <w:abstractNumId w:val="2"/>
+    <w:abstractNumId w:val="4"/>
     <w:lvlOverride w:ilvl="0">
       <w:lvl w:ilvl="0" w:tplc="CED6890E">
         <w:start w:val="1"/>
@@ -5663,6 +8527,12 @@
   </w:num>
   <w:num w:numId="4" w16cid:durableId="1791246745">
     <w:abstractNumId w:val="1"/>
+  </w:num>
+  <w:num w:numId="5" w16cid:durableId="1198544285">
+    <w:abstractNumId w:val="2"/>
+  </w:num>
+  <w:num w:numId="6" w16cid:durableId="1154487064">
+    <w:abstractNumId w:val="3"/>
   </w:num>
 </w:numbering>
 </file>
@@ -6087,6 +8957,7 @@
   <w:style w:type="character" w:default="1" w:styleId="DefaultParagraphFont">
     <w:name w:val="Default Paragraph Font"/>
     <w:uiPriority w:val="1"/>
+    <w:semiHidden/>
     <w:unhideWhenUsed/>
   </w:style>
   <w:style w:type="table" w:default="1" w:styleId="TableNormal">

</xml_diff>